<commit_message>
Finished DB Practical Assessment 1
</commit_message>
<xml_diff>
--- a/databases/Practical Assessment 1/KangaLife_Laptop_Distribution_Practical_Assessment.docx
+++ b/databases/Practical Assessment 1/KangaLife_Laptop_Distribution_Practical_Assessment.docx
@@ -1,6 +1,6 @@
 
 <file path=word/document.xml><?xml version="1.0" encoding="utf-8"?>
-<w:document xmlns:wpc="http://schemas.microsoft.com/office/word/2010/wordprocessingCanvas" xmlns:cx="http://schemas.microsoft.com/office/drawing/2014/chartex" xmlns:cx1="http://schemas.microsoft.com/office/drawing/2015/9/8/chartex" xmlns:cx2="http://schemas.microsoft.com/office/drawing/2015/10/21/chartex" xmlns:cx3="http://schemas.microsoft.com/office/drawing/2016/5/9/chartex" xmlns:cx4="http://schemas.microsoft.com/office/drawing/2016/5/10/chartex" xmlns:cx5="http://schemas.microsoft.com/office/drawing/2016/5/11/chartex" xmlns:cx6="http://schemas.microsoft.com/office/drawing/2016/5/12/chartex" xmlns:cx7="http://schemas.microsoft.com/office/drawing/2016/5/13/chartex" xmlns:cx8="http://schemas.microsoft.com/office/drawing/2016/5/14/chartex" xmlns:mc="http://schemas.openxmlformats.org/markup-compatibility/2006" xmlns:m="http://schemas.openxmlformats.org/officeDocument/2006/math" xmlns:aink="http://schemas.microsoft.com/office/drawing/2016/ink" xmlns:am3d="http://schemas.microsoft.com/office/drawing/2017/model3d" xmlns:oel="http://schemas.microsoft.com/office/2019/extlst" xmlns:r="http://schemas.openxmlformats.org/officeDocument/2006/relationships" xmlns:wp14="http://schemas.microsoft.com/office/word/2010/wordprocessingDrawing" xmlns:wp="http://schemas.openxmlformats.org/drawingml/2006/wordprocessingDrawing" xmlns:wpg="http://schemas.microsoft.com/office/word/2010/wordprocessingGroup" xmlns:wpi="http://schemas.microsoft.com/office/word/2010/wordprocessingInk" xmlns:wps="http://schemas.microsoft.com/office/word/2010/wordprocessingShape" xmlns:o="urn:schemas-microsoft-com:office:office" xmlns:v="urn:schemas-microsoft-com:vml" xmlns:w10="urn:schemas-microsoft-com:office:word" xmlns:w="http://schemas.openxmlformats.org/wordprocessingml/2006/main" xmlns:w14="http://schemas.microsoft.com/office/word/2010/wordml" xmlns:w15="http://schemas.microsoft.com/office/word/2012/wordml" xmlns:w16cex="http://schemas.microsoft.com/office/word/2018/wordml/cex" xmlns:w16cid="http://schemas.microsoft.com/office/word/2016/wordml/cid" xmlns:w16="http://schemas.microsoft.com/office/word/2018/wordml" xmlns:w16sdtdh="http://schemas.microsoft.com/office/word/2020/wordml/sdtdatahash" xmlns:w16sdtfl="http://schemas.microsoft.com/office/word/2024/wordml/sdtformatlock" xmlns:w16se="http://schemas.microsoft.com/office/word/2015/wordml/symex" xmlns:w16du="http://schemas.microsoft.com/office/word/2023/wordml/word16du" xmlns:wne="http://schemas.microsoft.com/office/word/2006/wordml" mc:Ignorable="w14 w15 w16se w16cid w16 w16cex w16sdtdh w16sdtfl w16du wp14">
+<w:document xmlns:wpc="http://schemas.microsoft.com/office/word/2010/wordprocessingCanvas" xmlns:cx="http://schemas.microsoft.com/office/drawing/2014/chartex" xmlns:cx1="http://schemas.microsoft.com/office/drawing/2015/9/8/chartex" xmlns:cx2="http://schemas.microsoft.com/office/drawing/2015/10/21/chartex" xmlns:cx3="http://schemas.microsoft.com/office/drawing/2016/5/9/chartex" xmlns:cx4="http://schemas.microsoft.com/office/drawing/2016/5/10/chartex" xmlns:cx5="http://schemas.microsoft.com/office/drawing/2016/5/11/chartex" xmlns:cx6="http://schemas.microsoft.com/office/drawing/2016/5/12/chartex" xmlns:cx7="http://schemas.microsoft.com/office/drawing/2016/5/13/chartex" xmlns:cx8="http://schemas.microsoft.com/office/drawing/2016/5/14/chartex" xmlns:mc="http://schemas.openxmlformats.org/markup-compatibility/2006" xmlns:aink="http://schemas.microsoft.com/office/drawing/2016/ink" xmlns:am3d="http://schemas.microsoft.com/office/drawing/2017/model3d" xmlns:o="urn:schemas-microsoft-com:office:office" xmlns:oel="http://schemas.microsoft.com/office/2019/extlst" xmlns:r="http://schemas.openxmlformats.org/officeDocument/2006/relationships" xmlns:m="http://schemas.openxmlformats.org/officeDocument/2006/math" xmlns:v="urn:schemas-microsoft-com:vml" xmlns:wp14="http://schemas.microsoft.com/office/word/2010/wordprocessingDrawing" xmlns:wp="http://schemas.openxmlformats.org/drawingml/2006/wordprocessingDrawing" xmlns:w10="urn:schemas-microsoft-com:office:word" xmlns:w="http://schemas.openxmlformats.org/wordprocessingml/2006/main" xmlns:w14="http://schemas.microsoft.com/office/word/2010/wordml" xmlns:w15="http://schemas.microsoft.com/office/word/2012/wordml" xmlns:w16cex="http://schemas.microsoft.com/office/word/2018/wordml/cex" xmlns:w16cid="http://schemas.microsoft.com/office/word/2016/wordml/cid" xmlns:w16="http://schemas.microsoft.com/office/word/2018/wordml" xmlns:w16du="http://schemas.microsoft.com/office/word/2023/wordml/word16du" xmlns:w16sdtdh="http://schemas.microsoft.com/office/word/2020/wordml/sdtdatahash" xmlns:w16sdtfl="http://schemas.microsoft.com/office/word/2024/wordml/sdtformatlock" xmlns:w16se="http://schemas.microsoft.com/office/word/2015/wordml/symex" xmlns:wpg="http://schemas.microsoft.com/office/word/2010/wordprocessingGroup" xmlns:wpi="http://schemas.microsoft.com/office/word/2010/wordprocessingInk" xmlns:wne="http://schemas.microsoft.com/office/word/2006/wordml" xmlns:wps="http://schemas.microsoft.com/office/word/2010/wordprocessingShape" mc:Ignorable="w14 w15 w16se w16cid w16 w16cex w16sdtdh w16sdtfl w16du wp14">
   <w:body>
     <w:p>
       <w:pPr>
@@ -50,11 +50,11 @@
           <w:szCs w:val="20"/>
         </w:rPr>
       </w:pPr>
-      <w:bookmarkStart w:name="_Toc11834568" w:id="0"/>
-      <w:bookmarkStart w:name="_Toc11844018" w:id="1"/>
-      <w:bookmarkStart w:name="_Toc11844141" w:id="2"/>
-      <w:bookmarkStart w:name="_Toc12438756" w:id="3"/>
-      <w:bookmarkStart w:name="_Toc12438892" w:id="4"/>
+      <w:bookmarkStart w:id="0" w:name="_Toc11834568"/>
+      <w:bookmarkStart w:id="1" w:name="_Toc11844018"/>
+      <w:bookmarkStart w:id="2" w:name="_Toc11844141"/>
+      <w:bookmarkStart w:id="3" w:name="_Toc12438756"/>
+      <w:bookmarkStart w:id="4" w:name="_Toc12438892"/>
     </w:p>
     <w:tbl>
       <w:tblPr>
@@ -71,10 +71,10 @@
         <w:tblDescription w:val="Qualification, Unit of Competency, Assessment task and Assessor details."/>
       </w:tblPr>
       <w:tblGrid>
-        <w:gridCol w:w="2795"/>
-        <w:gridCol w:w="4700"/>
-        <w:gridCol w:w="1289"/>
-        <w:gridCol w:w="1682"/>
+        <w:gridCol w:w="2791"/>
+        <w:gridCol w:w="4691"/>
+        <w:gridCol w:w="1287"/>
+        <w:gridCol w:w="1697"/>
       </w:tblGrid>
       <w:tr>
         <w:trPr>
@@ -147,7 +147,7 @@
             <w:tcW w:w="4786" w:type="dxa"/>
             <w:tcBorders>
               <w:top w:val="nil"/>
-              <w:bottom w:val="single" w:color="auto" w:sz="4" w:space="0"/>
+              <w:bottom w:val="single" w:sz="4" w:space="0" w:color="auto"/>
               <w:right w:val="nil"/>
             </w:tcBorders>
             <w:vAlign w:val="center"/>
@@ -159,6 +159,13 @@
                 <w:szCs w:val="20"/>
               </w:rPr>
             </w:pPr>
+            <w:r>
+              <w:rPr>
+                <w:sz w:val="20"/>
+                <w:szCs w:val="20"/>
+              </w:rPr>
+              <w:t>Luca Topley Vlahos</w:t>
+            </w:r>
           </w:p>
         </w:tc>
         <w:tc>
@@ -166,7 +173,7 @@
             <w:tcW w:w="1298" w:type="dxa"/>
             <w:tcBorders>
               <w:top w:val="nil"/>
-              <w:bottom w:val="single" w:color="auto" w:sz="4" w:space="0"/>
+              <w:bottom w:val="single" w:sz="4" w:space="0" w:color="auto"/>
               <w:right w:val="nil"/>
             </w:tcBorders>
             <w:vAlign w:val="center"/>
@@ -193,7 +200,7 @@
             <w:tcW w:w="1712" w:type="dxa"/>
             <w:tcBorders>
               <w:top w:val="nil"/>
-              <w:bottom w:val="single" w:color="auto" w:sz="4" w:space="0"/>
+              <w:bottom w:val="single" w:sz="4" w:space="0" w:color="auto"/>
               <w:right w:val="nil"/>
             </w:tcBorders>
             <w:vAlign w:val="center"/>
@@ -205,6 +212,13 @@
                 <w:szCs w:val="20"/>
               </w:rPr>
             </w:pPr>
+            <w:r>
+              <w:rPr>
+                <w:sz w:val="20"/>
+                <w:szCs w:val="20"/>
+              </w:rPr>
+              <w:t>200069155</w:t>
+            </w:r>
           </w:p>
         </w:tc>
       </w:tr>
@@ -244,7 +258,7 @@
             <w:gridSpan w:val="3"/>
             <w:tcBorders>
               <w:top w:val="nil"/>
-              <w:bottom w:val="single" w:color="auto" w:sz="4" w:space="0"/>
+              <w:bottom w:val="single" w:sz="4" w:space="0" w:color="auto"/>
               <w:right w:val="nil"/>
             </w:tcBorders>
           </w:tcPr>
@@ -558,6 +572,13 @@
                 <w:szCs w:val="20"/>
               </w:rPr>
             </w:pPr>
+            <w:r>
+              <w:rPr>
+                <w:sz w:val="20"/>
+                <w:szCs w:val="20"/>
+              </w:rPr>
+              <w:t>15/10/26</w:t>
+            </w:r>
           </w:p>
         </w:tc>
       </w:tr>
@@ -621,6 +642,13 @@
                 <w:szCs w:val="20"/>
               </w:rPr>
             </w:pPr>
+            <w:r>
+              <w:rPr>
+                <w:sz w:val="20"/>
+                <w:szCs w:val="20"/>
+              </w:rPr>
+              <w:t>Anh Nguyen</w:t>
+            </w:r>
           </w:p>
         </w:tc>
       </w:tr>
@@ -677,6 +705,13 @@
                 <w:szCs w:val="20"/>
               </w:rPr>
             </w:pPr>
+            <w:r>
+              <w:rPr>
+                <w:sz w:val="20"/>
+                <w:szCs w:val="20"/>
+              </w:rPr>
+              <w:t>a.nguyen@kangan.edu.au</w:t>
+            </w:r>
           </w:p>
         </w:tc>
       </w:tr>
@@ -770,7 +805,7 @@
                 <w:szCs w:val="20"/>
               </w:rPr>
             </w:pPr>
-            <w:bookmarkStart w:name="_Toc19611986" w:id="5"/>
+            <w:bookmarkStart w:id="5" w:name="_Toc19611986"/>
             <w:bookmarkEnd w:id="0"/>
             <w:bookmarkEnd w:id="1"/>
             <w:bookmarkEnd w:id="2"/>
@@ -1163,6 +1198,7 @@
                 <w:sz w:val="20"/>
                 <w:szCs w:val="20"/>
               </w:rPr>
+              <w:lastRenderedPageBreak/>
               <w:t>Task(s) to be assessed</w:t>
             </w:r>
           </w:p>
@@ -1964,27 +2000,7 @@
                 <w:sz w:val="20"/>
                 <w:szCs w:val="20"/>
               </w:rPr>
-              <w:t xml:space="preserve">Task 4: </w:t>
-            </w:r>
-            <w:proofErr w:type="spellStart"/>
-            <w:r>
-              <w:rPr>
-                <w:rFonts w:ascii="Arial" w:hAnsi="Arial"/>
-                <w:b/>
-                <w:sz w:val="20"/>
-                <w:szCs w:val="20"/>
-              </w:rPr>
-              <w:t>PostgREST</w:t>
-            </w:r>
-            <w:proofErr w:type="spellEnd"/>
-            <w:r>
-              <w:rPr>
-                <w:rFonts w:ascii="Arial" w:hAnsi="Arial"/>
-                <w:b/>
-                <w:sz w:val="20"/>
-                <w:szCs w:val="20"/>
-              </w:rPr>
-              <w:t xml:space="preserve"> queries</w:t>
+              <w:t>Task 4: PostgREST queries</w:t>
             </w:r>
           </w:p>
           <w:p>
@@ -2071,6 +2087,7 @@
                 <w:sz w:val="20"/>
                 <w:szCs w:val="20"/>
               </w:rPr>
+              <w:lastRenderedPageBreak/>
               <w:t>• Capture evidence showing each request and its returned JSON response.</w:t>
             </w:r>
           </w:p>
@@ -2101,6 +2118,7 @@
                 <w:sz w:val="20"/>
                 <w:szCs w:val="20"/>
               </w:rPr>
+              <w:lastRenderedPageBreak/>
               <w:t>Oral questioning</w:t>
             </w:r>
           </w:p>
@@ -2812,25 +2830,7 @@
                 <w:sz w:val="20"/>
                 <w:szCs w:val="20"/>
               </w:rPr>
-              <w:t xml:space="preserve">• Create and run </w:t>
-            </w:r>
-            <w:proofErr w:type="spellStart"/>
-            <w:r>
-              <w:rPr>
-                <w:rFonts w:ascii="Arial" w:hAnsi="Arial"/>
-                <w:sz w:val="20"/>
-                <w:szCs w:val="20"/>
-              </w:rPr>
-              <w:t>PostgREST</w:t>
-            </w:r>
-            <w:proofErr w:type="spellEnd"/>
-            <w:r>
-              <w:rPr>
-                <w:rFonts w:ascii="Arial" w:hAnsi="Arial"/>
-                <w:sz w:val="20"/>
-                <w:szCs w:val="20"/>
-              </w:rPr>
-              <w:t xml:space="preserve"> GET requests</w:t>
+              <w:t>• Create and run PostgREST GET requests</w:t>
             </w:r>
           </w:p>
         </w:tc>
@@ -2995,7 +2995,7 @@
           <w:footerReference w:type="default" r:id="rId14"/>
           <w:headerReference w:type="first" r:id="rId15"/>
           <w:footerReference w:type="first" r:id="rId16"/>
-          <w:pgSz w:w="11906" w:h="16838" w:orient="portrait"/>
+          <w:pgSz w:w="11906" w:h="16838"/>
           <w:pgMar w:top="720" w:right="720" w:bottom="720" w:left="720" w:header="567" w:footer="510" w:gutter="0"/>
           <w:cols w:space="708"/>
           <w:docGrid w:linePitch="360"/>
@@ -3046,7 +3046,6 @@
               <w:right w:val="nil"/>
             </w:tcBorders>
             <w:shd w:val="clear" w:color="auto" w:fill="595959" w:themeFill="text1" w:themeFillTint="A6"/>
-            <w:tcMar/>
             <w:vAlign w:val="center"/>
           </w:tcPr>
           <w:bookmarkEnd w:id="5"/>
@@ -3078,7 +3077,6 @@
               <w:right w:val="nil"/>
             </w:tcBorders>
             <w:shd w:val="clear" w:color="auto" w:fill="595959" w:themeFill="text1" w:themeFillTint="A6"/>
-            <w:tcMar/>
           </w:tcPr>
           <w:p>
             <w:pPr>
@@ -3099,7 +3097,6 @@
               <w:right w:val="nil"/>
             </w:tcBorders>
             <w:shd w:val="clear" w:color="auto" w:fill="595959" w:themeFill="text1" w:themeFillTint="A6"/>
-            <w:tcMar/>
           </w:tcPr>
           <w:p>
             <w:pPr>
@@ -3120,7 +3117,6 @@
               <w:right w:val="nil"/>
             </w:tcBorders>
             <w:shd w:val="clear" w:color="auto" w:fill="595959" w:themeFill="text1" w:themeFillTint="A6"/>
-            <w:tcMar/>
           </w:tcPr>
           <w:p>
             <w:pPr>
@@ -3144,7 +3140,6 @@
               <w:top w:val="nil"/>
               <w:left w:val="nil"/>
             </w:tcBorders>
-            <w:tcMar/>
             <w:vAlign w:val="center"/>
           </w:tcPr>
           <w:p>
@@ -3176,23 +3171,7 @@
                 <w:sz w:val="20"/>
                 <w:szCs w:val="20"/>
               </w:rPr>
-              <w:t xml:space="preserve">All observable work behaviour/tasks must be observed </w:t>
-            </w:r>
-            <w:proofErr w:type="gramStart"/>
-            <w:r>
-              <w:rPr>
-                <w:sz w:val="20"/>
-                <w:szCs w:val="20"/>
-              </w:rPr>
-              <w:t>in order for</w:t>
-            </w:r>
-            <w:proofErr w:type="gramEnd"/>
-            <w:r>
-              <w:rPr>
-                <w:sz w:val="20"/>
-                <w:szCs w:val="20"/>
-              </w:rPr>
-              <w:t xml:space="preserve"> you to be deemed satisfactory.</w:t>
+              <w:t>All observable work behaviour/tasks must be observed in order for you to be deemed satisfactory.</w:t>
             </w:r>
           </w:p>
         </w:tc>
@@ -3202,7 +3181,6 @@
             <w:tcBorders>
               <w:top w:val="nil"/>
             </w:tcBorders>
-            <w:tcMar/>
             <w:vAlign w:val="center"/>
           </w:tcPr>
           <w:p>
@@ -3228,7 +3206,6 @@
             <w:tcBorders>
               <w:top w:val="nil"/>
             </w:tcBorders>
-            <w:tcMar/>
             <w:vAlign w:val="center"/>
           </w:tcPr>
           <w:p>
@@ -3271,7 +3248,6 @@
               <w:top w:val="nil"/>
               <w:right w:val="nil"/>
             </w:tcBorders>
-            <w:tcMar/>
             <w:vAlign w:val="center"/>
           </w:tcPr>
           <w:p>
@@ -3296,7 +3272,6 @@
         <w:tc>
           <w:tcPr>
             <w:tcW w:w="8222" w:type="dxa"/>
-            <w:tcMar/>
           </w:tcPr>
           <w:p>
             <w:pPr>
@@ -3320,7 +3295,6 @@
         <w:tc>
           <w:tcPr>
             <w:tcW w:w="1843" w:type="dxa"/>
-            <w:tcMar/>
           </w:tcPr>
           <w:p>
             <w:pPr>
@@ -3337,14 +3311,45 @@
                 <w:sz w:val="20"/>
                 <w:szCs w:val="20"/>
               </w:rPr>
-              <w:t>__/__/____</w:t>
+              <w:t>15</w:t>
+            </w:r>
+            <w:r>
+              <w:rPr>
+                <w:rFonts w:ascii="Arial" w:hAnsi="Arial"/>
+                <w:sz w:val="20"/>
+                <w:szCs w:val="20"/>
+              </w:rPr>
+              <w:t>/</w:t>
+            </w:r>
+            <w:r>
+              <w:rPr>
+                <w:rFonts w:ascii="Arial" w:hAnsi="Arial"/>
+                <w:sz w:val="20"/>
+                <w:szCs w:val="20"/>
+              </w:rPr>
+              <w:t>10</w:t>
+            </w:r>
+            <w:r>
+              <w:rPr>
+                <w:rFonts w:ascii="Arial" w:hAnsi="Arial"/>
+                <w:sz w:val="20"/>
+                <w:szCs w:val="20"/>
+              </w:rPr>
+              <w:t>/</w:t>
+            </w:r>
+            <w:r>
+              <w:rPr>
+                <w:rFonts w:ascii="Arial" w:hAnsi="Arial"/>
+                <w:sz w:val="20"/>
+                <w:szCs w:val="20"/>
+              </w:rPr>
+              <w:t>2026</w:t>
             </w:r>
           </w:p>
         </w:tc>
         <w:tc>
           <w:tcPr>
             <w:tcW w:w="992" w:type="dxa"/>
-            <w:tcMar/>
           </w:tcPr>
           <w:p>
             <w:pPr>
@@ -3355,12 +3360,18 @@
                 <w:szCs w:val="20"/>
               </w:rPr>
             </w:pPr>
+            <w:r>
+              <w:rPr>
+                <w:sz w:val="20"/>
+                <w:szCs w:val="20"/>
+              </w:rPr>
+              <w:t>AN</w:t>
+            </w:r>
           </w:p>
         </w:tc>
         <w:tc>
           <w:tcPr>
             <w:tcW w:w="4252" w:type="dxa"/>
-            <w:tcMar/>
           </w:tcPr>
           <w:p>
             <w:pPr>
@@ -3378,7 +3389,6 @@
         <w:tc>
           <w:tcPr>
             <w:tcW w:w="8222" w:type="dxa"/>
-            <w:tcMar/>
           </w:tcPr>
           <w:p>
             <w:pPr>
@@ -3402,7 +3412,6 @@
         <w:tc>
           <w:tcPr>
             <w:tcW w:w="1843" w:type="dxa"/>
-            <w:tcMar/>
           </w:tcPr>
           <w:p>
             <w:pPr>
@@ -3419,14 +3428,45 @@
                 <w:sz w:val="20"/>
                 <w:szCs w:val="20"/>
               </w:rPr>
-              <w:t>__/__/____</w:t>
+              <w:t>15</w:t>
+            </w:r>
+            <w:r>
+              <w:rPr>
+                <w:rFonts w:ascii="Arial" w:hAnsi="Arial"/>
+                <w:sz w:val="20"/>
+                <w:szCs w:val="20"/>
+              </w:rPr>
+              <w:t>/</w:t>
+            </w:r>
+            <w:r>
+              <w:rPr>
+                <w:rFonts w:ascii="Arial" w:hAnsi="Arial"/>
+                <w:sz w:val="20"/>
+                <w:szCs w:val="20"/>
+              </w:rPr>
+              <w:t>10</w:t>
+            </w:r>
+            <w:r>
+              <w:rPr>
+                <w:rFonts w:ascii="Arial" w:hAnsi="Arial"/>
+                <w:sz w:val="20"/>
+                <w:szCs w:val="20"/>
+              </w:rPr>
+              <w:t>/</w:t>
+            </w:r>
+            <w:r>
+              <w:rPr>
+                <w:rFonts w:ascii="Arial" w:hAnsi="Arial"/>
+                <w:sz w:val="20"/>
+                <w:szCs w:val="20"/>
+              </w:rPr>
+              <w:t>2026</w:t>
             </w:r>
           </w:p>
         </w:tc>
         <w:tc>
           <w:tcPr>
             <w:tcW w:w="992" w:type="dxa"/>
-            <w:tcMar/>
           </w:tcPr>
           <w:p>
             <w:pPr>
@@ -3437,12 +3477,18 @@
                 <w:szCs w:val="20"/>
               </w:rPr>
             </w:pPr>
+            <w:r>
+              <w:rPr>
+                <w:sz w:val="20"/>
+                <w:szCs w:val="20"/>
+              </w:rPr>
+              <w:t>AN</w:t>
+            </w:r>
           </w:p>
         </w:tc>
         <w:tc>
           <w:tcPr>
             <w:tcW w:w="4252" w:type="dxa"/>
-            <w:tcMar/>
           </w:tcPr>
           <w:p>
             <w:pPr>
@@ -3460,7 +3506,6 @@
         <w:tc>
           <w:tcPr>
             <w:tcW w:w="8222" w:type="dxa"/>
-            <w:tcMar/>
           </w:tcPr>
           <w:p>
             <w:pPr>
@@ -3484,7 +3529,6 @@
         <w:tc>
           <w:tcPr>
             <w:tcW w:w="1843" w:type="dxa"/>
-            <w:tcMar/>
           </w:tcPr>
           <w:p>
             <w:pPr>
@@ -3501,14 +3545,45 @@
                 <w:sz w:val="20"/>
                 <w:szCs w:val="20"/>
               </w:rPr>
-              <w:t>__/__/____</w:t>
+              <w:t>15</w:t>
+            </w:r>
+            <w:r>
+              <w:rPr>
+                <w:rFonts w:ascii="Arial" w:hAnsi="Arial"/>
+                <w:sz w:val="20"/>
+                <w:szCs w:val="20"/>
+              </w:rPr>
+              <w:t>/</w:t>
+            </w:r>
+            <w:r>
+              <w:rPr>
+                <w:rFonts w:ascii="Arial" w:hAnsi="Arial"/>
+                <w:sz w:val="20"/>
+                <w:szCs w:val="20"/>
+              </w:rPr>
+              <w:t>10</w:t>
+            </w:r>
+            <w:r>
+              <w:rPr>
+                <w:rFonts w:ascii="Arial" w:hAnsi="Arial"/>
+                <w:sz w:val="20"/>
+                <w:szCs w:val="20"/>
+              </w:rPr>
+              <w:t>/</w:t>
+            </w:r>
+            <w:r>
+              <w:rPr>
+                <w:rFonts w:ascii="Arial" w:hAnsi="Arial"/>
+                <w:sz w:val="20"/>
+                <w:szCs w:val="20"/>
+              </w:rPr>
+              <w:t>2026</w:t>
             </w:r>
           </w:p>
         </w:tc>
         <w:tc>
           <w:tcPr>
             <w:tcW w:w="992" w:type="dxa"/>
-            <w:tcMar/>
           </w:tcPr>
           <w:p>
             <w:pPr>
@@ -3519,12 +3594,18 @@
                 <w:szCs w:val="20"/>
               </w:rPr>
             </w:pPr>
+            <w:r>
+              <w:rPr>
+                <w:sz w:val="20"/>
+                <w:szCs w:val="20"/>
+              </w:rPr>
+              <w:t>AN</w:t>
+            </w:r>
           </w:p>
         </w:tc>
         <w:tc>
           <w:tcPr>
             <w:tcW w:w="4252" w:type="dxa"/>
-            <w:tcMar/>
           </w:tcPr>
           <w:p>
             <w:pPr>
@@ -3542,7 +3623,6 @@
         <w:tc>
           <w:tcPr>
             <w:tcW w:w="8222" w:type="dxa"/>
-            <w:tcMar/>
           </w:tcPr>
           <w:p>
             <w:pPr>
@@ -3566,7 +3646,6 @@
         <w:tc>
           <w:tcPr>
             <w:tcW w:w="1843" w:type="dxa"/>
-            <w:tcMar/>
           </w:tcPr>
           <w:p>
             <w:pPr>
@@ -3583,14 +3662,45 @@
                 <w:sz w:val="20"/>
                 <w:szCs w:val="20"/>
               </w:rPr>
-              <w:t>__/__/____</w:t>
+              <w:t>15</w:t>
+            </w:r>
+            <w:r>
+              <w:rPr>
+                <w:rFonts w:ascii="Arial" w:hAnsi="Arial"/>
+                <w:sz w:val="20"/>
+                <w:szCs w:val="20"/>
+              </w:rPr>
+              <w:t>/</w:t>
+            </w:r>
+            <w:r>
+              <w:rPr>
+                <w:rFonts w:ascii="Arial" w:hAnsi="Arial"/>
+                <w:sz w:val="20"/>
+                <w:szCs w:val="20"/>
+              </w:rPr>
+              <w:t>10</w:t>
+            </w:r>
+            <w:r>
+              <w:rPr>
+                <w:rFonts w:ascii="Arial" w:hAnsi="Arial"/>
+                <w:sz w:val="20"/>
+                <w:szCs w:val="20"/>
+              </w:rPr>
+              <w:t>/</w:t>
+            </w:r>
+            <w:r>
+              <w:rPr>
+                <w:rFonts w:ascii="Arial" w:hAnsi="Arial"/>
+                <w:sz w:val="20"/>
+                <w:szCs w:val="20"/>
+              </w:rPr>
+              <w:t>2026</w:t>
             </w:r>
           </w:p>
         </w:tc>
         <w:tc>
           <w:tcPr>
             <w:tcW w:w="992" w:type="dxa"/>
-            <w:tcMar/>
           </w:tcPr>
           <w:p>
             <w:pPr>
@@ -3601,12 +3711,18 @@
                 <w:szCs w:val="20"/>
               </w:rPr>
             </w:pPr>
+            <w:r>
+              <w:rPr>
+                <w:sz w:val="20"/>
+                <w:szCs w:val="20"/>
+              </w:rPr>
+              <w:t>AN</w:t>
+            </w:r>
           </w:p>
         </w:tc>
         <w:tc>
           <w:tcPr>
             <w:tcW w:w="4252" w:type="dxa"/>
-            <w:tcMar/>
           </w:tcPr>
           <w:p>
             <w:pPr>
@@ -3624,7 +3740,6 @@
         <w:tc>
           <w:tcPr>
             <w:tcW w:w="8222" w:type="dxa"/>
-            <w:tcMar/>
           </w:tcPr>
           <w:p>
             <w:pPr>
@@ -3664,7 +3779,6 @@
         <w:tc>
           <w:tcPr>
             <w:tcW w:w="1843" w:type="dxa"/>
-            <w:tcMar/>
           </w:tcPr>
           <w:p>
             <w:pPr>
@@ -3681,14 +3795,45 @@
                 <w:sz w:val="20"/>
                 <w:szCs w:val="20"/>
               </w:rPr>
-              <w:t>__/__/____</w:t>
+              <w:t>15</w:t>
+            </w:r>
+            <w:r>
+              <w:rPr>
+                <w:rFonts w:ascii="Arial" w:hAnsi="Arial"/>
+                <w:sz w:val="20"/>
+                <w:szCs w:val="20"/>
+              </w:rPr>
+              <w:t>/</w:t>
+            </w:r>
+            <w:r>
+              <w:rPr>
+                <w:rFonts w:ascii="Arial" w:hAnsi="Arial"/>
+                <w:sz w:val="20"/>
+                <w:szCs w:val="20"/>
+              </w:rPr>
+              <w:t>10</w:t>
+            </w:r>
+            <w:r>
+              <w:rPr>
+                <w:rFonts w:ascii="Arial" w:hAnsi="Arial"/>
+                <w:sz w:val="20"/>
+                <w:szCs w:val="20"/>
+              </w:rPr>
+              <w:t>/</w:t>
+            </w:r>
+            <w:r>
+              <w:rPr>
+                <w:rFonts w:ascii="Arial" w:hAnsi="Arial"/>
+                <w:sz w:val="20"/>
+                <w:szCs w:val="20"/>
+              </w:rPr>
+              <w:t>2026</w:t>
             </w:r>
           </w:p>
         </w:tc>
         <w:tc>
           <w:tcPr>
             <w:tcW w:w="992" w:type="dxa"/>
-            <w:tcMar/>
           </w:tcPr>
           <w:p>
             <w:pPr>
@@ -3699,12 +3844,18 @@
                 <w:szCs w:val="20"/>
               </w:rPr>
             </w:pPr>
+            <w:r>
+              <w:rPr>
+                <w:sz w:val="20"/>
+                <w:szCs w:val="20"/>
+              </w:rPr>
+              <w:t>AN</w:t>
+            </w:r>
           </w:p>
         </w:tc>
         <w:tc>
           <w:tcPr>
             <w:tcW w:w="4252" w:type="dxa"/>
-            <w:tcMar/>
           </w:tcPr>
           <w:p>
             <w:pPr>
@@ -3722,7 +3873,6 @@
         <w:tc>
           <w:tcPr>
             <w:tcW w:w="8222" w:type="dxa"/>
-            <w:tcMar/>
           </w:tcPr>
           <w:p>
             <w:pPr>
@@ -3762,7 +3912,6 @@
         <w:tc>
           <w:tcPr>
             <w:tcW w:w="1843" w:type="dxa"/>
-            <w:tcMar/>
           </w:tcPr>
           <w:p>
             <w:pPr>
@@ -3779,14 +3928,45 @@
                 <w:sz w:val="20"/>
                 <w:szCs w:val="20"/>
               </w:rPr>
-              <w:t>__/__/____</w:t>
+              <w:t>15</w:t>
+            </w:r>
+            <w:r>
+              <w:rPr>
+                <w:rFonts w:ascii="Arial" w:hAnsi="Arial"/>
+                <w:sz w:val="20"/>
+                <w:szCs w:val="20"/>
+              </w:rPr>
+              <w:t>/</w:t>
+            </w:r>
+            <w:r>
+              <w:rPr>
+                <w:rFonts w:ascii="Arial" w:hAnsi="Arial"/>
+                <w:sz w:val="20"/>
+                <w:szCs w:val="20"/>
+              </w:rPr>
+              <w:t>10</w:t>
+            </w:r>
+            <w:r>
+              <w:rPr>
+                <w:rFonts w:ascii="Arial" w:hAnsi="Arial"/>
+                <w:sz w:val="20"/>
+                <w:szCs w:val="20"/>
+              </w:rPr>
+              <w:t>/</w:t>
+            </w:r>
+            <w:r>
+              <w:rPr>
+                <w:rFonts w:ascii="Arial" w:hAnsi="Arial"/>
+                <w:sz w:val="20"/>
+                <w:szCs w:val="20"/>
+              </w:rPr>
+              <w:t>2026</w:t>
             </w:r>
           </w:p>
         </w:tc>
         <w:tc>
           <w:tcPr>
             <w:tcW w:w="992" w:type="dxa"/>
-            <w:tcMar/>
           </w:tcPr>
           <w:p>
             <w:pPr>
@@ -3797,25 +3977,24 @@
                 <w:szCs w:val="20"/>
               </w:rPr>
             </w:pPr>
+            <w:r>
+              <w:rPr>
+                <w:sz w:val="20"/>
+                <w:szCs w:val="20"/>
+              </w:rPr>
+              <w:t>AN</w:t>
+            </w:r>
           </w:p>
         </w:tc>
         <w:tc>
           <w:tcPr>
             <w:tcW w:w="4252" w:type="dxa"/>
-            <w:tcMar/>
-          </w:tcPr>
-          <w:p>
-            <w:pPr>
-              <w:keepLines w:val="1"/>
+          </w:tcPr>
+          <w:p>
+            <w:pPr>
+              <w:keepLines/>
               <w:spacing w:after="40"/>
             </w:pPr>
-            <w:r>
-              <w:rPr>
-                <w:sz w:val="20"/>
-                <w:szCs w:val="20"/>
-              </w:rPr>
-              <w:t>v</w:t>
-            </w:r>
           </w:p>
         </w:tc>
       </w:tr>
@@ -3823,7 +4002,6 @@
         <w:tc>
           <w:tcPr>
             <w:tcW w:w="8222" w:type="dxa"/>
-            <w:tcMar/>
           </w:tcPr>
           <w:p>
             <w:pPr>
@@ -3855,7 +4033,6 @@
         <w:tc>
           <w:tcPr>
             <w:tcW w:w="1843" w:type="dxa"/>
-            <w:tcMar/>
           </w:tcPr>
           <w:p>
             <w:pPr>
@@ -3872,14 +4049,45 @@
                 <w:sz w:val="20"/>
                 <w:szCs w:val="20"/>
               </w:rPr>
-              <w:t>__/__/____</w:t>
+              <w:t>15</w:t>
+            </w:r>
+            <w:r>
+              <w:rPr>
+                <w:rFonts w:ascii="Arial" w:hAnsi="Arial"/>
+                <w:sz w:val="20"/>
+                <w:szCs w:val="20"/>
+              </w:rPr>
+              <w:t>/</w:t>
+            </w:r>
+            <w:r>
+              <w:rPr>
+                <w:rFonts w:ascii="Arial" w:hAnsi="Arial"/>
+                <w:sz w:val="20"/>
+                <w:szCs w:val="20"/>
+              </w:rPr>
+              <w:t>10</w:t>
+            </w:r>
+            <w:r>
+              <w:rPr>
+                <w:rFonts w:ascii="Arial" w:hAnsi="Arial"/>
+                <w:sz w:val="20"/>
+                <w:szCs w:val="20"/>
+              </w:rPr>
+              <w:t>/</w:t>
+            </w:r>
+            <w:r>
+              <w:rPr>
+                <w:rFonts w:ascii="Arial" w:hAnsi="Arial"/>
+                <w:sz w:val="20"/>
+                <w:szCs w:val="20"/>
+              </w:rPr>
+              <w:t>2026</w:t>
             </w:r>
           </w:p>
         </w:tc>
         <w:tc>
           <w:tcPr>
             <w:tcW w:w="992" w:type="dxa"/>
-            <w:tcMar/>
           </w:tcPr>
           <w:p>
             <w:pPr>
@@ -3890,12 +4098,18 @@
                 <w:szCs w:val="20"/>
               </w:rPr>
             </w:pPr>
+            <w:r>
+              <w:rPr>
+                <w:sz w:val="20"/>
+                <w:szCs w:val="20"/>
+              </w:rPr>
+              <w:t>AN</w:t>
+            </w:r>
           </w:p>
         </w:tc>
         <w:tc>
           <w:tcPr>
             <w:tcW w:w="4252" w:type="dxa"/>
-            <w:tcMar/>
           </w:tcPr>
           <w:p>
             <w:pPr>
@@ -3913,7 +4127,6 @@
         <w:tc>
           <w:tcPr>
             <w:tcW w:w="8222" w:type="dxa"/>
-            <w:tcMar/>
           </w:tcPr>
           <w:p>
             <w:pPr>
@@ -3953,7 +4166,6 @@
         <w:tc>
           <w:tcPr>
             <w:tcW w:w="1843" w:type="dxa"/>
-            <w:tcMar/>
           </w:tcPr>
           <w:p>
             <w:pPr>
@@ -3970,14 +4182,45 @@
                 <w:sz w:val="20"/>
                 <w:szCs w:val="20"/>
               </w:rPr>
-              <w:t>__/__/____</w:t>
+              <w:t>15</w:t>
+            </w:r>
+            <w:r>
+              <w:rPr>
+                <w:rFonts w:ascii="Arial" w:hAnsi="Arial"/>
+                <w:sz w:val="20"/>
+                <w:szCs w:val="20"/>
+              </w:rPr>
+              <w:t>/</w:t>
+            </w:r>
+            <w:r>
+              <w:rPr>
+                <w:rFonts w:ascii="Arial" w:hAnsi="Arial"/>
+                <w:sz w:val="20"/>
+                <w:szCs w:val="20"/>
+              </w:rPr>
+              <w:t>10</w:t>
+            </w:r>
+            <w:r>
+              <w:rPr>
+                <w:rFonts w:ascii="Arial" w:hAnsi="Arial"/>
+                <w:sz w:val="20"/>
+                <w:szCs w:val="20"/>
+              </w:rPr>
+              <w:t>/</w:t>
+            </w:r>
+            <w:r>
+              <w:rPr>
+                <w:rFonts w:ascii="Arial" w:hAnsi="Arial"/>
+                <w:sz w:val="20"/>
+                <w:szCs w:val="20"/>
+              </w:rPr>
+              <w:t>2026</w:t>
             </w:r>
           </w:p>
         </w:tc>
         <w:tc>
           <w:tcPr>
             <w:tcW w:w="992" w:type="dxa"/>
-            <w:tcMar/>
           </w:tcPr>
           <w:p>
             <w:pPr>
@@ -3988,12 +4231,18 @@
                 <w:szCs w:val="20"/>
               </w:rPr>
             </w:pPr>
+            <w:r>
+              <w:rPr>
+                <w:sz w:val="20"/>
+                <w:szCs w:val="20"/>
+              </w:rPr>
+              <w:t>AN</w:t>
+            </w:r>
           </w:p>
         </w:tc>
         <w:tc>
           <w:tcPr>
             <w:tcW w:w="4252" w:type="dxa"/>
-            <w:tcMar/>
           </w:tcPr>
           <w:p>
             <w:pPr>
@@ -4011,7 +4260,6 @@
         <w:tc>
           <w:tcPr>
             <w:tcW w:w="8222" w:type="dxa"/>
-            <w:tcMar/>
           </w:tcPr>
           <w:p>
             <w:pPr>
@@ -4041,7 +4289,6 @@
         <w:tc>
           <w:tcPr>
             <w:tcW w:w="1843" w:type="dxa"/>
-            <w:tcMar/>
           </w:tcPr>
           <w:p>
             <w:pPr>
@@ -4058,14 +4305,45 @@
                 <w:sz w:val="20"/>
                 <w:szCs w:val="20"/>
               </w:rPr>
-              <w:t>__/__/____</w:t>
+              <w:t>15</w:t>
+            </w:r>
+            <w:r>
+              <w:rPr>
+                <w:rFonts w:ascii="Arial" w:hAnsi="Arial"/>
+                <w:sz w:val="20"/>
+                <w:szCs w:val="20"/>
+              </w:rPr>
+              <w:t>/</w:t>
+            </w:r>
+            <w:r>
+              <w:rPr>
+                <w:rFonts w:ascii="Arial" w:hAnsi="Arial"/>
+                <w:sz w:val="20"/>
+                <w:szCs w:val="20"/>
+              </w:rPr>
+              <w:t>10</w:t>
+            </w:r>
+            <w:r>
+              <w:rPr>
+                <w:rFonts w:ascii="Arial" w:hAnsi="Arial"/>
+                <w:sz w:val="20"/>
+                <w:szCs w:val="20"/>
+              </w:rPr>
+              <w:t>/</w:t>
+            </w:r>
+            <w:r>
+              <w:rPr>
+                <w:rFonts w:ascii="Arial" w:hAnsi="Arial"/>
+                <w:sz w:val="20"/>
+                <w:szCs w:val="20"/>
+              </w:rPr>
+              <w:t>2026</w:t>
             </w:r>
           </w:p>
         </w:tc>
         <w:tc>
           <w:tcPr>
             <w:tcW w:w="992" w:type="dxa"/>
-            <w:tcMar/>
           </w:tcPr>
           <w:p>
             <w:pPr>
@@ -4076,12 +4354,18 @@
                 <w:szCs w:val="20"/>
               </w:rPr>
             </w:pPr>
+            <w:r>
+              <w:rPr>
+                <w:sz w:val="20"/>
+                <w:szCs w:val="20"/>
+              </w:rPr>
+              <w:t>AN</w:t>
+            </w:r>
           </w:p>
         </w:tc>
         <w:tc>
           <w:tcPr>
             <w:tcW w:w="4252" w:type="dxa"/>
-            <w:tcMar/>
           </w:tcPr>
           <w:p>
             <w:pPr>
@@ -4102,13 +4386,8 @@
         <w:tc>
           <w:tcPr>
             <w:tcW w:w="8222" w:type="dxa"/>
-            <w:tcMar/>
-          </w:tcPr>
-          <w:p>
-            <w:pPr>
-              <w:pStyle w:val="Normal"/>
-              <w:ind w:left="0"/>
-            </w:pPr>
+          </w:tcPr>
+          <w:p>
             <w:r>
               <w:rPr>
                 <w:sz w:val="20"/>
@@ -4121,11 +4400,10 @@
         <w:tc>
           <w:tcPr>
             <w:tcW w:w="1843" w:type="dxa"/>
-            <w:tcMar/>
-          </w:tcPr>
-          <w:p>
-            <w:pPr>
-              <w:keepLines w:val="1"/>
+          </w:tcPr>
+          <w:p>
+            <w:pPr>
+              <w:keepLines/>
               <w:spacing w:after="40"/>
               <w:rPr>
                 <w:sz w:val="20"/>
@@ -4138,38 +4416,80 @@
                 <w:sz w:val="20"/>
                 <w:szCs w:val="20"/>
               </w:rPr>
-              <w:t>__/__/____</w:t>
+              <w:t>15</w:t>
+            </w:r>
+            <w:r>
+              <w:rPr>
+                <w:rFonts w:ascii="Arial" w:hAnsi="Arial"/>
+                <w:sz w:val="20"/>
+                <w:szCs w:val="20"/>
+              </w:rPr>
+              <w:t>/</w:t>
+            </w:r>
+            <w:r>
+              <w:rPr>
+                <w:rFonts w:ascii="Arial" w:hAnsi="Arial"/>
+                <w:sz w:val="20"/>
+                <w:szCs w:val="20"/>
+              </w:rPr>
+              <w:t>10</w:t>
+            </w:r>
+            <w:r>
+              <w:rPr>
+                <w:rFonts w:ascii="Arial" w:hAnsi="Arial"/>
+                <w:sz w:val="20"/>
+                <w:szCs w:val="20"/>
+              </w:rPr>
+              <w:t>/</w:t>
+            </w:r>
+            <w:r>
+              <w:rPr>
+                <w:rFonts w:ascii="Arial" w:hAnsi="Arial"/>
+                <w:sz w:val="20"/>
+                <w:szCs w:val="20"/>
+              </w:rPr>
+              <w:t>2026</w:t>
             </w:r>
           </w:p>
         </w:tc>
         <w:tc>
           <w:tcPr>
             <w:tcW w:w="992" w:type="dxa"/>
-            <w:tcMar/>
-          </w:tcPr>
-          <w:p>
-            <w:pPr>
-              <w:pStyle w:val="Normal"/>
-              <w:rPr>
-                <w:sz w:val="20"/>
-                <w:szCs w:val="20"/>
-              </w:rPr>
-            </w:pPr>
+          </w:tcPr>
+          <w:p>
+            <w:pPr>
+              <w:rPr>
+                <w:sz w:val="20"/>
+                <w:szCs w:val="20"/>
+              </w:rPr>
+            </w:pPr>
+            <w:r>
+              <w:rPr>
+                <w:sz w:val="20"/>
+                <w:szCs w:val="20"/>
+              </w:rPr>
+              <w:t>AN</w:t>
+            </w:r>
           </w:p>
         </w:tc>
         <w:tc>
           <w:tcPr>
             <w:tcW w:w="4252" w:type="dxa"/>
-            <w:tcMar/>
-          </w:tcPr>
-          <w:p>
-            <w:pPr>
-              <w:pStyle w:val="Normal"/>
-              <w:rPr>
-                <w:sz w:val="20"/>
-                <w:szCs w:val="20"/>
-              </w:rPr>
-            </w:pPr>
+          </w:tcPr>
+          <w:p>
+            <w:pPr>
+              <w:rPr>
+                <w:sz w:val="20"/>
+                <w:szCs w:val="20"/>
+              </w:rPr>
+            </w:pPr>
+            <w:r>
+              <w:rPr>
+                <w:sz w:val="20"/>
+                <w:szCs w:val="20"/>
+              </w:rPr>
+              <w:t>Logical operator, HAVING and group by</w:t>
+            </w:r>
           </w:p>
         </w:tc>
       </w:tr>
@@ -4180,13 +4500,8 @@
         <w:tc>
           <w:tcPr>
             <w:tcW w:w="8222" w:type="dxa"/>
-            <w:tcMar/>
-          </w:tcPr>
-          <w:p>
-            <w:pPr>
-              <w:pStyle w:val="Normal"/>
-              <w:ind w:left="0"/>
-            </w:pPr>
+          </w:tcPr>
+          <w:p>
             <w:r>
               <w:rPr>
                 <w:sz w:val="20"/>
@@ -4199,11 +4514,10 @@
         <w:tc>
           <w:tcPr>
             <w:tcW w:w="1843" w:type="dxa"/>
-            <w:tcMar/>
-          </w:tcPr>
-          <w:p>
-            <w:pPr>
-              <w:keepLines w:val="1"/>
+          </w:tcPr>
+          <w:p>
+            <w:pPr>
+              <w:keepLines/>
               <w:spacing w:after="40"/>
               <w:rPr>
                 <w:sz w:val="20"/>
@@ -4216,38 +4530,80 @@
                 <w:sz w:val="20"/>
                 <w:szCs w:val="20"/>
               </w:rPr>
-              <w:t>__/__/____</w:t>
+              <w:t>15</w:t>
+            </w:r>
+            <w:r>
+              <w:rPr>
+                <w:rFonts w:ascii="Arial" w:hAnsi="Arial"/>
+                <w:sz w:val="20"/>
+                <w:szCs w:val="20"/>
+              </w:rPr>
+              <w:t>/</w:t>
+            </w:r>
+            <w:r>
+              <w:rPr>
+                <w:rFonts w:ascii="Arial" w:hAnsi="Arial"/>
+                <w:sz w:val="20"/>
+                <w:szCs w:val="20"/>
+              </w:rPr>
+              <w:t>10</w:t>
+            </w:r>
+            <w:r>
+              <w:rPr>
+                <w:rFonts w:ascii="Arial" w:hAnsi="Arial"/>
+                <w:sz w:val="20"/>
+                <w:szCs w:val="20"/>
+              </w:rPr>
+              <w:t>/</w:t>
+            </w:r>
+            <w:r>
+              <w:rPr>
+                <w:rFonts w:ascii="Arial" w:hAnsi="Arial"/>
+                <w:sz w:val="20"/>
+                <w:szCs w:val="20"/>
+              </w:rPr>
+              <w:t>2026</w:t>
             </w:r>
           </w:p>
         </w:tc>
         <w:tc>
           <w:tcPr>
             <w:tcW w:w="992" w:type="dxa"/>
-            <w:tcMar/>
-          </w:tcPr>
-          <w:p>
-            <w:pPr>
-              <w:pStyle w:val="Normal"/>
-              <w:rPr>
-                <w:sz w:val="20"/>
-                <w:szCs w:val="20"/>
-              </w:rPr>
-            </w:pPr>
+          </w:tcPr>
+          <w:p>
+            <w:pPr>
+              <w:rPr>
+                <w:sz w:val="20"/>
+                <w:szCs w:val="20"/>
+              </w:rPr>
+            </w:pPr>
+            <w:r>
+              <w:rPr>
+                <w:sz w:val="20"/>
+                <w:szCs w:val="20"/>
+              </w:rPr>
+              <w:t>AN</w:t>
+            </w:r>
           </w:p>
         </w:tc>
         <w:tc>
           <w:tcPr>
             <w:tcW w:w="4252" w:type="dxa"/>
-            <w:tcMar/>
-          </w:tcPr>
-          <w:p>
-            <w:pPr>
-              <w:pStyle w:val="Normal"/>
-              <w:rPr>
-                <w:sz w:val="20"/>
-                <w:szCs w:val="20"/>
-              </w:rPr>
-            </w:pPr>
+          </w:tcPr>
+          <w:p>
+            <w:pPr>
+              <w:rPr>
+                <w:sz w:val="20"/>
+                <w:szCs w:val="20"/>
+              </w:rPr>
+            </w:pPr>
+            <w:r>
+              <w:rPr>
+                <w:sz w:val="20"/>
+                <w:szCs w:val="20"/>
+              </w:rPr>
+              <w:t>Table structure, normalisation, join types</w:t>
+            </w:r>
           </w:p>
         </w:tc>
       </w:tr>
@@ -4357,7 +4713,7 @@
             <w:tcBorders>
               <w:top w:val="nil"/>
               <w:left w:val="nil"/>
-              <w:right w:val="single" w:color="auto" w:sz="4" w:space="0"/>
+              <w:right w:val="single" w:sz="4" w:space="0" w:color="auto"/>
             </w:tcBorders>
             <w:vAlign w:val="center"/>
           </w:tcPr>
@@ -4383,8 +4739,8 @@
             <w:tcW w:w="9016" w:type="dxa"/>
             <w:tcBorders>
               <w:top w:val="nil"/>
-              <w:left w:val="single" w:color="auto" w:sz="4" w:space="0"/>
-              <w:right w:val="single" w:color="auto" w:sz="4" w:space="0"/>
+              <w:left w:val="single" w:sz="4" w:space="0" w:color="auto"/>
+              <w:right w:val="single" w:sz="4" w:space="0" w:color="auto"/>
             </w:tcBorders>
             <w:vAlign w:val="center"/>
           </w:tcPr>
@@ -4395,6 +4751,13 @@
                 <w:szCs w:val="20"/>
               </w:rPr>
             </w:pPr>
+            <w:r>
+              <w:rPr>
+                <w:sz w:val="20"/>
+                <w:szCs w:val="20"/>
+              </w:rPr>
+              <w:t>Anh Nguyen</w:t>
+            </w:r>
           </w:p>
         </w:tc>
         <w:tc>
@@ -4402,7 +4765,7 @@
             <w:tcW w:w="3402" w:type="dxa"/>
             <w:tcBorders>
               <w:top w:val="nil"/>
-              <w:left w:val="single" w:color="auto" w:sz="4" w:space="0"/>
+              <w:left w:val="single" w:sz="4" w:space="0" w:color="auto"/>
               <w:right w:val="nil"/>
             </w:tcBorders>
             <w:vAlign w:val="center"/>
@@ -4421,6 +4784,13 @@
                 <w:szCs w:val="20"/>
               </w:rPr>
               <w:t>Date</w:t>
+            </w:r>
+            <w:r>
+              <w:rPr>
+                <w:sz w:val="20"/>
+                <w:szCs w:val="20"/>
+              </w:rPr>
+              <w:t xml:space="preserve"> 15/10/26</w:t>
             </w:r>
           </w:p>
         </w:tc>
@@ -4459,7 +4829,7 @@
 </file>
 
 <file path=word/endnotes.xml><?xml version="1.0" encoding="utf-8"?>
-<w:endnotes xmlns:wpc="http://schemas.microsoft.com/office/word/2010/wordprocessingCanvas" xmlns:cx="http://schemas.microsoft.com/office/drawing/2014/chartex" xmlns:cx1="http://schemas.microsoft.com/office/drawing/2015/9/8/chartex" xmlns:cx2="http://schemas.microsoft.com/office/drawing/2015/10/21/chartex" xmlns:cx3="http://schemas.microsoft.com/office/drawing/2016/5/9/chartex" xmlns:cx4="http://schemas.microsoft.com/office/drawing/2016/5/10/chartex" xmlns:cx5="http://schemas.microsoft.com/office/drawing/2016/5/11/chartex" xmlns:cx6="http://schemas.microsoft.com/office/drawing/2016/5/12/chartex" xmlns:cx7="http://schemas.microsoft.com/office/drawing/2016/5/13/chartex" xmlns:cx8="http://schemas.microsoft.com/office/drawing/2016/5/14/chartex" xmlns:mc="http://schemas.openxmlformats.org/markup-compatibility/2006" xmlns:m="http://schemas.openxmlformats.org/officeDocument/2006/math" xmlns:aink="http://schemas.microsoft.com/office/drawing/2016/ink" xmlns:am3d="http://schemas.microsoft.com/office/drawing/2017/model3d" xmlns:oel="http://schemas.microsoft.com/office/2019/extlst" xmlns:r="http://schemas.openxmlformats.org/officeDocument/2006/relationships" xmlns:wp14="http://schemas.microsoft.com/office/word/2010/wordprocessingDrawing" xmlns:wp="http://schemas.openxmlformats.org/drawingml/2006/wordprocessingDrawing" xmlns:wpg="http://schemas.microsoft.com/office/word/2010/wordprocessingGroup" xmlns:wpi="http://schemas.microsoft.com/office/word/2010/wordprocessingInk" xmlns:wps="http://schemas.microsoft.com/office/word/2010/wordprocessingShape" xmlns:o="urn:schemas-microsoft-com:office:office" xmlns:v="urn:schemas-microsoft-com:vml" xmlns:w10="urn:schemas-microsoft-com:office:word" xmlns:w="http://schemas.openxmlformats.org/wordprocessingml/2006/main" xmlns:w14="http://schemas.microsoft.com/office/word/2010/wordml" xmlns:w15="http://schemas.microsoft.com/office/word/2012/wordml" xmlns:w16cex="http://schemas.microsoft.com/office/word/2018/wordml/cex" xmlns:w16cid="http://schemas.microsoft.com/office/word/2016/wordml/cid" xmlns:w16="http://schemas.microsoft.com/office/word/2018/wordml" xmlns:w16sdtdh="http://schemas.microsoft.com/office/word/2020/wordml/sdtdatahash" xmlns:w16sdtfl="http://schemas.microsoft.com/office/word/2024/wordml/sdtformatlock" xmlns:w16se="http://schemas.microsoft.com/office/word/2015/wordml/symex" xmlns:w16du="http://schemas.microsoft.com/office/word/2023/wordml/word16du" xmlns:wne="http://schemas.microsoft.com/office/word/2006/wordml" mc:Ignorable="w14 w15 w16se w16cid w16 w16cex w16sdtdh w16sdtfl w16du wp14">
+<w:endnotes xmlns:wpc="http://schemas.microsoft.com/office/word/2010/wordprocessingCanvas" xmlns:cx="http://schemas.microsoft.com/office/drawing/2014/chartex" xmlns:cx1="http://schemas.microsoft.com/office/drawing/2015/9/8/chartex" xmlns:cx2="http://schemas.microsoft.com/office/drawing/2015/10/21/chartex" xmlns:cx3="http://schemas.microsoft.com/office/drawing/2016/5/9/chartex" xmlns:cx4="http://schemas.microsoft.com/office/drawing/2016/5/10/chartex" xmlns:cx5="http://schemas.microsoft.com/office/drawing/2016/5/11/chartex" xmlns:cx6="http://schemas.microsoft.com/office/drawing/2016/5/12/chartex" xmlns:cx7="http://schemas.microsoft.com/office/drawing/2016/5/13/chartex" xmlns:cx8="http://schemas.microsoft.com/office/drawing/2016/5/14/chartex" xmlns:mc="http://schemas.openxmlformats.org/markup-compatibility/2006" xmlns:aink="http://schemas.microsoft.com/office/drawing/2016/ink" xmlns:am3d="http://schemas.microsoft.com/office/drawing/2017/model3d" xmlns:o="urn:schemas-microsoft-com:office:office" xmlns:oel="http://schemas.microsoft.com/office/2019/extlst" xmlns:r="http://schemas.openxmlformats.org/officeDocument/2006/relationships" xmlns:m="http://schemas.openxmlformats.org/officeDocument/2006/math" xmlns:v="urn:schemas-microsoft-com:vml" xmlns:wp14="http://schemas.microsoft.com/office/word/2010/wordprocessingDrawing" xmlns:wp="http://schemas.openxmlformats.org/drawingml/2006/wordprocessingDrawing" xmlns:w10="urn:schemas-microsoft-com:office:word" xmlns:w="http://schemas.openxmlformats.org/wordprocessingml/2006/main" xmlns:w14="http://schemas.microsoft.com/office/word/2010/wordml" xmlns:w15="http://schemas.microsoft.com/office/word/2012/wordml" xmlns:w16cex="http://schemas.microsoft.com/office/word/2018/wordml/cex" xmlns:w16cid="http://schemas.microsoft.com/office/word/2016/wordml/cid" xmlns:w16="http://schemas.microsoft.com/office/word/2018/wordml" xmlns:w16du="http://schemas.microsoft.com/office/word/2023/wordml/word16du" xmlns:w16sdtdh="http://schemas.microsoft.com/office/word/2020/wordml/sdtdatahash" xmlns:w16sdtfl="http://schemas.microsoft.com/office/word/2024/wordml/sdtformatlock" xmlns:w16se="http://schemas.microsoft.com/office/word/2015/wordml/symex" xmlns:wpg="http://schemas.microsoft.com/office/word/2010/wordprocessingGroup" xmlns:wpi="http://schemas.microsoft.com/office/word/2010/wordprocessingInk" xmlns:wne="http://schemas.microsoft.com/office/word/2006/wordml" xmlns:wps="http://schemas.microsoft.com/office/word/2010/wordprocessingShape" mc:Ignorable="w14 w15 w16se w16cid w16 w16cex w16sdtdh w16sdtfl w16du wp14">
   <w:endnote w:type="separator" w:id="-1">
     <w:p>
       <w:r>
@@ -4478,7 +4848,7 @@
 </file>
 
 <file path=word/footer1.xml><?xml version="1.0" encoding="utf-8"?>
-<w:ftr xmlns:wpc="http://schemas.microsoft.com/office/word/2010/wordprocessingCanvas" xmlns:cx="http://schemas.microsoft.com/office/drawing/2014/chartex" xmlns:cx1="http://schemas.microsoft.com/office/drawing/2015/9/8/chartex" xmlns:cx2="http://schemas.microsoft.com/office/drawing/2015/10/21/chartex" xmlns:cx3="http://schemas.microsoft.com/office/drawing/2016/5/9/chartex" xmlns:cx4="http://schemas.microsoft.com/office/drawing/2016/5/10/chartex" xmlns:cx5="http://schemas.microsoft.com/office/drawing/2016/5/11/chartex" xmlns:cx6="http://schemas.microsoft.com/office/drawing/2016/5/12/chartex" xmlns:cx7="http://schemas.microsoft.com/office/drawing/2016/5/13/chartex" xmlns:cx8="http://schemas.microsoft.com/office/drawing/2016/5/14/chartex" xmlns:mc="http://schemas.openxmlformats.org/markup-compatibility/2006" xmlns:m="http://schemas.openxmlformats.org/officeDocument/2006/math" xmlns:aink="http://schemas.microsoft.com/office/drawing/2016/ink" xmlns:am3d="http://schemas.microsoft.com/office/drawing/2017/model3d" xmlns:oel="http://schemas.microsoft.com/office/2019/extlst" xmlns:r="http://schemas.openxmlformats.org/officeDocument/2006/relationships" xmlns:wp14="http://schemas.microsoft.com/office/word/2010/wordprocessingDrawing" xmlns:wp="http://schemas.openxmlformats.org/drawingml/2006/wordprocessingDrawing" xmlns:wpg="http://schemas.microsoft.com/office/word/2010/wordprocessingGroup" xmlns:wpi="http://schemas.microsoft.com/office/word/2010/wordprocessingInk" xmlns:wps="http://schemas.microsoft.com/office/word/2010/wordprocessingShape" xmlns:o="urn:schemas-microsoft-com:office:office" xmlns:v="urn:schemas-microsoft-com:vml" xmlns:w10="urn:schemas-microsoft-com:office:word" xmlns:w="http://schemas.openxmlformats.org/wordprocessingml/2006/main" xmlns:w14="http://schemas.microsoft.com/office/word/2010/wordml" xmlns:w15="http://schemas.microsoft.com/office/word/2012/wordml" xmlns:w16cex="http://schemas.microsoft.com/office/word/2018/wordml/cex" xmlns:w16cid="http://schemas.microsoft.com/office/word/2016/wordml/cid" xmlns:w16="http://schemas.microsoft.com/office/word/2018/wordml" xmlns:w16sdtdh="http://schemas.microsoft.com/office/word/2020/wordml/sdtdatahash" xmlns:w16sdtfl="http://schemas.microsoft.com/office/word/2024/wordml/sdtformatlock" xmlns:w16se="http://schemas.microsoft.com/office/word/2015/wordml/symex" xmlns:w16du="http://schemas.microsoft.com/office/word/2023/wordml/word16du" xmlns:wne="http://schemas.microsoft.com/office/word/2006/wordml" mc:Ignorable="w14 w15 w16se w16cid w16 w16cex w16sdtdh w16sdtfl w16du wp14">
+<w:ftr xmlns:wpc="http://schemas.microsoft.com/office/word/2010/wordprocessingCanvas" xmlns:cx="http://schemas.microsoft.com/office/drawing/2014/chartex" xmlns:cx1="http://schemas.microsoft.com/office/drawing/2015/9/8/chartex" xmlns:cx2="http://schemas.microsoft.com/office/drawing/2015/10/21/chartex" xmlns:cx3="http://schemas.microsoft.com/office/drawing/2016/5/9/chartex" xmlns:cx4="http://schemas.microsoft.com/office/drawing/2016/5/10/chartex" xmlns:cx5="http://schemas.microsoft.com/office/drawing/2016/5/11/chartex" xmlns:cx6="http://schemas.microsoft.com/office/drawing/2016/5/12/chartex" xmlns:cx7="http://schemas.microsoft.com/office/drawing/2016/5/13/chartex" xmlns:cx8="http://schemas.microsoft.com/office/drawing/2016/5/14/chartex" xmlns:mc="http://schemas.openxmlformats.org/markup-compatibility/2006" xmlns:aink="http://schemas.microsoft.com/office/drawing/2016/ink" xmlns:am3d="http://schemas.microsoft.com/office/drawing/2017/model3d" xmlns:o="urn:schemas-microsoft-com:office:office" xmlns:oel="http://schemas.microsoft.com/office/2019/extlst" xmlns:r="http://schemas.openxmlformats.org/officeDocument/2006/relationships" xmlns:m="http://schemas.openxmlformats.org/officeDocument/2006/math" xmlns:v="urn:schemas-microsoft-com:vml" xmlns:wp14="http://schemas.microsoft.com/office/word/2010/wordprocessingDrawing" xmlns:wp="http://schemas.openxmlformats.org/drawingml/2006/wordprocessingDrawing" xmlns:w10="urn:schemas-microsoft-com:office:word" xmlns:w="http://schemas.openxmlformats.org/wordprocessingml/2006/main" xmlns:w14="http://schemas.microsoft.com/office/word/2010/wordml" xmlns:w15="http://schemas.microsoft.com/office/word/2012/wordml" xmlns:w16cex="http://schemas.microsoft.com/office/word/2018/wordml/cex" xmlns:w16cid="http://schemas.microsoft.com/office/word/2016/wordml/cid" xmlns:w16="http://schemas.microsoft.com/office/word/2018/wordml" xmlns:w16du="http://schemas.microsoft.com/office/word/2023/wordml/word16du" xmlns:w16sdtdh="http://schemas.microsoft.com/office/word/2020/wordml/sdtdatahash" xmlns:w16sdtfl="http://schemas.microsoft.com/office/word/2024/wordml/sdtformatlock" xmlns:w16se="http://schemas.microsoft.com/office/word/2015/wordml/symex" xmlns:wpg="http://schemas.microsoft.com/office/word/2010/wordprocessingGroup" xmlns:wpi="http://schemas.microsoft.com/office/word/2010/wordprocessingInk" xmlns:wne="http://schemas.microsoft.com/office/word/2006/wordml" xmlns:wps="http://schemas.microsoft.com/office/word/2010/wordprocessingShape" mc:Ignorable="w14 w15 w16se w16cid w16 w16cex w16sdtdh w16sdtfl w16du wp14">
   <w:p>
     <w:pPr>
       <w:pStyle w:val="Footer"/>
@@ -4488,7 +4858,7 @@
 </file>
 
 <file path=word/footer2.xml><?xml version="1.0" encoding="utf-8"?>
-<w:ftr xmlns:wpc="http://schemas.microsoft.com/office/word/2010/wordprocessingCanvas" xmlns:cx="http://schemas.microsoft.com/office/drawing/2014/chartex" xmlns:cx1="http://schemas.microsoft.com/office/drawing/2015/9/8/chartex" xmlns:cx2="http://schemas.microsoft.com/office/drawing/2015/10/21/chartex" xmlns:cx3="http://schemas.microsoft.com/office/drawing/2016/5/9/chartex" xmlns:cx4="http://schemas.microsoft.com/office/drawing/2016/5/10/chartex" xmlns:cx5="http://schemas.microsoft.com/office/drawing/2016/5/11/chartex" xmlns:cx6="http://schemas.microsoft.com/office/drawing/2016/5/12/chartex" xmlns:cx7="http://schemas.microsoft.com/office/drawing/2016/5/13/chartex" xmlns:cx8="http://schemas.microsoft.com/office/drawing/2016/5/14/chartex" xmlns:mc="http://schemas.openxmlformats.org/markup-compatibility/2006" xmlns:m="http://schemas.openxmlformats.org/officeDocument/2006/math" xmlns:aink="http://schemas.microsoft.com/office/drawing/2016/ink" xmlns:am3d="http://schemas.microsoft.com/office/drawing/2017/model3d" xmlns:oel="http://schemas.microsoft.com/office/2019/extlst" xmlns:r="http://schemas.openxmlformats.org/officeDocument/2006/relationships" xmlns:wp14="http://schemas.microsoft.com/office/word/2010/wordprocessingDrawing" xmlns:wp="http://schemas.openxmlformats.org/drawingml/2006/wordprocessingDrawing" xmlns:wpg="http://schemas.microsoft.com/office/word/2010/wordprocessingGroup" xmlns:wpi="http://schemas.microsoft.com/office/word/2010/wordprocessingInk" xmlns:wps="http://schemas.microsoft.com/office/word/2010/wordprocessingShape" xmlns:o="urn:schemas-microsoft-com:office:office" xmlns:v="urn:schemas-microsoft-com:vml" xmlns:w10="urn:schemas-microsoft-com:office:word" xmlns:w="http://schemas.openxmlformats.org/wordprocessingml/2006/main" xmlns:w14="http://schemas.microsoft.com/office/word/2010/wordml" xmlns:w15="http://schemas.microsoft.com/office/word/2012/wordml" xmlns:w16cex="http://schemas.microsoft.com/office/word/2018/wordml/cex" xmlns:w16cid="http://schemas.microsoft.com/office/word/2016/wordml/cid" xmlns:w16="http://schemas.microsoft.com/office/word/2018/wordml" xmlns:w16sdtdh="http://schemas.microsoft.com/office/word/2020/wordml/sdtdatahash" xmlns:w16sdtfl="http://schemas.microsoft.com/office/word/2024/wordml/sdtformatlock" xmlns:w16se="http://schemas.microsoft.com/office/word/2015/wordml/symex" xmlns:w16du="http://schemas.microsoft.com/office/word/2023/wordml/word16du" xmlns:wne="http://schemas.microsoft.com/office/word/2006/wordml" mc:Ignorable="w14 w15 w16se w16cid w16 w16cex w16sdtdh w16sdtfl w16du wp14">
+<w:ftr xmlns:wpc="http://schemas.microsoft.com/office/word/2010/wordprocessingCanvas" xmlns:cx="http://schemas.microsoft.com/office/drawing/2014/chartex" xmlns:cx1="http://schemas.microsoft.com/office/drawing/2015/9/8/chartex" xmlns:cx2="http://schemas.microsoft.com/office/drawing/2015/10/21/chartex" xmlns:cx3="http://schemas.microsoft.com/office/drawing/2016/5/9/chartex" xmlns:cx4="http://schemas.microsoft.com/office/drawing/2016/5/10/chartex" xmlns:cx5="http://schemas.microsoft.com/office/drawing/2016/5/11/chartex" xmlns:cx6="http://schemas.microsoft.com/office/drawing/2016/5/12/chartex" xmlns:cx7="http://schemas.microsoft.com/office/drawing/2016/5/13/chartex" xmlns:cx8="http://schemas.microsoft.com/office/drawing/2016/5/14/chartex" xmlns:mc="http://schemas.openxmlformats.org/markup-compatibility/2006" xmlns:aink="http://schemas.microsoft.com/office/drawing/2016/ink" xmlns:am3d="http://schemas.microsoft.com/office/drawing/2017/model3d" xmlns:o="urn:schemas-microsoft-com:office:office" xmlns:oel="http://schemas.microsoft.com/office/2019/extlst" xmlns:r="http://schemas.openxmlformats.org/officeDocument/2006/relationships" xmlns:m="http://schemas.openxmlformats.org/officeDocument/2006/math" xmlns:v="urn:schemas-microsoft-com:vml" xmlns:wp14="http://schemas.microsoft.com/office/word/2010/wordprocessingDrawing" xmlns:wp="http://schemas.openxmlformats.org/drawingml/2006/wordprocessingDrawing" xmlns:w10="urn:schemas-microsoft-com:office:word" xmlns:w="http://schemas.openxmlformats.org/wordprocessingml/2006/main" xmlns:w14="http://schemas.microsoft.com/office/word/2010/wordml" xmlns:w15="http://schemas.microsoft.com/office/word/2012/wordml" xmlns:w16cex="http://schemas.microsoft.com/office/word/2018/wordml/cex" xmlns:w16cid="http://schemas.microsoft.com/office/word/2016/wordml/cid" xmlns:w16="http://schemas.microsoft.com/office/word/2018/wordml" xmlns:w16du="http://schemas.microsoft.com/office/word/2023/wordml/word16du" xmlns:w16sdtdh="http://schemas.microsoft.com/office/word/2020/wordml/sdtdatahash" xmlns:w16sdtfl="http://schemas.microsoft.com/office/word/2024/wordml/sdtformatlock" xmlns:w16se="http://schemas.microsoft.com/office/word/2015/wordml/symex" xmlns:wpg="http://schemas.microsoft.com/office/word/2010/wordprocessingGroup" xmlns:wpi="http://schemas.microsoft.com/office/word/2010/wordprocessingInk" xmlns:wne="http://schemas.microsoft.com/office/word/2006/wordml" xmlns:wps="http://schemas.microsoft.com/office/word/2010/wordprocessingShape" mc:Ignorable="w14 w15 w16se w16cid w16 w16cex w16sdtdh w16sdtfl w16du wp14">
   <w:p>
     <w:pPr>
       <w:pStyle w:val="Footer"/>
@@ -4521,24 +4891,14 @@
     <w:r>
       <w:t>0</w:t>
     </w:r>
-    <w:proofErr w:type="gramStart"/>
     <w:r>
       <w:rPr>
         <w:rStyle w:val="FooterChar"/>
       </w:rPr>
-      <w:t xml:space="preserve">   (</w:t>
-    </w:r>
-    <w:proofErr w:type="gramEnd"/>
-    <w:r>
-      <w:rPr>
-        <w:rStyle w:val="FooterChar"/>
-      </w:rPr>
-      <w:t>Template Version 1.3)</w:t>
+      <w:t xml:space="preserve">   (Template Version 1.3)</w:t>
     </w:r>
     <w:r>
       <w:tab/>
-    </w:r>
-    <w:r>
       <w:t xml:space="preserve">Last saved </w:t>
     </w:r>
     <w:r>
@@ -4554,15 +4914,13 @@
       <w:rPr>
         <w:noProof/>
       </w:rPr>
-      <w:t>13 October 2026</w:t>
+      <w:t>14 October 2026</w:t>
     </w:r>
     <w:r>
       <w:fldChar w:fldCharType="end"/>
     </w:r>
     <w:r>
       <w:tab/>
-    </w:r>
-    <w:r>
       <w:t xml:space="preserve">Page </w:t>
     </w:r>
     <w:r>
@@ -4586,30 +4944,20 @@
     <w:r>
       <w:t xml:space="preserve"> of </w:t>
     </w:r>
-    <w:r>
-      <w:fldChar w:fldCharType="begin"/>
-    </w:r>
-    <w:r>
-      <w:instrText>NUMPAGES   \* MERGEFORMAT</w:instrText>
-    </w:r>
-    <w:r>
-      <w:fldChar w:fldCharType="separate"/>
-    </w:r>
-    <w:r>
-      <w:rPr>
-        <w:noProof/>
-      </w:rPr>
-      <w:t>3</w:t>
-    </w:r>
-    <w:r>
-      <w:fldChar w:fldCharType="end"/>
-    </w:r>
+    <w:fldSimple w:instr="NUMPAGES   \* MERGEFORMAT">
+      <w:r>
+        <w:rPr>
+          <w:noProof/>
+        </w:rPr>
+        <w:t>3</w:t>
+      </w:r>
+    </w:fldSimple>
   </w:p>
 </w:ftr>
 </file>
 
 <file path=word/footer3.xml><?xml version="1.0" encoding="utf-8"?>
-<w:ftr xmlns:wpc="http://schemas.microsoft.com/office/word/2010/wordprocessingCanvas" xmlns:cx="http://schemas.microsoft.com/office/drawing/2014/chartex" xmlns:cx1="http://schemas.microsoft.com/office/drawing/2015/9/8/chartex" xmlns:cx2="http://schemas.microsoft.com/office/drawing/2015/10/21/chartex" xmlns:cx3="http://schemas.microsoft.com/office/drawing/2016/5/9/chartex" xmlns:cx4="http://schemas.microsoft.com/office/drawing/2016/5/10/chartex" xmlns:cx5="http://schemas.microsoft.com/office/drawing/2016/5/11/chartex" xmlns:cx6="http://schemas.microsoft.com/office/drawing/2016/5/12/chartex" xmlns:cx7="http://schemas.microsoft.com/office/drawing/2016/5/13/chartex" xmlns:cx8="http://schemas.microsoft.com/office/drawing/2016/5/14/chartex" xmlns:mc="http://schemas.openxmlformats.org/markup-compatibility/2006" xmlns:m="http://schemas.openxmlformats.org/officeDocument/2006/math" xmlns:aink="http://schemas.microsoft.com/office/drawing/2016/ink" xmlns:am3d="http://schemas.microsoft.com/office/drawing/2017/model3d" xmlns:oel="http://schemas.microsoft.com/office/2019/extlst" xmlns:r="http://schemas.openxmlformats.org/officeDocument/2006/relationships" xmlns:wp14="http://schemas.microsoft.com/office/word/2010/wordprocessingDrawing" xmlns:wp="http://schemas.openxmlformats.org/drawingml/2006/wordprocessingDrawing" xmlns:wpg="http://schemas.microsoft.com/office/word/2010/wordprocessingGroup" xmlns:wpi="http://schemas.microsoft.com/office/word/2010/wordprocessingInk" xmlns:wps="http://schemas.microsoft.com/office/word/2010/wordprocessingShape" xmlns:o="urn:schemas-microsoft-com:office:office" xmlns:v="urn:schemas-microsoft-com:vml" xmlns:w10="urn:schemas-microsoft-com:office:word" xmlns:w="http://schemas.openxmlformats.org/wordprocessingml/2006/main" xmlns:w14="http://schemas.microsoft.com/office/word/2010/wordml" xmlns:w15="http://schemas.microsoft.com/office/word/2012/wordml" xmlns:w16cex="http://schemas.microsoft.com/office/word/2018/wordml/cex" xmlns:w16cid="http://schemas.microsoft.com/office/word/2016/wordml/cid" xmlns:w16="http://schemas.microsoft.com/office/word/2018/wordml" xmlns:w16sdtdh="http://schemas.microsoft.com/office/word/2020/wordml/sdtdatahash" xmlns:w16sdtfl="http://schemas.microsoft.com/office/word/2024/wordml/sdtformatlock" xmlns:w16se="http://schemas.microsoft.com/office/word/2015/wordml/symex" xmlns:w16du="http://schemas.microsoft.com/office/word/2023/wordml/word16du" xmlns:wne="http://schemas.microsoft.com/office/word/2006/wordml" mc:Ignorable="w14 w15 w16se w16cid w16 w16cex w16sdtdh w16sdtfl w16du wp14">
+<w:ftr xmlns:wpc="http://schemas.microsoft.com/office/word/2010/wordprocessingCanvas" xmlns:cx="http://schemas.microsoft.com/office/drawing/2014/chartex" xmlns:cx1="http://schemas.microsoft.com/office/drawing/2015/9/8/chartex" xmlns:cx2="http://schemas.microsoft.com/office/drawing/2015/10/21/chartex" xmlns:cx3="http://schemas.microsoft.com/office/drawing/2016/5/9/chartex" xmlns:cx4="http://schemas.microsoft.com/office/drawing/2016/5/10/chartex" xmlns:cx5="http://schemas.microsoft.com/office/drawing/2016/5/11/chartex" xmlns:cx6="http://schemas.microsoft.com/office/drawing/2016/5/12/chartex" xmlns:cx7="http://schemas.microsoft.com/office/drawing/2016/5/13/chartex" xmlns:cx8="http://schemas.microsoft.com/office/drawing/2016/5/14/chartex" xmlns:mc="http://schemas.openxmlformats.org/markup-compatibility/2006" xmlns:aink="http://schemas.microsoft.com/office/drawing/2016/ink" xmlns:am3d="http://schemas.microsoft.com/office/drawing/2017/model3d" xmlns:o="urn:schemas-microsoft-com:office:office" xmlns:oel="http://schemas.microsoft.com/office/2019/extlst" xmlns:r="http://schemas.openxmlformats.org/officeDocument/2006/relationships" xmlns:m="http://schemas.openxmlformats.org/officeDocument/2006/math" xmlns:v="urn:schemas-microsoft-com:vml" xmlns:wp14="http://schemas.microsoft.com/office/word/2010/wordprocessingDrawing" xmlns:wp="http://schemas.openxmlformats.org/drawingml/2006/wordprocessingDrawing" xmlns:w10="urn:schemas-microsoft-com:office:word" xmlns:w="http://schemas.openxmlformats.org/wordprocessingml/2006/main" xmlns:w14="http://schemas.microsoft.com/office/word/2010/wordml" xmlns:w15="http://schemas.microsoft.com/office/word/2012/wordml" xmlns:w16cex="http://schemas.microsoft.com/office/word/2018/wordml/cex" xmlns:w16cid="http://schemas.microsoft.com/office/word/2016/wordml/cid" xmlns:w16="http://schemas.microsoft.com/office/word/2018/wordml" xmlns:w16du="http://schemas.microsoft.com/office/word/2023/wordml/word16du" xmlns:w16sdtdh="http://schemas.microsoft.com/office/word/2020/wordml/sdtdatahash" xmlns:w16sdtfl="http://schemas.microsoft.com/office/word/2024/wordml/sdtformatlock" xmlns:w16se="http://schemas.microsoft.com/office/word/2015/wordml/symex" xmlns:wpg="http://schemas.microsoft.com/office/word/2010/wordprocessingGroup" xmlns:wpi="http://schemas.microsoft.com/office/word/2010/wordprocessingInk" xmlns:wne="http://schemas.microsoft.com/office/word/2006/wordml" xmlns:wps="http://schemas.microsoft.com/office/word/2010/wordprocessingShape" mc:Ignorable="w14 w15 w16se w16cid w16 w16cex w16sdtdh w16sdtfl w16du wp14">
   <w:p>
     <w:pPr>
       <w:pStyle w:val="Footer"/>
@@ -4619,7 +4967,7 @@
 </file>
 
 <file path=word/footer4.xml><?xml version="1.0" encoding="utf-8"?>
-<w:ftr xmlns:wpc="http://schemas.microsoft.com/office/word/2010/wordprocessingCanvas" xmlns:cx="http://schemas.microsoft.com/office/drawing/2014/chartex" xmlns:cx1="http://schemas.microsoft.com/office/drawing/2015/9/8/chartex" xmlns:cx2="http://schemas.microsoft.com/office/drawing/2015/10/21/chartex" xmlns:cx3="http://schemas.microsoft.com/office/drawing/2016/5/9/chartex" xmlns:cx4="http://schemas.microsoft.com/office/drawing/2016/5/10/chartex" xmlns:cx5="http://schemas.microsoft.com/office/drawing/2016/5/11/chartex" xmlns:cx6="http://schemas.microsoft.com/office/drawing/2016/5/12/chartex" xmlns:cx7="http://schemas.microsoft.com/office/drawing/2016/5/13/chartex" xmlns:cx8="http://schemas.microsoft.com/office/drawing/2016/5/14/chartex" xmlns:mc="http://schemas.openxmlformats.org/markup-compatibility/2006" xmlns:m="http://schemas.openxmlformats.org/officeDocument/2006/math" xmlns:aink="http://schemas.microsoft.com/office/drawing/2016/ink" xmlns:am3d="http://schemas.microsoft.com/office/drawing/2017/model3d" xmlns:oel="http://schemas.microsoft.com/office/2019/extlst" xmlns:r="http://schemas.openxmlformats.org/officeDocument/2006/relationships" xmlns:wp14="http://schemas.microsoft.com/office/word/2010/wordprocessingDrawing" xmlns:wp="http://schemas.openxmlformats.org/drawingml/2006/wordprocessingDrawing" xmlns:wpg="http://schemas.microsoft.com/office/word/2010/wordprocessingGroup" xmlns:wpi="http://schemas.microsoft.com/office/word/2010/wordprocessingInk" xmlns:wps="http://schemas.microsoft.com/office/word/2010/wordprocessingShape" xmlns:o="urn:schemas-microsoft-com:office:office" xmlns:v="urn:schemas-microsoft-com:vml" xmlns:w10="urn:schemas-microsoft-com:office:word" xmlns:w="http://schemas.openxmlformats.org/wordprocessingml/2006/main" xmlns:w14="http://schemas.microsoft.com/office/word/2010/wordml" xmlns:w15="http://schemas.microsoft.com/office/word/2012/wordml" xmlns:w16cex="http://schemas.microsoft.com/office/word/2018/wordml/cex" xmlns:w16cid="http://schemas.microsoft.com/office/word/2016/wordml/cid" xmlns:w16="http://schemas.microsoft.com/office/word/2018/wordml" xmlns:w16sdtdh="http://schemas.microsoft.com/office/word/2020/wordml/sdtdatahash" xmlns:w16sdtfl="http://schemas.microsoft.com/office/word/2024/wordml/sdtformatlock" xmlns:w16se="http://schemas.microsoft.com/office/word/2015/wordml/symex" xmlns:w16du="http://schemas.microsoft.com/office/word/2023/wordml/word16du" xmlns:wne="http://schemas.microsoft.com/office/word/2006/wordml" mc:Ignorable="w14 w15 w16se w16cid w16 w16cex w16sdtdh w16sdtfl w16du wp14">
+<w:ftr xmlns:wpc="http://schemas.microsoft.com/office/word/2010/wordprocessingCanvas" xmlns:cx="http://schemas.microsoft.com/office/drawing/2014/chartex" xmlns:cx1="http://schemas.microsoft.com/office/drawing/2015/9/8/chartex" xmlns:cx2="http://schemas.microsoft.com/office/drawing/2015/10/21/chartex" xmlns:cx3="http://schemas.microsoft.com/office/drawing/2016/5/9/chartex" xmlns:cx4="http://schemas.microsoft.com/office/drawing/2016/5/10/chartex" xmlns:cx5="http://schemas.microsoft.com/office/drawing/2016/5/11/chartex" xmlns:cx6="http://schemas.microsoft.com/office/drawing/2016/5/12/chartex" xmlns:cx7="http://schemas.microsoft.com/office/drawing/2016/5/13/chartex" xmlns:cx8="http://schemas.microsoft.com/office/drawing/2016/5/14/chartex" xmlns:mc="http://schemas.openxmlformats.org/markup-compatibility/2006" xmlns:aink="http://schemas.microsoft.com/office/drawing/2016/ink" xmlns:am3d="http://schemas.microsoft.com/office/drawing/2017/model3d" xmlns:o="urn:schemas-microsoft-com:office:office" xmlns:oel="http://schemas.microsoft.com/office/2019/extlst" xmlns:r="http://schemas.openxmlformats.org/officeDocument/2006/relationships" xmlns:m="http://schemas.openxmlformats.org/officeDocument/2006/math" xmlns:v="urn:schemas-microsoft-com:vml" xmlns:wp14="http://schemas.microsoft.com/office/word/2010/wordprocessingDrawing" xmlns:wp="http://schemas.openxmlformats.org/drawingml/2006/wordprocessingDrawing" xmlns:w10="urn:schemas-microsoft-com:office:word" xmlns:w="http://schemas.openxmlformats.org/wordprocessingml/2006/main" xmlns:w14="http://schemas.microsoft.com/office/word/2010/wordml" xmlns:w15="http://schemas.microsoft.com/office/word/2012/wordml" xmlns:w16cex="http://schemas.microsoft.com/office/word/2018/wordml/cex" xmlns:w16cid="http://schemas.microsoft.com/office/word/2016/wordml/cid" xmlns:w16="http://schemas.microsoft.com/office/word/2018/wordml" xmlns:w16du="http://schemas.microsoft.com/office/word/2023/wordml/word16du" xmlns:w16sdtdh="http://schemas.microsoft.com/office/word/2020/wordml/sdtdatahash" xmlns:w16sdtfl="http://schemas.microsoft.com/office/word/2024/wordml/sdtformatlock" xmlns:w16se="http://schemas.microsoft.com/office/word/2015/wordml/symex" xmlns:wpg="http://schemas.microsoft.com/office/word/2010/wordprocessingGroup" xmlns:wpi="http://schemas.microsoft.com/office/word/2010/wordprocessingInk" xmlns:wne="http://schemas.microsoft.com/office/word/2006/wordml" xmlns:wps="http://schemas.microsoft.com/office/word/2010/wordprocessingShape" mc:Ignorable="w14 w15 w16se w16cid w16 w16cex w16sdtdh w16sdtfl w16du wp14">
   <w:p>
     <w:pPr>
       <w:pStyle w:val="Footer"/>
@@ -4652,24 +5000,14 @@
     <w:r>
       <w:t>0</w:t>
     </w:r>
-    <w:proofErr w:type="gramStart"/>
     <w:r>
       <w:rPr>
         <w:rStyle w:val="FooterChar"/>
       </w:rPr>
-      <w:t xml:space="preserve">   (</w:t>
-    </w:r>
-    <w:proofErr w:type="gramEnd"/>
-    <w:r>
-      <w:rPr>
-        <w:rStyle w:val="FooterChar"/>
-      </w:rPr>
-      <w:t>Template Version 1.3)</w:t>
+      <w:t xml:space="preserve">   (Template Version 1.3)</w:t>
     </w:r>
     <w:r>
       <w:tab/>
-    </w:r>
-    <w:r>
       <w:t xml:space="preserve">Last saved </w:t>
     </w:r>
     <w:r>
@@ -4685,15 +5023,13 @@
       <w:rPr>
         <w:noProof/>
       </w:rPr>
-      <w:t>13 October 2026</w:t>
+      <w:t>14 October 2026</w:t>
     </w:r>
     <w:r>
       <w:fldChar w:fldCharType="end"/>
     </w:r>
     <w:r>
       <w:tab/>
-    </w:r>
-    <w:r>
       <w:t xml:space="preserve">Page </w:t>
     </w:r>
     <w:r>
@@ -4717,30 +5053,20 @@
     <w:r>
       <w:t xml:space="preserve"> of </w:t>
     </w:r>
-    <w:r>
-      <w:fldChar w:fldCharType="begin"/>
-    </w:r>
-    <w:r>
-      <w:instrText>NUMPAGES   \* MERGEFORMAT</w:instrText>
-    </w:r>
-    <w:r>
-      <w:fldChar w:fldCharType="separate"/>
-    </w:r>
-    <w:r>
-      <w:rPr>
-        <w:noProof/>
-      </w:rPr>
-      <w:t>3</w:t>
-    </w:r>
-    <w:r>
-      <w:fldChar w:fldCharType="end"/>
-    </w:r>
+    <w:fldSimple w:instr="NUMPAGES   \* MERGEFORMAT">
+      <w:r>
+        <w:rPr>
+          <w:noProof/>
+        </w:rPr>
+        <w:t>3</w:t>
+      </w:r>
+    </w:fldSimple>
   </w:p>
 </w:ftr>
 </file>
 
 <file path=word/footnotes.xml><?xml version="1.0" encoding="utf-8"?>
-<w:footnotes xmlns:wpc="http://schemas.microsoft.com/office/word/2010/wordprocessingCanvas" xmlns:cx="http://schemas.microsoft.com/office/drawing/2014/chartex" xmlns:cx1="http://schemas.microsoft.com/office/drawing/2015/9/8/chartex" xmlns:cx2="http://schemas.microsoft.com/office/drawing/2015/10/21/chartex" xmlns:cx3="http://schemas.microsoft.com/office/drawing/2016/5/9/chartex" xmlns:cx4="http://schemas.microsoft.com/office/drawing/2016/5/10/chartex" xmlns:cx5="http://schemas.microsoft.com/office/drawing/2016/5/11/chartex" xmlns:cx6="http://schemas.microsoft.com/office/drawing/2016/5/12/chartex" xmlns:cx7="http://schemas.microsoft.com/office/drawing/2016/5/13/chartex" xmlns:cx8="http://schemas.microsoft.com/office/drawing/2016/5/14/chartex" xmlns:mc="http://schemas.openxmlformats.org/markup-compatibility/2006" xmlns:m="http://schemas.openxmlformats.org/officeDocument/2006/math" xmlns:aink="http://schemas.microsoft.com/office/drawing/2016/ink" xmlns:am3d="http://schemas.microsoft.com/office/drawing/2017/model3d" xmlns:oel="http://schemas.microsoft.com/office/2019/extlst" xmlns:r="http://schemas.openxmlformats.org/officeDocument/2006/relationships" xmlns:wp14="http://schemas.microsoft.com/office/word/2010/wordprocessingDrawing" xmlns:wp="http://schemas.openxmlformats.org/drawingml/2006/wordprocessingDrawing" xmlns:wpg="http://schemas.microsoft.com/office/word/2010/wordprocessingGroup" xmlns:wpi="http://schemas.microsoft.com/office/word/2010/wordprocessingInk" xmlns:wps="http://schemas.microsoft.com/office/word/2010/wordprocessingShape" xmlns:o="urn:schemas-microsoft-com:office:office" xmlns:v="urn:schemas-microsoft-com:vml" xmlns:w10="urn:schemas-microsoft-com:office:word" xmlns:w="http://schemas.openxmlformats.org/wordprocessingml/2006/main" xmlns:w14="http://schemas.microsoft.com/office/word/2010/wordml" xmlns:w15="http://schemas.microsoft.com/office/word/2012/wordml" xmlns:w16cex="http://schemas.microsoft.com/office/word/2018/wordml/cex" xmlns:w16cid="http://schemas.microsoft.com/office/word/2016/wordml/cid" xmlns:w16="http://schemas.microsoft.com/office/word/2018/wordml" xmlns:w16sdtdh="http://schemas.microsoft.com/office/word/2020/wordml/sdtdatahash" xmlns:w16sdtfl="http://schemas.microsoft.com/office/word/2024/wordml/sdtformatlock" xmlns:w16se="http://schemas.microsoft.com/office/word/2015/wordml/symex" xmlns:w16du="http://schemas.microsoft.com/office/word/2023/wordml/word16du" xmlns:wne="http://schemas.microsoft.com/office/word/2006/wordml" mc:Ignorable="w14 w15 w16se w16cid w16 w16cex w16sdtdh w16sdtfl w16du wp14">
+<w:footnotes xmlns:wpc="http://schemas.microsoft.com/office/word/2010/wordprocessingCanvas" xmlns:cx="http://schemas.microsoft.com/office/drawing/2014/chartex" xmlns:cx1="http://schemas.microsoft.com/office/drawing/2015/9/8/chartex" xmlns:cx2="http://schemas.microsoft.com/office/drawing/2015/10/21/chartex" xmlns:cx3="http://schemas.microsoft.com/office/drawing/2016/5/9/chartex" xmlns:cx4="http://schemas.microsoft.com/office/drawing/2016/5/10/chartex" xmlns:cx5="http://schemas.microsoft.com/office/drawing/2016/5/11/chartex" xmlns:cx6="http://schemas.microsoft.com/office/drawing/2016/5/12/chartex" xmlns:cx7="http://schemas.microsoft.com/office/drawing/2016/5/13/chartex" xmlns:cx8="http://schemas.microsoft.com/office/drawing/2016/5/14/chartex" xmlns:mc="http://schemas.openxmlformats.org/markup-compatibility/2006" xmlns:aink="http://schemas.microsoft.com/office/drawing/2016/ink" xmlns:am3d="http://schemas.microsoft.com/office/drawing/2017/model3d" xmlns:o="urn:schemas-microsoft-com:office:office" xmlns:oel="http://schemas.microsoft.com/office/2019/extlst" xmlns:r="http://schemas.openxmlformats.org/officeDocument/2006/relationships" xmlns:m="http://schemas.openxmlformats.org/officeDocument/2006/math" xmlns:v="urn:schemas-microsoft-com:vml" xmlns:wp14="http://schemas.microsoft.com/office/word/2010/wordprocessingDrawing" xmlns:wp="http://schemas.openxmlformats.org/drawingml/2006/wordprocessingDrawing" xmlns:w10="urn:schemas-microsoft-com:office:word" xmlns:w="http://schemas.openxmlformats.org/wordprocessingml/2006/main" xmlns:w14="http://schemas.microsoft.com/office/word/2010/wordml" xmlns:w15="http://schemas.microsoft.com/office/word/2012/wordml" xmlns:w16cex="http://schemas.microsoft.com/office/word/2018/wordml/cex" xmlns:w16cid="http://schemas.microsoft.com/office/word/2016/wordml/cid" xmlns:w16="http://schemas.microsoft.com/office/word/2018/wordml" xmlns:w16du="http://schemas.microsoft.com/office/word/2023/wordml/word16du" xmlns:w16sdtdh="http://schemas.microsoft.com/office/word/2020/wordml/sdtdatahash" xmlns:w16sdtfl="http://schemas.microsoft.com/office/word/2024/wordml/sdtformatlock" xmlns:w16se="http://schemas.microsoft.com/office/word/2015/wordml/symex" xmlns:wpg="http://schemas.microsoft.com/office/word/2010/wordprocessingGroup" xmlns:wpi="http://schemas.microsoft.com/office/word/2010/wordprocessingInk" xmlns:wne="http://schemas.microsoft.com/office/word/2006/wordml" xmlns:wps="http://schemas.microsoft.com/office/word/2010/wordprocessingShape" mc:Ignorable="w14 w15 w16se w16cid w16 w16cex w16sdtdh w16sdtfl w16du wp14">
   <w:footnote w:type="separator" w:id="-1">
     <w:p>
       <w:r>
@@ -4759,7 +5085,7 @@
 </file>
 
 <file path=word/header1.xml><?xml version="1.0" encoding="utf-8"?>
-<w:hdr xmlns:wpc="http://schemas.microsoft.com/office/word/2010/wordprocessingCanvas" xmlns:cx="http://schemas.microsoft.com/office/drawing/2014/chartex" xmlns:cx1="http://schemas.microsoft.com/office/drawing/2015/9/8/chartex" xmlns:cx2="http://schemas.microsoft.com/office/drawing/2015/10/21/chartex" xmlns:cx3="http://schemas.microsoft.com/office/drawing/2016/5/9/chartex" xmlns:cx4="http://schemas.microsoft.com/office/drawing/2016/5/10/chartex" xmlns:cx5="http://schemas.microsoft.com/office/drawing/2016/5/11/chartex" xmlns:cx6="http://schemas.microsoft.com/office/drawing/2016/5/12/chartex" xmlns:cx7="http://schemas.microsoft.com/office/drawing/2016/5/13/chartex" xmlns:cx8="http://schemas.microsoft.com/office/drawing/2016/5/14/chartex" xmlns:mc="http://schemas.openxmlformats.org/markup-compatibility/2006" xmlns:m="http://schemas.openxmlformats.org/officeDocument/2006/math" xmlns:aink="http://schemas.microsoft.com/office/drawing/2016/ink" xmlns:am3d="http://schemas.microsoft.com/office/drawing/2017/model3d" xmlns:oel="http://schemas.microsoft.com/office/2019/extlst" xmlns:r="http://schemas.openxmlformats.org/officeDocument/2006/relationships" xmlns:wp14="http://schemas.microsoft.com/office/word/2010/wordprocessingDrawing" xmlns:wp="http://schemas.openxmlformats.org/drawingml/2006/wordprocessingDrawing" xmlns:wpg="http://schemas.microsoft.com/office/word/2010/wordprocessingGroup" xmlns:wpi="http://schemas.microsoft.com/office/word/2010/wordprocessingInk" xmlns:wps="http://schemas.microsoft.com/office/word/2010/wordprocessingShape" xmlns:o="urn:schemas-microsoft-com:office:office" xmlns:v="urn:schemas-microsoft-com:vml" xmlns:w10="urn:schemas-microsoft-com:office:word" xmlns:w="http://schemas.openxmlformats.org/wordprocessingml/2006/main" xmlns:w14="http://schemas.microsoft.com/office/word/2010/wordml" xmlns:w15="http://schemas.microsoft.com/office/word/2012/wordml" xmlns:w16cex="http://schemas.microsoft.com/office/word/2018/wordml/cex" xmlns:w16cid="http://schemas.microsoft.com/office/word/2016/wordml/cid" xmlns:w16="http://schemas.microsoft.com/office/word/2018/wordml" xmlns:w16sdtdh="http://schemas.microsoft.com/office/word/2020/wordml/sdtdatahash" xmlns:w16sdtfl="http://schemas.microsoft.com/office/word/2024/wordml/sdtformatlock" xmlns:w16se="http://schemas.microsoft.com/office/word/2015/wordml/symex" xmlns:w16du="http://schemas.microsoft.com/office/word/2023/wordml/word16du" xmlns:wne="http://schemas.microsoft.com/office/word/2006/wordml" xmlns:a="http://schemas.openxmlformats.org/drawingml/2006/main" xmlns:aclsh="http://schemas.microsoft.com/office/drawing/2020/classificationShape" mc:Ignorable="w14 w15 w16se w16cid w16 w16cex w16sdtdh w16sdtfl w16du wp14">
+<w:hdr xmlns:wpc="http://schemas.microsoft.com/office/word/2010/wordprocessingCanvas" xmlns:cx="http://schemas.microsoft.com/office/drawing/2014/chartex" xmlns:cx1="http://schemas.microsoft.com/office/drawing/2015/9/8/chartex" xmlns:cx2="http://schemas.microsoft.com/office/drawing/2015/10/21/chartex" xmlns:cx3="http://schemas.microsoft.com/office/drawing/2016/5/9/chartex" xmlns:cx4="http://schemas.microsoft.com/office/drawing/2016/5/10/chartex" xmlns:cx5="http://schemas.microsoft.com/office/drawing/2016/5/11/chartex" xmlns:cx6="http://schemas.microsoft.com/office/drawing/2016/5/12/chartex" xmlns:cx7="http://schemas.microsoft.com/office/drawing/2016/5/13/chartex" xmlns:cx8="http://schemas.microsoft.com/office/drawing/2016/5/14/chartex" xmlns:mc="http://schemas.openxmlformats.org/markup-compatibility/2006" xmlns:aink="http://schemas.microsoft.com/office/drawing/2016/ink" xmlns:am3d="http://schemas.microsoft.com/office/drawing/2017/model3d" xmlns:o="urn:schemas-microsoft-com:office:office" xmlns:oel="http://schemas.microsoft.com/office/2019/extlst" xmlns:r="http://schemas.openxmlformats.org/officeDocument/2006/relationships" xmlns:m="http://schemas.openxmlformats.org/officeDocument/2006/math" xmlns:v="urn:schemas-microsoft-com:vml" xmlns:wp14="http://schemas.microsoft.com/office/word/2010/wordprocessingDrawing" xmlns:wp="http://schemas.openxmlformats.org/drawingml/2006/wordprocessingDrawing" xmlns:w10="urn:schemas-microsoft-com:office:word" xmlns:w="http://schemas.openxmlformats.org/wordprocessingml/2006/main" xmlns:w14="http://schemas.microsoft.com/office/word/2010/wordml" xmlns:w15="http://schemas.microsoft.com/office/word/2012/wordml" xmlns:w16cex="http://schemas.microsoft.com/office/word/2018/wordml/cex" xmlns:w16cid="http://schemas.microsoft.com/office/word/2016/wordml/cid" xmlns:w16="http://schemas.microsoft.com/office/word/2018/wordml" xmlns:w16du="http://schemas.microsoft.com/office/word/2023/wordml/word16du" xmlns:w16sdtdh="http://schemas.microsoft.com/office/word/2020/wordml/sdtdatahash" xmlns:w16sdtfl="http://schemas.microsoft.com/office/word/2024/wordml/sdtformatlock" xmlns:w16se="http://schemas.microsoft.com/office/word/2015/wordml/symex" xmlns:wpg="http://schemas.microsoft.com/office/word/2010/wordprocessingGroup" xmlns:wpi="http://schemas.microsoft.com/office/word/2010/wordprocessingInk" xmlns:wne="http://schemas.microsoft.com/office/word/2006/wordml" xmlns:wps="http://schemas.microsoft.com/office/word/2010/wordprocessingShape" mc:Ignorable="w14 w15 w16se w16cid w16 w16cex w16sdtdh w16sdtfl w16du wp14">
   <w:p>
     <w:pPr>
       <w:pStyle w:val="Header"/>
@@ -4812,7 +5138,7 @@
                         <w:p>
                           <w:pPr>
                             <w:rPr>
-                              <w:rFonts w:ascii="Aptos" w:hAnsi="Aptos" w:eastAsia="Aptos" w:cs="Aptos"/>
+                              <w:rFonts w:ascii="Aptos" w:eastAsia="Aptos" w:hAnsi="Aptos" w:cs="Aptos"/>
                               <w:noProof/>
                               <w:color w:val="FF0000"/>
                               <w:sz w:val="24"/>
@@ -4821,7 +5147,7 @@
                           </w:pPr>
                           <w:r>
                             <w:rPr>
-                              <w:rFonts w:ascii="Aptos" w:hAnsi="Aptos" w:eastAsia="Aptos" w:cs="Aptos"/>
+                              <w:rFonts w:ascii="Aptos" w:eastAsia="Aptos" w:hAnsi="Aptos" w:cs="Aptos"/>
                               <w:noProof/>
                               <w:color w:val="FF0000"/>
                               <w:sz w:val="24"/>
@@ -4845,19 +5171,18 @@
           </w:drawing>
         </mc:Choice>
         <mc:Fallback>
-          <w:pict w14:anchorId="25E2686B">
-            <v:shapetype id="_x0000_t202" coordsize="21600,21600" o:spt="202" path="m,l,21600r21600,l21600,xe" w14:anchorId="4AB0EF23">
+          <w:pict>
+            <v:shapetype w14:anchorId="4AB0EF23" id="_x0000_t202" coordsize="21600,21600" o:spt="202" path="m,l,21600r21600,l21600,xe">
               <v:stroke joinstyle="miter"/>
               <v:path gradientshapeok="t" o:connecttype="rect"/>
             </v:shapetype>
-            <v:shape id="Text Box 8" style="position:absolute;margin-left:0;margin-top:0;width:49pt;height:29.65pt;z-index:251659264;visibility:visible;mso-wrap-style:none;mso-wrap-distance-left:0;mso-wrap-distance-top:0;mso-wrap-distance-right:0;mso-wrap-distance-bottom:0;mso-position-horizontal:center;mso-position-horizontal-relative:page;mso-position-vertical:top;mso-position-vertical-relative:page;v-text-anchor:top" alt="OFFICIAL" o:spid="_x0000_s1026" filled="f" stroked="f" type="#_x0000_t202" o:gfxdata="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">
-              <v:fill o:detectmouseclick="t"/>
+            <v:shape id="Text Box 8" o:spid="_x0000_s1026" type="#_x0000_t202" alt="OFFICIAL" style="position:absolute;margin-left:0;margin-top:0;width:49pt;height:29.65pt;z-index:251659264;visibility:visible;mso-wrap-style:none;mso-wrap-distance-left:0;mso-wrap-distance-top:0;mso-wrap-distance-right:0;mso-wrap-distance-bottom:0;mso-position-horizontal:center;mso-position-horizontal-relative:page;mso-position-vertical:top;mso-position-vertical-relative:page;v-text-anchor:top" o:gfxdata="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" filled="f" stroked="f">
               <v:textbox style="mso-fit-shape-to-text:t" inset="0,15pt,0,0">
                 <w:txbxContent>
                   <w:p>
                     <w:pPr>
                       <w:rPr>
-                        <w:rFonts w:ascii="Aptos" w:hAnsi="Aptos" w:eastAsia="Aptos" w:cs="Aptos"/>
+                        <w:rFonts w:ascii="Aptos" w:eastAsia="Aptos" w:hAnsi="Aptos" w:cs="Aptos"/>
                         <w:noProof/>
                         <w:color w:val="FF0000"/>
                         <w:sz w:val="24"/>
@@ -4866,7 +5191,7 @@
                     </w:pPr>
                     <w:r>
                       <w:rPr>
-                        <w:rFonts w:ascii="Aptos" w:hAnsi="Aptos" w:eastAsia="Aptos" w:cs="Aptos"/>
+                        <w:rFonts w:ascii="Aptos" w:eastAsia="Aptos" w:hAnsi="Aptos" w:cs="Aptos"/>
                         <w:noProof/>
                         <w:color w:val="FF0000"/>
                         <w:sz w:val="24"/>
@@ -4888,7 +5213,7 @@
 </file>
 
 <file path=word/header2.xml><?xml version="1.0" encoding="utf-8"?>
-<w:hdr xmlns:wpc="http://schemas.microsoft.com/office/word/2010/wordprocessingCanvas" xmlns:cx="http://schemas.microsoft.com/office/drawing/2014/chartex" xmlns:cx1="http://schemas.microsoft.com/office/drawing/2015/9/8/chartex" xmlns:cx2="http://schemas.microsoft.com/office/drawing/2015/10/21/chartex" xmlns:cx3="http://schemas.microsoft.com/office/drawing/2016/5/9/chartex" xmlns:cx4="http://schemas.microsoft.com/office/drawing/2016/5/10/chartex" xmlns:cx5="http://schemas.microsoft.com/office/drawing/2016/5/11/chartex" xmlns:cx6="http://schemas.microsoft.com/office/drawing/2016/5/12/chartex" xmlns:cx7="http://schemas.microsoft.com/office/drawing/2016/5/13/chartex" xmlns:cx8="http://schemas.microsoft.com/office/drawing/2016/5/14/chartex" xmlns:mc="http://schemas.openxmlformats.org/markup-compatibility/2006" xmlns:m="http://schemas.openxmlformats.org/officeDocument/2006/math" xmlns:aink="http://schemas.microsoft.com/office/drawing/2016/ink" xmlns:am3d="http://schemas.microsoft.com/office/drawing/2017/model3d" xmlns:oel="http://schemas.microsoft.com/office/2019/extlst" xmlns:r="http://schemas.openxmlformats.org/officeDocument/2006/relationships" xmlns:wp14="http://schemas.microsoft.com/office/word/2010/wordprocessingDrawing" xmlns:wp="http://schemas.openxmlformats.org/drawingml/2006/wordprocessingDrawing" xmlns:wpg="http://schemas.microsoft.com/office/word/2010/wordprocessingGroup" xmlns:wpi="http://schemas.microsoft.com/office/word/2010/wordprocessingInk" xmlns:wps="http://schemas.microsoft.com/office/word/2010/wordprocessingShape" xmlns:o="urn:schemas-microsoft-com:office:office" xmlns:v="urn:schemas-microsoft-com:vml" xmlns:w10="urn:schemas-microsoft-com:office:word" xmlns:w="http://schemas.openxmlformats.org/wordprocessingml/2006/main" xmlns:w14="http://schemas.microsoft.com/office/word/2010/wordml" xmlns:w15="http://schemas.microsoft.com/office/word/2012/wordml" xmlns:w16cex="http://schemas.microsoft.com/office/word/2018/wordml/cex" xmlns:w16cid="http://schemas.microsoft.com/office/word/2016/wordml/cid" xmlns:w16="http://schemas.microsoft.com/office/word/2018/wordml" xmlns:w16sdtdh="http://schemas.microsoft.com/office/word/2020/wordml/sdtdatahash" xmlns:w16sdtfl="http://schemas.microsoft.com/office/word/2024/wordml/sdtformatlock" xmlns:w16se="http://schemas.microsoft.com/office/word/2015/wordml/symex" xmlns:w16du="http://schemas.microsoft.com/office/word/2023/wordml/word16du" xmlns:wne="http://schemas.microsoft.com/office/word/2006/wordml" xmlns:a="http://schemas.openxmlformats.org/drawingml/2006/main" xmlns:aclsh="http://schemas.microsoft.com/office/drawing/2020/classificationShape" mc:Ignorable="w14 w15 w16se w16cid w16 w16cex w16sdtdh w16sdtfl w16du wp14">
+<w:hdr xmlns:wpc="http://schemas.microsoft.com/office/word/2010/wordprocessingCanvas" xmlns:cx="http://schemas.microsoft.com/office/drawing/2014/chartex" xmlns:cx1="http://schemas.microsoft.com/office/drawing/2015/9/8/chartex" xmlns:cx2="http://schemas.microsoft.com/office/drawing/2015/10/21/chartex" xmlns:cx3="http://schemas.microsoft.com/office/drawing/2016/5/9/chartex" xmlns:cx4="http://schemas.microsoft.com/office/drawing/2016/5/10/chartex" xmlns:cx5="http://schemas.microsoft.com/office/drawing/2016/5/11/chartex" xmlns:cx6="http://schemas.microsoft.com/office/drawing/2016/5/12/chartex" xmlns:cx7="http://schemas.microsoft.com/office/drawing/2016/5/13/chartex" xmlns:cx8="http://schemas.microsoft.com/office/drawing/2016/5/14/chartex" xmlns:mc="http://schemas.openxmlformats.org/markup-compatibility/2006" xmlns:aink="http://schemas.microsoft.com/office/drawing/2016/ink" xmlns:am3d="http://schemas.microsoft.com/office/drawing/2017/model3d" xmlns:o="urn:schemas-microsoft-com:office:office" xmlns:oel="http://schemas.microsoft.com/office/2019/extlst" xmlns:r="http://schemas.openxmlformats.org/officeDocument/2006/relationships" xmlns:m="http://schemas.openxmlformats.org/officeDocument/2006/math" xmlns:v="urn:schemas-microsoft-com:vml" xmlns:wp14="http://schemas.microsoft.com/office/word/2010/wordprocessingDrawing" xmlns:wp="http://schemas.openxmlformats.org/drawingml/2006/wordprocessingDrawing" xmlns:w10="urn:schemas-microsoft-com:office:word" xmlns:w="http://schemas.openxmlformats.org/wordprocessingml/2006/main" xmlns:w14="http://schemas.microsoft.com/office/word/2010/wordml" xmlns:w15="http://schemas.microsoft.com/office/word/2012/wordml" xmlns:w16cex="http://schemas.microsoft.com/office/word/2018/wordml/cex" xmlns:w16cid="http://schemas.microsoft.com/office/word/2016/wordml/cid" xmlns:w16="http://schemas.microsoft.com/office/word/2018/wordml" xmlns:w16du="http://schemas.microsoft.com/office/word/2023/wordml/word16du" xmlns:w16sdtdh="http://schemas.microsoft.com/office/word/2020/wordml/sdtdatahash" xmlns:w16sdtfl="http://schemas.microsoft.com/office/word/2024/wordml/sdtformatlock" xmlns:w16se="http://schemas.microsoft.com/office/word/2015/wordml/symex" xmlns:wpg="http://schemas.microsoft.com/office/word/2010/wordprocessingGroup" xmlns:wpi="http://schemas.microsoft.com/office/word/2010/wordprocessingInk" xmlns:wne="http://schemas.microsoft.com/office/word/2006/wordml" xmlns:wps="http://schemas.microsoft.com/office/word/2010/wordprocessingShape" mc:Ignorable="w14 w15 w16se w16cid w16 w16cex w16sdtdh w16sdtfl w16du wp14">
   <w:p>
     <w:pPr>
       <w:pStyle w:val="Header"/>
@@ -4941,7 +5266,7 @@
                         <w:p>
                           <w:pPr>
                             <w:rPr>
-                              <w:rFonts w:ascii="Aptos" w:hAnsi="Aptos" w:eastAsia="Aptos" w:cs="Aptos"/>
+                              <w:rFonts w:ascii="Aptos" w:eastAsia="Aptos" w:hAnsi="Aptos" w:cs="Aptos"/>
                               <w:noProof/>
                               <w:color w:val="FF0000"/>
                               <w:sz w:val="24"/>
@@ -4950,7 +5275,7 @@
                           </w:pPr>
                           <w:r>
                             <w:rPr>
-                              <w:rFonts w:ascii="Aptos" w:hAnsi="Aptos" w:eastAsia="Aptos" w:cs="Aptos"/>
+                              <w:rFonts w:ascii="Aptos" w:eastAsia="Aptos" w:hAnsi="Aptos" w:cs="Aptos"/>
                               <w:noProof/>
                               <w:color w:val="FF0000"/>
                               <w:sz w:val="24"/>
@@ -4974,19 +5299,18 @@
           </w:drawing>
         </mc:Choice>
         <mc:Fallback>
-          <w:pict w14:anchorId="1C0EFFAF">
-            <v:shapetype id="_x0000_t202" coordsize="21600,21600" o:spt="202" path="m,l,21600r21600,l21600,xe" w14:anchorId="35B3EAA5">
+          <w:pict>
+            <v:shapetype w14:anchorId="35B3EAA5" id="_x0000_t202" coordsize="21600,21600" o:spt="202" path="m,l,21600r21600,l21600,xe">
               <v:stroke joinstyle="miter"/>
               <v:path gradientshapeok="t" o:connecttype="rect"/>
             </v:shapetype>
-            <v:shape id="Text Box 9" style="position:absolute;margin-left:0;margin-top:0;width:49pt;height:29.65pt;z-index:251660288;visibility:visible;mso-wrap-style:none;mso-wrap-distance-left:0;mso-wrap-distance-top:0;mso-wrap-distance-right:0;mso-wrap-distance-bottom:0;mso-position-horizontal:center;mso-position-horizontal-relative:page;mso-position-vertical:top;mso-position-vertical-relative:page;v-text-anchor:top" alt="OFFICIAL" o:spid="_x0000_s1027" filled="f" stroked="f" type="#_x0000_t202" o:gfxdata="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">
-              <v:fill o:detectmouseclick="t"/>
+            <v:shape id="Text Box 9" o:spid="_x0000_s1027" type="#_x0000_t202" alt="OFFICIAL" style="position:absolute;margin-left:0;margin-top:0;width:49pt;height:29.65pt;z-index:251660288;visibility:visible;mso-wrap-style:none;mso-wrap-distance-left:0;mso-wrap-distance-top:0;mso-wrap-distance-right:0;mso-wrap-distance-bottom:0;mso-position-horizontal:center;mso-position-horizontal-relative:page;mso-position-vertical:top;mso-position-vertical-relative:page;v-text-anchor:top" o:gfxdata="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" filled="f" stroked="f">
               <v:textbox style="mso-fit-shape-to-text:t" inset="0,15pt,0,0">
                 <w:txbxContent>
                   <w:p>
                     <w:pPr>
                       <w:rPr>
-                        <w:rFonts w:ascii="Aptos" w:hAnsi="Aptos" w:eastAsia="Aptos" w:cs="Aptos"/>
+                        <w:rFonts w:ascii="Aptos" w:eastAsia="Aptos" w:hAnsi="Aptos" w:cs="Aptos"/>
                         <w:noProof/>
                         <w:color w:val="FF0000"/>
                         <w:sz w:val="24"/>
@@ -4995,7 +5319,7 @@
                     </w:pPr>
                     <w:r>
                       <w:rPr>
-                        <w:rFonts w:ascii="Aptos" w:hAnsi="Aptos" w:eastAsia="Aptos" w:cs="Aptos"/>
+                        <w:rFonts w:ascii="Aptos" w:eastAsia="Aptos" w:hAnsi="Aptos" w:cs="Aptos"/>
                         <w:noProof/>
                         <w:color w:val="FF0000"/>
                         <w:sz w:val="24"/>
@@ -5020,7 +5344,7 @@
 </file>
 
 <file path=word/header3.xml><?xml version="1.0" encoding="utf-8"?>
-<w:hdr xmlns:wpc="http://schemas.microsoft.com/office/word/2010/wordprocessingCanvas" xmlns:cx="http://schemas.microsoft.com/office/drawing/2014/chartex" xmlns:cx1="http://schemas.microsoft.com/office/drawing/2015/9/8/chartex" xmlns:cx2="http://schemas.microsoft.com/office/drawing/2015/10/21/chartex" xmlns:cx3="http://schemas.microsoft.com/office/drawing/2016/5/9/chartex" xmlns:cx4="http://schemas.microsoft.com/office/drawing/2016/5/10/chartex" xmlns:cx5="http://schemas.microsoft.com/office/drawing/2016/5/11/chartex" xmlns:cx6="http://schemas.microsoft.com/office/drawing/2016/5/12/chartex" xmlns:cx7="http://schemas.microsoft.com/office/drawing/2016/5/13/chartex" xmlns:cx8="http://schemas.microsoft.com/office/drawing/2016/5/14/chartex" xmlns:mc="http://schemas.openxmlformats.org/markup-compatibility/2006" xmlns:m="http://schemas.openxmlformats.org/officeDocument/2006/math" xmlns:aink="http://schemas.microsoft.com/office/drawing/2016/ink" xmlns:am3d="http://schemas.microsoft.com/office/drawing/2017/model3d" xmlns:oel="http://schemas.microsoft.com/office/2019/extlst" xmlns:r="http://schemas.openxmlformats.org/officeDocument/2006/relationships" xmlns:wp14="http://schemas.microsoft.com/office/word/2010/wordprocessingDrawing" xmlns:wp="http://schemas.openxmlformats.org/drawingml/2006/wordprocessingDrawing" xmlns:wpg="http://schemas.microsoft.com/office/word/2010/wordprocessingGroup" xmlns:wpi="http://schemas.microsoft.com/office/word/2010/wordprocessingInk" xmlns:wps="http://schemas.microsoft.com/office/word/2010/wordprocessingShape" xmlns:o="urn:schemas-microsoft-com:office:office" xmlns:v="urn:schemas-microsoft-com:vml" xmlns:w10="urn:schemas-microsoft-com:office:word" xmlns:w="http://schemas.openxmlformats.org/wordprocessingml/2006/main" xmlns:w14="http://schemas.microsoft.com/office/word/2010/wordml" xmlns:w15="http://schemas.microsoft.com/office/word/2012/wordml" xmlns:w16cex="http://schemas.microsoft.com/office/word/2018/wordml/cex" xmlns:w16cid="http://schemas.microsoft.com/office/word/2016/wordml/cid" xmlns:w16="http://schemas.microsoft.com/office/word/2018/wordml" xmlns:w16sdtdh="http://schemas.microsoft.com/office/word/2020/wordml/sdtdatahash" xmlns:w16sdtfl="http://schemas.microsoft.com/office/word/2024/wordml/sdtformatlock" xmlns:w16se="http://schemas.microsoft.com/office/word/2015/wordml/symex" xmlns:w16du="http://schemas.microsoft.com/office/word/2023/wordml/word16du" xmlns:wne="http://schemas.microsoft.com/office/word/2006/wordml" xmlns:a="http://schemas.openxmlformats.org/drawingml/2006/main" xmlns:aclsh="http://schemas.microsoft.com/office/drawing/2020/classificationShape" mc:Ignorable="w14 w15 w16se w16cid w16 w16cex w16sdtdh w16sdtfl w16du wp14">
+<w:hdr xmlns:wpc="http://schemas.microsoft.com/office/word/2010/wordprocessingCanvas" xmlns:cx="http://schemas.microsoft.com/office/drawing/2014/chartex" xmlns:cx1="http://schemas.microsoft.com/office/drawing/2015/9/8/chartex" xmlns:cx2="http://schemas.microsoft.com/office/drawing/2015/10/21/chartex" xmlns:cx3="http://schemas.microsoft.com/office/drawing/2016/5/9/chartex" xmlns:cx4="http://schemas.microsoft.com/office/drawing/2016/5/10/chartex" xmlns:cx5="http://schemas.microsoft.com/office/drawing/2016/5/11/chartex" xmlns:cx6="http://schemas.microsoft.com/office/drawing/2016/5/12/chartex" xmlns:cx7="http://schemas.microsoft.com/office/drawing/2016/5/13/chartex" xmlns:cx8="http://schemas.microsoft.com/office/drawing/2016/5/14/chartex" xmlns:mc="http://schemas.openxmlformats.org/markup-compatibility/2006" xmlns:aink="http://schemas.microsoft.com/office/drawing/2016/ink" xmlns:am3d="http://schemas.microsoft.com/office/drawing/2017/model3d" xmlns:o="urn:schemas-microsoft-com:office:office" xmlns:oel="http://schemas.microsoft.com/office/2019/extlst" xmlns:r="http://schemas.openxmlformats.org/officeDocument/2006/relationships" xmlns:m="http://schemas.openxmlformats.org/officeDocument/2006/math" xmlns:v="urn:schemas-microsoft-com:vml" xmlns:wp14="http://schemas.microsoft.com/office/word/2010/wordprocessingDrawing" xmlns:wp="http://schemas.openxmlformats.org/drawingml/2006/wordprocessingDrawing" xmlns:w10="urn:schemas-microsoft-com:office:word" xmlns:w="http://schemas.openxmlformats.org/wordprocessingml/2006/main" xmlns:w14="http://schemas.microsoft.com/office/word/2010/wordml" xmlns:w15="http://schemas.microsoft.com/office/word/2012/wordml" xmlns:w16cex="http://schemas.microsoft.com/office/word/2018/wordml/cex" xmlns:w16cid="http://schemas.microsoft.com/office/word/2016/wordml/cid" xmlns:w16="http://schemas.microsoft.com/office/word/2018/wordml" xmlns:w16du="http://schemas.microsoft.com/office/word/2023/wordml/word16du" xmlns:w16sdtdh="http://schemas.microsoft.com/office/word/2020/wordml/sdtdatahash" xmlns:w16sdtfl="http://schemas.microsoft.com/office/word/2024/wordml/sdtformatlock" xmlns:w16se="http://schemas.microsoft.com/office/word/2015/wordml/symex" xmlns:wpg="http://schemas.microsoft.com/office/word/2010/wordprocessingGroup" xmlns:wpi="http://schemas.microsoft.com/office/word/2010/wordprocessingInk" xmlns:wne="http://schemas.microsoft.com/office/word/2006/wordml" xmlns:wps="http://schemas.microsoft.com/office/word/2010/wordprocessingShape" mc:Ignorable="w14 w15 w16se w16cid w16 w16cex w16sdtdh w16sdtfl w16du wp14">
   <w:p>
     <w:pPr>
       <w:pStyle w:val="Header"/>
@@ -5073,7 +5397,7 @@
                         <w:p>
                           <w:pPr>
                             <w:rPr>
-                              <w:rFonts w:ascii="Aptos" w:hAnsi="Aptos" w:eastAsia="Aptos" w:cs="Aptos"/>
+                              <w:rFonts w:ascii="Aptos" w:eastAsia="Aptos" w:hAnsi="Aptos" w:cs="Aptos"/>
                               <w:noProof/>
                               <w:color w:val="FF0000"/>
                               <w:sz w:val="24"/>
@@ -5082,7 +5406,7 @@
                           </w:pPr>
                           <w:r>
                             <w:rPr>
-                              <w:rFonts w:ascii="Aptos" w:hAnsi="Aptos" w:eastAsia="Aptos" w:cs="Aptos"/>
+                              <w:rFonts w:ascii="Aptos" w:eastAsia="Aptos" w:hAnsi="Aptos" w:cs="Aptos"/>
                               <w:noProof/>
                               <w:color w:val="FF0000"/>
                               <w:sz w:val="24"/>
@@ -5106,19 +5430,18 @@
           </w:drawing>
         </mc:Choice>
         <mc:Fallback>
-          <w:pict w14:anchorId="129381C4">
-            <v:shapetype id="_x0000_t202" coordsize="21600,21600" o:spt="202" path="m,l,21600r21600,l21600,xe" w14:anchorId="2035E531">
+          <w:pict>
+            <v:shapetype w14:anchorId="2035E531" id="_x0000_t202" coordsize="21600,21600" o:spt="202" path="m,l,21600r21600,l21600,xe">
               <v:stroke joinstyle="miter"/>
               <v:path gradientshapeok="t" o:connecttype="rect"/>
             </v:shapetype>
-            <v:shape id="Text Box 7" style="position:absolute;margin-left:0;margin-top:0;width:49pt;height:29.65pt;z-index:251658240;visibility:visible;mso-wrap-style:none;mso-wrap-distance-left:0;mso-wrap-distance-top:0;mso-wrap-distance-right:0;mso-wrap-distance-bottom:0;mso-position-horizontal:center;mso-position-horizontal-relative:page;mso-position-vertical:top;mso-position-vertical-relative:page;v-text-anchor:top" alt="OFFICIAL" o:spid="_x0000_s1028" filled="f" stroked="f" type="#_x0000_t202" o:gfxdata="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">
-              <v:fill o:detectmouseclick="t"/>
+            <v:shape id="Text Box 7" o:spid="_x0000_s1028" type="#_x0000_t202" alt="OFFICIAL" style="position:absolute;margin-left:0;margin-top:0;width:49pt;height:29.65pt;z-index:251658240;visibility:visible;mso-wrap-style:none;mso-wrap-distance-left:0;mso-wrap-distance-top:0;mso-wrap-distance-right:0;mso-wrap-distance-bottom:0;mso-position-horizontal:center;mso-position-horizontal-relative:page;mso-position-vertical:top;mso-position-vertical-relative:page;v-text-anchor:top" o:gfxdata="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" filled="f" stroked="f">
               <v:textbox style="mso-fit-shape-to-text:t" inset="0,15pt,0,0">
                 <w:txbxContent>
                   <w:p>
                     <w:pPr>
                       <w:rPr>
-                        <w:rFonts w:ascii="Aptos" w:hAnsi="Aptos" w:eastAsia="Aptos" w:cs="Aptos"/>
+                        <w:rFonts w:ascii="Aptos" w:eastAsia="Aptos" w:hAnsi="Aptos" w:cs="Aptos"/>
                         <w:noProof/>
                         <w:color w:val="FF0000"/>
                         <w:sz w:val="24"/>
@@ -5127,7 +5450,7 @@
                     </w:pPr>
                     <w:r>
                       <w:rPr>
-                        <w:rFonts w:ascii="Aptos" w:hAnsi="Aptos" w:eastAsia="Aptos" w:cs="Aptos"/>
+                        <w:rFonts w:ascii="Aptos" w:eastAsia="Aptos" w:hAnsi="Aptos" w:cs="Aptos"/>
                         <w:noProof/>
                         <w:color w:val="FF0000"/>
                         <w:sz w:val="24"/>
@@ -5149,7 +5472,7 @@
 </file>
 
 <file path=word/header4.xml><?xml version="1.0" encoding="utf-8"?>
-<w:hdr xmlns:wpc="http://schemas.microsoft.com/office/word/2010/wordprocessingCanvas" xmlns:cx="http://schemas.microsoft.com/office/drawing/2014/chartex" xmlns:cx1="http://schemas.microsoft.com/office/drawing/2015/9/8/chartex" xmlns:cx2="http://schemas.microsoft.com/office/drawing/2015/10/21/chartex" xmlns:cx3="http://schemas.microsoft.com/office/drawing/2016/5/9/chartex" xmlns:cx4="http://schemas.microsoft.com/office/drawing/2016/5/10/chartex" xmlns:cx5="http://schemas.microsoft.com/office/drawing/2016/5/11/chartex" xmlns:cx6="http://schemas.microsoft.com/office/drawing/2016/5/12/chartex" xmlns:cx7="http://schemas.microsoft.com/office/drawing/2016/5/13/chartex" xmlns:cx8="http://schemas.microsoft.com/office/drawing/2016/5/14/chartex" xmlns:mc="http://schemas.openxmlformats.org/markup-compatibility/2006" xmlns:m="http://schemas.openxmlformats.org/officeDocument/2006/math" xmlns:aink="http://schemas.microsoft.com/office/drawing/2016/ink" xmlns:am3d="http://schemas.microsoft.com/office/drawing/2017/model3d" xmlns:oel="http://schemas.microsoft.com/office/2019/extlst" xmlns:r="http://schemas.openxmlformats.org/officeDocument/2006/relationships" xmlns:wp14="http://schemas.microsoft.com/office/word/2010/wordprocessingDrawing" xmlns:wp="http://schemas.openxmlformats.org/drawingml/2006/wordprocessingDrawing" xmlns:wpg="http://schemas.microsoft.com/office/word/2010/wordprocessingGroup" xmlns:wpi="http://schemas.microsoft.com/office/word/2010/wordprocessingInk" xmlns:wps="http://schemas.microsoft.com/office/word/2010/wordprocessingShape" xmlns:o="urn:schemas-microsoft-com:office:office" xmlns:v="urn:schemas-microsoft-com:vml" xmlns:w10="urn:schemas-microsoft-com:office:word" xmlns:w="http://schemas.openxmlformats.org/wordprocessingml/2006/main" xmlns:w14="http://schemas.microsoft.com/office/word/2010/wordml" xmlns:w15="http://schemas.microsoft.com/office/word/2012/wordml" xmlns:w16cex="http://schemas.microsoft.com/office/word/2018/wordml/cex" xmlns:w16cid="http://schemas.microsoft.com/office/word/2016/wordml/cid" xmlns:w16="http://schemas.microsoft.com/office/word/2018/wordml" xmlns:w16sdtdh="http://schemas.microsoft.com/office/word/2020/wordml/sdtdatahash" xmlns:w16sdtfl="http://schemas.microsoft.com/office/word/2024/wordml/sdtformatlock" xmlns:w16se="http://schemas.microsoft.com/office/word/2015/wordml/symex" xmlns:w16du="http://schemas.microsoft.com/office/word/2023/wordml/word16du" xmlns:wne="http://schemas.microsoft.com/office/word/2006/wordml" xmlns:a="http://schemas.openxmlformats.org/drawingml/2006/main" xmlns:aclsh="http://schemas.microsoft.com/office/drawing/2020/classificationShape" mc:Ignorable="w14 w15 w16se w16cid w16 w16cex w16sdtdh w16sdtfl w16du wp14">
+<w:hdr xmlns:wpc="http://schemas.microsoft.com/office/word/2010/wordprocessingCanvas" xmlns:cx="http://schemas.microsoft.com/office/drawing/2014/chartex" xmlns:cx1="http://schemas.microsoft.com/office/drawing/2015/9/8/chartex" xmlns:cx2="http://schemas.microsoft.com/office/drawing/2015/10/21/chartex" xmlns:cx3="http://schemas.microsoft.com/office/drawing/2016/5/9/chartex" xmlns:cx4="http://schemas.microsoft.com/office/drawing/2016/5/10/chartex" xmlns:cx5="http://schemas.microsoft.com/office/drawing/2016/5/11/chartex" xmlns:cx6="http://schemas.microsoft.com/office/drawing/2016/5/12/chartex" xmlns:cx7="http://schemas.microsoft.com/office/drawing/2016/5/13/chartex" xmlns:cx8="http://schemas.microsoft.com/office/drawing/2016/5/14/chartex" xmlns:mc="http://schemas.openxmlformats.org/markup-compatibility/2006" xmlns:aink="http://schemas.microsoft.com/office/drawing/2016/ink" xmlns:am3d="http://schemas.microsoft.com/office/drawing/2017/model3d" xmlns:o="urn:schemas-microsoft-com:office:office" xmlns:oel="http://schemas.microsoft.com/office/2019/extlst" xmlns:r="http://schemas.openxmlformats.org/officeDocument/2006/relationships" xmlns:m="http://schemas.openxmlformats.org/officeDocument/2006/math" xmlns:v="urn:schemas-microsoft-com:vml" xmlns:wp14="http://schemas.microsoft.com/office/word/2010/wordprocessingDrawing" xmlns:wp="http://schemas.openxmlformats.org/drawingml/2006/wordprocessingDrawing" xmlns:w10="urn:schemas-microsoft-com:office:word" xmlns:w="http://schemas.openxmlformats.org/wordprocessingml/2006/main" xmlns:w14="http://schemas.microsoft.com/office/word/2010/wordml" xmlns:w15="http://schemas.microsoft.com/office/word/2012/wordml" xmlns:w16cex="http://schemas.microsoft.com/office/word/2018/wordml/cex" xmlns:w16cid="http://schemas.microsoft.com/office/word/2016/wordml/cid" xmlns:w16="http://schemas.microsoft.com/office/word/2018/wordml" xmlns:w16du="http://schemas.microsoft.com/office/word/2023/wordml/word16du" xmlns:w16sdtdh="http://schemas.microsoft.com/office/word/2020/wordml/sdtdatahash" xmlns:w16sdtfl="http://schemas.microsoft.com/office/word/2024/wordml/sdtformatlock" xmlns:w16se="http://schemas.microsoft.com/office/word/2015/wordml/symex" xmlns:wpg="http://schemas.microsoft.com/office/word/2010/wordprocessingGroup" xmlns:wpi="http://schemas.microsoft.com/office/word/2010/wordprocessingInk" xmlns:wne="http://schemas.microsoft.com/office/word/2006/wordml" xmlns:wps="http://schemas.microsoft.com/office/word/2010/wordprocessingShape" mc:Ignorable="w14 w15 w16se w16cid w16 w16cex w16sdtdh w16sdtfl w16du wp14">
   <w:p>
     <w:pPr>
       <w:pStyle w:val="Header"/>
@@ -5202,7 +5525,7 @@
                         <w:p>
                           <w:pPr>
                             <w:rPr>
-                              <w:rFonts w:ascii="Aptos" w:hAnsi="Aptos" w:eastAsia="Aptos" w:cs="Aptos"/>
+                              <w:rFonts w:ascii="Aptos" w:eastAsia="Aptos" w:hAnsi="Aptos" w:cs="Aptos"/>
                               <w:noProof/>
                               <w:color w:val="FF0000"/>
                               <w:sz w:val="24"/>
@@ -5211,7 +5534,7 @@
                           </w:pPr>
                           <w:r>
                             <w:rPr>
-                              <w:rFonts w:ascii="Aptos" w:hAnsi="Aptos" w:eastAsia="Aptos" w:cs="Aptos"/>
+                              <w:rFonts w:ascii="Aptos" w:eastAsia="Aptos" w:hAnsi="Aptos" w:cs="Aptos"/>
                               <w:noProof/>
                               <w:color w:val="FF0000"/>
                               <w:sz w:val="24"/>
@@ -5235,19 +5558,18 @@
           </w:drawing>
         </mc:Choice>
         <mc:Fallback>
-          <w:pict w14:anchorId="6D9A040B">
-            <v:shapetype id="_x0000_t202" coordsize="21600,21600" o:spt="202" path="m,l,21600r21600,l21600,xe" w14:anchorId="6593DF48">
+          <w:pict>
+            <v:shapetype w14:anchorId="6593DF48" id="_x0000_t202" coordsize="21600,21600" o:spt="202" path="m,l,21600r21600,l21600,xe">
               <v:stroke joinstyle="miter"/>
               <v:path gradientshapeok="t" o:connecttype="rect"/>
             </v:shapetype>
-            <v:shape id="Text Box 11" style="position:absolute;margin-left:0;margin-top:0;width:49pt;height:29.65pt;z-index:251662336;visibility:visible;mso-wrap-style:none;mso-wrap-distance-left:0;mso-wrap-distance-top:0;mso-wrap-distance-right:0;mso-wrap-distance-bottom:0;mso-position-horizontal:center;mso-position-horizontal-relative:page;mso-position-vertical:top;mso-position-vertical-relative:page;v-text-anchor:top" alt="OFFICIAL" o:spid="_x0000_s1029" filled="f" stroked="f" type="#_x0000_t202" o:gfxdata="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">
-              <v:fill o:detectmouseclick="t"/>
+            <v:shape id="Text Box 11" o:spid="_x0000_s1029" type="#_x0000_t202" alt="OFFICIAL" style="position:absolute;margin-left:0;margin-top:0;width:49pt;height:29.65pt;z-index:251662336;visibility:visible;mso-wrap-style:none;mso-wrap-distance-left:0;mso-wrap-distance-top:0;mso-wrap-distance-right:0;mso-wrap-distance-bottom:0;mso-position-horizontal:center;mso-position-horizontal-relative:page;mso-position-vertical:top;mso-position-vertical-relative:page;v-text-anchor:top" o:gfxdata="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" filled="f" stroked="f">
               <v:textbox style="mso-fit-shape-to-text:t" inset="0,15pt,0,0">
                 <w:txbxContent>
                   <w:p>
                     <w:pPr>
                       <w:rPr>
-                        <w:rFonts w:ascii="Aptos" w:hAnsi="Aptos" w:eastAsia="Aptos" w:cs="Aptos"/>
+                        <w:rFonts w:ascii="Aptos" w:eastAsia="Aptos" w:hAnsi="Aptos" w:cs="Aptos"/>
                         <w:noProof/>
                         <w:color w:val="FF0000"/>
                         <w:sz w:val="24"/>
@@ -5256,7 +5578,7 @@
                     </w:pPr>
                     <w:r>
                       <w:rPr>
-                        <w:rFonts w:ascii="Aptos" w:hAnsi="Aptos" w:eastAsia="Aptos" w:cs="Aptos"/>
+                        <w:rFonts w:ascii="Aptos" w:eastAsia="Aptos" w:hAnsi="Aptos" w:cs="Aptos"/>
                         <w:noProof/>
                         <w:color w:val="FF0000"/>
                         <w:sz w:val="24"/>
@@ -5278,7 +5600,7 @@
 </file>
 
 <file path=word/header5.xml><?xml version="1.0" encoding="utf-8"?>
-<w:hdr xmlns:wpc="http://schemas.microsoft.com/office/word/2010/wordprocessingCanvas" xmlns:cx="http://schemas.microsoft.com/office/drawing/2014/chartex" xmlns:cx1="http://schemas.microsoft.com/office/drawing/2015/9/8/chartex" xmlns:cx2="http://schemas.microsoft.com/office/drawing/2015/10/21/chartex" xmlns:cx3="http://schemas.microsoft.com/office/drawing/2016/5/9/chartex" xmlns:cx4="http://schemas.microsoft.com/office/drawing/2016/5/10/chartex" xmlns:cx5="http://schemas.microsoft.com/office/drawing/2016/5/11/chartex" xmlns:cx6="http://schemas.microsoft.com/office/drawing/2016/5/12/chartex" xmlns:cx7="http://schemas.microsoft.com/office/drawing/2016/5/13/chartex" xmlns:cx8="http://schemas.microsoft.com/office/drawing/2016/5/14/chartex" xmlns:mc="http://schemas.openxmlformats.org/markup-compatibility/2006" xmlns:m="http://schemas.openxmlformats.org/officeDocument/2006/math" xmlns:aink="http://schemas.microsoft.com/office/drawing/2016/ink" xmlns:am3d="http://schemas.microsoft.com/office/drawing/2017/model3d" xmlns:oel="http://schemas.microsoft.com/office/2019/extlst" xmlns:r="http://schemas.openxmlformats.org/officeDocument/2006/relationships" xmlns:wp14="http://schemas.microsoft.com/office/word/2010/wordprocessingDrawing" xmlns:wp="http://schemas.openxmlformats.org/drawingml/2006/wordprocessingDrawing" xmlns:wpg="http://schemas.microsoft.com/office/word/2010/wordprocessingGroup" xmlns:wpi="http://schemas.microsoft.com/office/word/2010/wordprocessingInk" xmlns:wps="http://schemas.microsoft.com/office/word/2010/wordprocessingShape" xmlns:o="urn:schemas-microsoft-com:office:office" xmlns:v="urn:schemas-microsoft-com:vml" xmlns:w10="urn:schemas-microsoft-com:office:word" xmlns:w="http://schemas.openxmlformats.org/wordprocessingml/2006/main" xmlns:w14="http://schemas.microsoft.com/office/word/2010/wordml" xmlns:w15="http://schemas.microsoft.com/office/word/2012/wordml" xmlns:w16cex="http://schemas.microsoft.com/office/word/2018/wordml/cex" xmlns:w16cid="http://schemas.microsoft.com/office/word/2016/wordml/cid" xmlns:w16="http://schemas.microsoft.com/office/word/2018/wordml" xmlns:w16sdtdh="http://schemas.microsoft.com/office/word/2020/wordml/sdtdatahash" xmlns:w16sdtfl="http://schemas.microsoft.com/office/word/2024/wordml/sdtformatlock" xmlns:w16se="http://schemas.microsoft.com/office/word/2015/wordml/symex" xmlns:w16du="http://schemas.microsoft.com/office/word/2023/wordml/word16du" xmlns:wne="http://schemas.microsoft.com/office/word/2006/wordml" xmlns:a="http://schemas.openxmlformats.org/drawingml/2006/main" xmlns:aclsh="http://schemas.microsoft.com/office/drawing/2020/classificationShape" mc:Ignorable="w14 w15 w16se w16cid w16 w16cex w16sdtdh w16sdtfl w16du wp14">
+<w:hdr xmlns:wpc="http://schemas.microsoft.com/office/word/2010/wordprocessingCanvas" xmlns:cx="http://schemas.microsoft.com/office/drawing/2014/chartex" xmlns:cx1="http://schemas.microsoft.com/office/drawing/2015/9/8/chartex" xmlns:cx2="http://schemas.microsoft.com/office/drawing/2015/10/21/chartex" xmlns:cx3="http://schemas.microsoft.com/office/drawing/2016/5/9/chartex" xmlns:cx4="http://schemas.microsoft.com/office/drawing/2016/5/10/chartex" xmlns:cx5="http://schemas.microsoft.com/office/drawing/2016/5/11/chartex" xmlns:cx6="http://schemas.microsoft.com/office/drawing/2016/5/12/chartex" xmlns:cx7="http://schemas.microsoft.com/office/drawing/2016/5/13/chartex" xmlns:cx8="http://schemas.microsoft.com/office/drawing/2016/5/14/chartex" xmlns:mc="http://schemas.openxmlformats.org/markup-compatibility/2006" xmlns:aink="http://schemas.microsoft.com/office/drawing/2016/ink" xmlns:am3d="http://schemas.microsoft.com/office/drawing/2017/model3d" xmlns:o="urn:schemas-microsoft-com:office:office" xmlns:oel="http://schemas.microsoft.com/office/2019/extlst" xmlns:r="http://schemas.openxmlformats.org/officeDocument/2006/relationships" xmlns:m="http://schemas.openxmlformats.org/officeDocument/2006/math" xmlns:v="urn:schemas-microsoft-com:vml" xmlns:wp14="http://schemas.microsoft.com/office/word/2010/wordprocessingDrawing" xmlns:wp="http://schemas.openxmlformats.org/drawingml/2006/wordprocessingDrawing" xmlns:w10="urn:schemas-microsoft-com:office:word" xmlns:w="http://schemas.openxmlformats.org/wordprocessingml/2006/main" xmlns:w14="http://schemas.microsoft.com/office/word/2010/wordml" xmlns:w15="http://schemas.microsoft.com/office/word/2012/wordml" xmlns:w16cex="http://schemas.microsoft.com/office/word/2018/wordml/cex" xmlns:w16cid="http://schemas.microsoft.com/office/word/2016/wordml/cid" xmlns:w16="http://schemas.microsoft.com/office/word/2018/wordml" xmlns:w16du="http://schemas.microsoft.com/office/word/2023/wordml/word16du" xmlns:w16sdtdh="http://schemas.microsoft.com/office/word/2020/wordml/sdtdatahash" xmlns:w16sdtfl="http://schemas.microsoft.com/office/word/2024/wordml/sdtformatlock" xmlns:w16se="http://schemas.microsoft.com/office/word/2015/wordml/symex" xmlns:wpg="http://schemas.microsoft.com/office/word/2010/wordprocessingGroup" xmlns:wpi="http://schemas.microsoft.com/office/word/2010/wordprocessingInk" xmlns:wne="http://schemas.microsoft.com/office/word/2006/wordml" xmlns:wps="http://schemas.microsoft.com/office/word/2010/wordprocessingShape" mc:Ignorable="w14 w15 w16se w16cid w16 w16cex w16sdtdh w16sdtfl w16du wp14">
   <w:p>
     <w:pPr>
       <w:pStyle w:val="Header"/>
@@ -5331,7 +5653,7 @@
                         <w:p>
                           <w:pPr>
                             <w:rPr>
-                              <w:rFonts w:ascii="Aptos" w:hAnsi="Aptos" w:eastAsia="Aptos" w:cs="Aptos"/>
+                              <w:rFonts w:ascii="Aptos" w:eastAsia="Aptos" w:hAnsi="Aptos" w:cs="Aptos"/>
                               <w:noProof/>
                               <w:color w:val="FF0000"/>
                               <w:sz w:val="24"/>
@@ -5340,7 +5662,7 @@
                           </w:pPr>
                           <w:r>
                             <w:rPr>
-                              <w:rFonts w:ascii="Aptos" w:hAnsi="Aptos" w:eastAsia="Aptos" w:cs="Aptos"/>
+                              <w:rFonts w:ascii="Aptos" w:eastAsia="Aptos" w:hAnsi="Aptos" w:cs="Aptos"/>
                               <w:noProof/>
                               <w:color w:val="FF0000"/>
                               <w:sz w:val="24"/>
@@ -5364,19 +5686,18 @@
           </w:drawing>
         </mc:Choice>
         <mc:Fallback>
-          <w:pict w14:anchorId="047E1B4D">
-            <v:shapetype id="_x0000_t202" coordsize="21600,21600" o:spt="202" path="m,l,21600r21600,l21600,xe" w14:anchorId="7B73CAE4">
+          <w:pict>
+            <v:shapetype w14:anchorId="7B73CAE4" id="_x0000_t202" coordsize="21600,21600" o:spt="202" path="m,l,21600r21600,l21600,xe">
               <v:stroke joinstyle="miter"/>
               <v:path gradientshapeok="t" o:connecttype="rect"/>
             </v:shapetype>
-            <v:shape id="Text Box 12" style="position:absolute;margin-left:0;margin-top:0;width:49pt;height:29.65pt;z-index:251663360;visibility:visible;mso-wrap-style:none;mso-wrap-distance-left:0;mso-wrap-distance-top:0;mso-wrap-distance-right:0;mso-wrap-distance-bottom:0;mso-position-horizontal:center;mso-position-horizontal-relative:page;mso-position-vertical:top;mso-position-vertical-relative:page;v-text-anchor:top" alt="OFFICIAL" o:spid="_x0000_s1030" filled="f" stroked="f" type="#_x0000_t202" o:gfxdata="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">
-              <v:fill o:detectmouseclick="t"/>
+            <v:shape id="Text Box 12" o:spid="_x0000_s1030" type="#_x0000_t202" alt="OFFICIAL" style="position:absolute;margin-left:0;margin-top:0;width:49pt;height:29.65pt;z-index:251663360;visibility:visible;mso-wrap-style:none;mso-wrap-distance-left:0;mso-wrap-distance-top:0;mso-wrap-distance-right:0;mso-wrap-distance-bottom:0;mso-position-horizontal:center;mso-position-horizontal-relative:page;mso-position-vertical:top;mso-position-vertical-relative:page;v-text-anchor:top" o:gfxdata="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" filled="f" stroked="f">
               <v:textbox style="mso-fit-shape-to-text:t" inset="0,15pt,0,0">
                 <w:txbxContent>
                   <w:p>
                     <w:pPr>
                       <w:rPr>
-                        <w:rFonts w:ascii="Aptos" w:hAnsi="Aptos" w:eastAsia="Aptos" w:cs="Aptos"/>
+                        <w:rFonts w:ascii="Aptos" w:eastAsia="Aptos" w:hAnsi="Aptos" w:cs="Aptos"/>
                         <w:noProof/>
                         <w:color w:val="FF0000"/>
                         <w:sz w:val="24"/>
@@ -5385,7 +5706,7 @@
                     </w:pPr>
                     <w:r>
                       <w:rPr>
-                        <w:rFonts w:ascii="Aptos" w:hAnsi="Aptos" w:eastAsia="Aptos" w:cs="Aptos"/>
+                        <w:rFonts w:ascii="Aptos" w:eastAsia="Aptos" w:hAnsi="Aptos" w:cs="Aptos"/>
                         <w:noProof/>
                         <w:color w:val="FF0000"/>
                         <w:sz w:val="24"/>
@@ -5407,7 +5728,7 @@
 </file>
 
 <file path=word/header6.xml><?xml version="1.0" encoding="utf-8"?>
-<w:hdr xmlns:wpc="http://schemas.microsoft.com/office/word/2010/wordprocessingCanvas" xmlns:cx="http://schemas.microsoft.com/office/drawing/2014/chartex" xmlns:cx1="http://schemas.microsoft.com/office/drawing/2015/9/8/chartex" xmlns:cx2="http://schemas.microsoft.com/office/drawing/2015/10/21/chartex" xmlns:cx3="http://schemas.microsoft.com/office/drawing/2016/5/9/chartex" xmlns:cx4="http://schemas.microsoft.com/office/drawing/2016/5/10/chartex" xmlns:cx5="http://schemas.microsoft.com/office/drawing/2016/5/11/chartex" xmlns:cx6="http://schemas.microsoft.com/office/drawing/2016/5/12/chartex" xmlns:cx7="http://schemas.microsoft.com/office/drawing/2016/5/13/chartex" xmlns:cx8="http://schemas.microsoft.com/office/drawing/2016/5/14/chartex" xmlns:mc="http://schemas.openxmlformats.org/markup-compatibility/2006" xmlns:m="http://schemas.openxmlformats.org/officeDocument/2006/math" xmlns:aink="http://schemas.microsoft.com/office/drawing/2016/ink" xmlns:am3d="http://schemas.microsoft.com/office/drawing/2017/model3d" xmlns:oel="http://schemas.microsoft.com/office/2019/extlst" xmlns:r="http://schemas.openxmlformats.org/officeDocument/2006/relationships" xmlns:wp14="http://schemas.microsoft.com/office/word/2010/wordprocessingDrawing" xmlns:wp="http://schemas.openxmlformats.org/drawingml/2006/wordprocessingDrawing" xmlns:wpg="http://schemas.microsoft.com/office/word/2010/wordprocessingGroup" xmlns:wpi="http://schemas.microsoft.com/office/word/2010/wordprocessingInk" xmlns:wps="http://schemas.microsoft.com/office/word/2010/wordprocessingShape" xmlns:o="urn:schemas-microsoft-com:office:office" xmlns:v="urn:schemas-microsoft-com:vml" xmlns:w10="urn:schemas-microsoft-com:office:word" xmlns:w="http://schemas.openxmlformats.org/wordprocessingml/2006/main" xmlns:w14="http://schemas.microsoft.com/office/word/2010/wordml" xmlns:w15="http://schemas.microsoft.com/office/word/2012/wordml" xmlns:w16cex="http://schemas.microsoft.com/office/word/2018/wordml/cex" xmlns:w16cid="http://schemas.microsoft.com/office/word/2016/wordml/cid" xmlns:w16="http://schemas.microsoft.com/office/word/2018/wordml" xmlns:w16sdtdh="http://schemas.microsoft.com/office/word/2020/wordml/sdtdatahash" xmlns:w16sdtfl="http://schemas.microsoft.com/office/word/2024/wordml/sdtformatlock" xmlns:w16se="http://schemas.microsoft.com/office/word/2015/wordml/symex" xmlns:w16du="http://schemas.microsoft.com/office/word/2023/wordml/word16du" xmlns:wne="http://schemas.microsoft.com/office/word/2006/wordml" xmlns:a="http://schemas.openxmlformats.org/drawingml/2006/main" xmlns:aclsh="http://schemas.microsoft.com/office/drawing/2020/classificationShape" mc:Ignorable="w14 w15 w16se w16cid w16 w16cex w16sdtdh w16sdtfl w16du wp14">
+<w:hdr xmlns:wpc="http://schemas.microsoft.com/office/word/2010/wordprocessingCanvas" xmlns:cx="http://schemas.microsoft.com/office/drawing/2014/chartex" xmlns:cx1="http://schemas.microsoft.com/office/drawing/2015/9/8/chartex" xmlns:cx2="http://schemas.microsoft.com/office/drawing/2015/10/21/chartex" xmlns:cx3="http://schemas.microsoft.com/office/drawing/2016/5/9/chartex" xmlns:cx4="http://schemas.microsoft.com/office/drawing/2016/5/10/chartex" xmlns:cx5="http://schemas.microsoft.com/office/drawing/2016/5/11/chartex" xmlns:cx6="http://schemas.microsoft.com/office/drawing/2016/5/12/chartex" xmlns:cx7="http://schemas.microsoft.com/office/drawing/2016/5/13/chartex" xmlns:cx8="http://schemas.microsoft.com/office/drawing/2016/5/14/chartex" xmlns:mc="http://schemas.openxmlformats.org/markup-compatibility/2006" xmlns:aink="http://schemas.microsoft.com/office/drawing/2016/ink" xmlns:am3d="http://schemas.microsoft.com/office/drawing/2017/model3d" xmlns:o="urn:schemas-microsoft-com:office:office" xmlns:oel="http://schemas.microsoft.com/office/2019/extlst" xmlns:r="http://schemas.openxmlformats.org/officeDocument/2006/relationships" xmlns:m="http://schemas.openxmlformats.org/officeDocument/2006/math" xmlns:v="urn:schemas-microsoft-com:vml" xmlns:wp14="http://schemas.microsoft.com/office/word/2010/wordprocessingDrawing" xmlns:wp="http://schemas.openxmlformats.org/drawingml/2006/wordprocessingDrawing" xmlns:w10="urn:schemas-microsoft-com:office:word" xmlns:w="http://schemas.openxmlformats.org/wordprocessingml/2006/main" xmlns:w14="http://schemas.microsoft.com/office/word/2010/wordml" xmlns:w15="http://schemas.microsoft.com/office/word/2012/wordml" xmlns:w16cex="http://schemas.microsoft.com/office/word/2018/wordml/cex" xmlns:w16cid="http://schemas.microsoft.com/office/word/2016/wordml/cid" xmlns:w16="http://schemas.microsoft.com/office/word/2018/wordml" xmlns:w16du="http://schemas.microsoft.com/office/word/2023/wordml/word16du" xmlns:w16sdtdh="http://schemas.microsoft.com/office/word/2020/wordml/sdtdatahash" xmlns:w16sdtfl="http://schemas.microsoft.com/office/word/2024/wordml/sdtformatlock" xmlns:w16se="http://schemas.microsoft.com/office/word/2015/wordml/symex" xmlns:wpg="http://schemas.microsoft.com/office/word/2010/wordprocessingGroup" xmlns:wpi="http://schemas.microsoft.com/office/word/2010/wordprocessingInk" xmlns:wne="http://schemas.microsoft.com/office/word/2006/wordml" xmlns:wps="http://schemas.microsoft.com/office/word/2010/wordprocessingShape" mc:Ignorable="w14 w15 w16se w16cid w16 w16cex w16sdtdh w16sdtfl w16du wp14">
   <w:p>
     <w:pPr>
       <w:pStyle w:val="Header"/>
@@ -5460,7 +5781,7 @@
                         <w:p>
                           <w:pPr>
                             <w:rPr>
-                              <w:rFonts w:ascii="Aptos" w:hAnsi="Aptos" w:eastAsia="Aptos" w:cs="Aptos"/>
+                              <w:rFonts w:ascii="Aptos" w:eastAsia="Aptos" w:hAnsi="Aptos" w:cs="Aptos"/>
                               <w:noProof/>
                               <w:color w:val="FF0000"/>
                               <w:sz w:val="24"/>
@@ -5469,7 +5790,7 @@
                           </w:pPr>
                           <w:r>
                             <w:rPr>
-                              <w:rFonts w:ascii="Aptos" w:hAnsi="Aptos" w:eastAsia="Aptos" w:cs="Aptos"/>
+                              <w:rFonts w:ascii="Aptos" w:eastAsia="Aptos" w:hAnsi="Aptos" w:cs="Aptos"/>
                               <w:noProof/>
                               <w:color w:val="FF0000"/>
                               <w:sz w:val="24"/>
@@ -5493,19 +5814,18 @@
           </w:drawing>
         </mc:Choice>
         <mc:Fallback>
-          <w:pict w14:anchorId="4BD0C40E">
-            <v:shapetype id="_x0000_t202" coordsize="21600,21600" o:spt="202" path="m,l,21600r21600,l21600,xe" w14:anchorId="4062B4AA">
+          <w:pict>
+            <v:shapetype w14:anchorId="4062B4AA" id="_x0000_t202" coordsize="21600,21600" o:spt="202" path="m,l,21600r21600,l21600,xe">
               <v:stroke joinstyle="miter"/>
               <v:path gradientshapeok="t" o:connecttype="rect"/>
             </v:shapetype>
-            <v:shape id="Text Box 10" style="position:absolute;margin-left:0;margin-top:0;width:49pt;height:29.65pt;z-index:251661312;visibility:visible;mso-wrap-style:none;mso-wrap-distance-left:0;mso-wrap-distance-top:0;mso-wrap-distance-right:0;mso-wrap-distance-bottom:0;mso-position-horizontal:center;mso-position-horizontal-relative:page;mso-position-vertical:top;mso-position-vertical-relative:page;v-text-anchor:top" alt="OFFICIAL" o:spid="_x0000_s1031" filled="f" stroked="f" type="#_x0000_t202" o:gfxdata="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">
-              <v:fill o:detectmouseclick="t"/>
+            <v:shape id="Text Box 10" o:spid="_x0000_s1031" type="#_x0000_t202" alt="OFFICIAL" style="position:absolute;margin-left:0;margin-top:0;width:49pt;height:29.65pt;z-index:251661312;visibility:visible;mso-wrap-style:none;mso-wrap-distance-left:0;mso-wrap-distance-top:0;mso-wrap-distance-right:0;mso-wrap-distance-bottom:0;mso-position-horizontal:center;mso-position-horizontal-relative:page;mso-position-vertical:top;mso-position-vertical-relative:page;v-text-anchor:top" o:gfxdata="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" filled="f" stroked="f">
               <v:textbox style="mso-fit-shape-to-text:t" inset="0,15pt,0,0">
                 <w:txbxContent>
                   <w:p>
                     <w:pPr>
                       <w:rPr>
-                        <w:rFonts w:ascii="Aptos" w:hAnsi="Aptos" w:eastAsia="Aptos" w:cs="Aptos"/>
+                        <w:rFonts w:ascii="Aptos" w:eastAsia="Aptos" w:hAnsi="Aptos" w:cs="Aptos"/>
                         <w:noProof/>
                         <w:color w:val="FF0000"/>
                         <w:sz w:val="24"/>
@@ -5514,7 +5834,7 @@
                     </w:pPr>
                     <w:r>
                       <w:rPr>
-                        <w:rFonts w:ascii="Aptos" w:hAnsi="Aptos" w:eastAsia="Aptos" w:cs="Aptos"/>
+                        <w:rFonts w:ascii="Aptos" w:eastAsia="Aptos" w:hAnsi="Aptos" w:cs="Aptos"/>
                         <w:noProof/>
                         <w:color w:val="FF0000"/>
                         <w:sz w:val="24"/>
@@ -5536,7 +5856,7 @@
 </file>
 
 <file path=word/numbering.xml><?xml version="1.0" encoding="utf-8"?>
-<w:numbering xmlns:wpc="http://schemas.microsoft.com/office/word/2010/wordprocessingCanvas" xmlns:cx="http://schemas.microsoft.com/office/drawing/2014/chartex" xmlns:cx1="http://schemas.microsoft.com/office/drawing/2015/9/8/chartex" xmlns:cx2="http://schemas.microsoft.com/office/drawing/2015/10/21/chartex" xmlns:cx3="http://schemas.microsoft.com/office/drawing/2016/5/9/chartex" xmlns:cx4="http://schemas.microsoft.com/office/drawing/2016/5/10/chartex" xmlns:cx5="http://schemas.microsoft.com/office/drawing/2016/5/11/chartex" xmlns:cx6="http://schemas.microsoft.com/office/drawing/2016/5/12/chartex" xmlns:cx7="http://schemas.microsoft.com/office/drawing/2016/5/13/chartex" xmlns:cx8="http://schemas.microsoft.com/office/drawing/2016/5/14/chartex" xmlns:mc="http://schemas.openxmlformats.org/markup-compatibility/2006" xmlns:m="http://schemas.openxmlformats.org/officeDocument/2006/math" xmlns:aink="http://schemas.microsoft.com/office/drawing/2016/ink" xmlns:am3d="http://schemas.microsoft.com/office/drawing/2017/model3d" xmlns:oel="http://schemas.microsoft.com/office/2019/extlst" xmlns:r="http://schemas.openxmlformats.org/officeDocument/2006/relationships" xmlns:wp14="http://schemas.microsoft.com/office/word/2010/wordprocessingDrawing" xmlns:wp="http://schemas.openxmlformats.org/drawingml/2006/wordprocessingDrawing" xmlns:wpg="http://schemas.microsoft.com/office/word/2010/wordprocessingGroup" xmlns:wpi="http://schemas.microsoft.com/office/word/2010/wordprocessingInk" xmlns:wps="http://schemas.microsoft.com/office/word/2010/wordprocessingShape" xmlns:o="urn:schemas-microsoft-com:office:office" xmlns:v="urn:schemas-microsoft-com:vml" xmlns:w10="urn:schemas-microsoft-com:office:word" xmlns:w="http://schemas.openxmlformats.org/wordprocessingml/2006/main" xmlns:w14="http://schemas.microsoft.com/office/word/2010/wordml" xmlns:w15="http://schemas.microsoft.com/office/word/2012/wordml" xmlns:w16cex="http://schemas.microsoft.com/office/word/2018/wordml/cex" xmlns:w16cid="http://schemas.microsoft.com/office/word/2016/wordml/cid" xmlns:w16="http://schemas.microsoft.com/office/word/2018/wordml" xmlns:w16sdtdh="http://schemas.microsoft.com/office/word/2020/wordml/sdtdatahash" xmlns:w16sdtfl="http://schemas.microsoft.com/office/word/2024/wordml/sdtformatlock" xmlns:w16se="http://schemas.microsoft.com/office/word/2015/wordml/symex" xmlns:w16du="http://schemas.microsoft.com/office/word/2023/wordml/word16du" xmlns:wne="http://schemas.microsoft.com/office/word/2006/wordml" mc:Ignorable="w14 w15 w16se w16cid w16 w16cex w16sdtdh w16sdtfl w16du wp14">
+<w:numbering xmlns:wpc="http://schemas.microsoft.com/office/word/2010/wordprocessingCanvas" xmlns:cx="http://schemas.microsoft.com/office/drawing/2014/chartex" xmlns:cx1="http://schemas.microsoft.com/office/drawing/2015/9/8/chartex" xmlns:cx2="http://schemas.microsoft.com/office/drawing/2015/10/21/chartex" xmlns:cx3="http://schemas.microsoft.com/office/drawing/2016/5/9/chartex" xmlns:cx4="http://schemas.microsoft.com/office/drawing/2016/5/10/chartex" xmlns:cx5="http://schemas.microsoft.com/office/drawing/2016/5/11/chartex" xmlns:cx6="http://schemas.microsoft.com/office/drawing/2016/5/12/chartex" xmlns:cx7="http://schemas.microsoft.com/office/drawing/2016/5/13/chartex" xmlns:cx8="http://schemas.microsoft.com/office/drawing/2016/5/14/chartex" xmlns:mc="http://schemas.openxmlformats.org/markup-compatibility/2006" xmlns:aink="http://schemas.microsoft.com/office/drawing/2016/ink" xmlns:am3d="http://schemas.microsoft.com/office/drawing/2017/model3d" xmlns:o="urn:schemas-microsoft-com:office:office" xmlns:oel="http://schemas.microsoft.com/office/2019/extlst" xmlns:r="http://schemas.openxmlformats.org/officeDocument/2006/relationships" xmlns:m="http://schemas.openxmlformats.org/officeDocument/2006/math" xmlns:v="urn:schemas-microsoft-com:vml" xmlns:wp14="http://schemas.microsoft.com/office/word/2010/wordprocessingDrawing" xmlns:wp="http://schemas.openxmlformats.org/drawingml/2006/wordprocessingDrawing" xmlns:w10="urn:schemas-microsoft-com:office:word" xmlns:w="http://schemas.openxmlformats.org/wordprocessingml/2006/main" xmlns:w14="http://schemas.microsoft.com/office/word/2010/wordml" xmlns:w15="http://schemas.microsoft.com/office/word/2012/wordml" xmlns:w16cex="http://schemas.microsoft.com/office/word/2018/wordml/cex" xmlns:w16cid="http://schemas.microsoft.com/office/word/2016/wordml/cid" xmlns:w16="http://schemas.microsoft.com/office/word/2018/wordml" xmlns:w16du="http://schemas.microsoft.com/office/word/2023/wordml/word16du" xmlns:w16sdtdh="http://schemas.microsoft.com/office/word/2020/wordml/sdtdatahash" xmlns:w16sdtfl="http://schemas.microsoft.com/office/word/2024/wordml/sdtformatlock" xmlns:w16se="http://schemas.microsoft.com/office/word/2015/wordml/symex" xmlns:wpg="http://schemas.microsoft.com/office/word/2010/wordprocessingGroup" xmlns:wpi="http://schemas.microsoft.com/office/word/2010/wordprocessingInk" xmlns:wne="http://schemas.microsoft.com/office/word/2006/wordml" xmlns:wps="http://schemas.microsoft.com/office/word/2010/wordprocessingShape" mc:Ignorable="w14 w15 w16se w16cid w16 w16cex w16sdtdh w16sdtfl w16du wp14">
   <w:abstractNum w:abstractNumId="0" w15:restartNumberingAfterBreak="0">
     <w:nsid w:val="07F15377"/>
     <w:multiLevelType w:val="hybridMultilevel"/>
@@ -5550,7 +5870,7 @@
         <w:ind w:left="720" w:hanging="360"/>
       </w:pPr>
       <w:rPr>
-        <w:rFonts w:hint="default" w:ascii="Symbol" w:hAnsi="Symbol"/>
+        <w:rFonts w:ascii="Symbol" w:hAnsi="Symbol" w:hint="default"/>
       </w:rPr>
     </w:lvl>
     <w:lvl w:ilvl="1" w:tplc="0C090003" w:tentative="1">
@@ -5562,7 +5882,7 @@
         <w:ind w:left="1440" w:hanging="360"/>
       </w:pPr>
       <w:rPr>
-        <w:rFonts w:hint="default" w:ascii="Courier New" w:hAnsi="Courier New" w:cs="Courier New"/>
+        <w:rFonts w:ascii="Courier New" w:hAnsi="Courier New" w:cs="Courier New" w:hint="default"/>
       </w:rPr>
     </w:lvl>
     <w:lvl w:ilvl="2" w:tplc="0C090005" w:tentative="1">
@@ -5574,7 +5894,7 @@
         <w:ind w:left="2160" w:hanging="360"/>
       </w:pPr>
       <w:rPr>
-        <w:rFonts w:hint="default" w:ascii="Wingdings" w:hAnsi="Wingdings"/>
+        <w:rFonts w:ascii="Wingdings" w:hAnsi="Wingdings" w:hint="default"/>
       </w:rPr>
     </w:lvl>
     <w:lvl w:ilvl="3" w:tplc="0C090001" w:tentative="1">
@@ -5586,7 +5906,7 @@
         <w:ind w:left="2880" w:hanging="360"/>
       </w:pPr>
       <w:rPr>
-        <w:rFonts w:hint="default" w:ascii="Symbol" w:hAnsi="Symbol"/>
+        <w:rFonts w:ascii="Symbol" w:hAnsi="Symbol" w:hint="default"/>
       </w:rPr>
     </w:lvl>
     <w:lvl w:ilvl="4" w:tplc="0C090003" w:tentative="1">
@@ -5598,7 +5918,7 @@
         <w:ind w:left="3600" w:hanging="360"/>
       </w:pPr>
       <w:rPr>
-        <w:rFonts w:hint="default" w:ascii="Courier New" w:hAnsi="Courier New" w:cs="Courier New"/>
+        <w:rFonts w:ascii="Courier New" w:hAnsi="Courier New" w:cs="Courier New" w:hint="default"/>
       </w:rPr>
     </w:lvl>
     <w:lvl w:ilvl="5" w:tplc="0C090005" w:tentative="1">
@@ -5610,7 +5930,7 @@
         <w:ind w:left="4320" w:hanging="360"/>
       </w:pPr>
       <w:rPr>
-        <w:rFonts w:hint="default" w:ascii="Wingdings" w:hAnsi="Wingdings"/>
+        <w:rFonts w:ascii="Wingdings" w:hAnsi="Wingdings" w:hint="default"/>
       </w:rPr>
     </w:lvl>
     <w:lvl w:ilvl="6" w:tplc="0C090001" w:tentative="1">
@@ -5622,7 +5942,7 @@
         <w:ind w:left="5040" w:hanging="360"/>
       </w:pPr>
       <w:rPr>
-        <w:rFonts w:hint="default" w:ascii="Symbol" w:hAnsi="Symbol"/>
+        <w:rFonts w:ascii="Symbol" w:hAnsi="Symbol" w:hint="default"/>
       </w:rPr>
     </w:lvl>
     <w:lvl w:ilvl="7" w:tplc="0C090003" w:tentative="1">
@@ -5634,7 +5954,7 @@
         <w:ind w:left="5760" w:hanging="360"/>
       </w:pPr>
       <w:rPr>
-        <w:rFonts w:hint="default" w:ascii="Courier New" w:hAnsi="Courier New" w:cs="Courier New"/>
+        <w:rFonts w:ascii="Courier New" w:hAnsi="Courier New" w:cs="Courier New" w:hint="default"/>
       </w:rPr>
     </w:lvl>
     <w:lvl w:ilvl="8" w:tplc="0C090005" w:tentative="1">
@@ -5646,7 +5966,7 @@
         <w:ind w:left="6480" w:hanging="360"/>
       </w:pPr>
       <w:rPr>
-        <w:rFonts w:hint="default" w:ascii="Wingdings" w:hAnsi="Wingdings"/>
+        <w:rFonts w:ascii="Wingdings" w:hAnsi="Wingdings" w:hint="default"/>
       </w:rPr>
     </w:lvl>
   </w:abstractNum>
@@ -5835,7 +6155,7 @@
         <w:ind w:left="360" w:hanging="360"/>
       </w:pPr>
       <w:rPr>
-        <w:rFonts w:hint="default" w:ascii="Symbol" w:hAnsi="Symbol"/>
+        <w:rFonts w:ascii="Symbol" w:hAnsi="Symbol" w:hint="default"/>
       </w:rPr>
     </w:lvl>
     <w:lvl w:ilvl="1" w:tplc="0C090003" w:tentative="1">
@@ -5847,7 +6167,7 @@
         <w:ind w:left="1080" w:hanging="360"/>
       </w:pPr>
       <w:rPr>
-        <w:rFonts w:hint="default" w:ascii="Courier New" w:hAnsi="Courier New" w:cs="Courier New"/>
+        <w:rFonts w:ascii="Courier New" w:hAnsi="Courier New" w:cs="Courier New" w:hint="default"/>
       </w:rPr>
     </w:lvl>
     <w:lvl w:ilvl="2" w:tplc="0C090005" w:tentative="1">
@@ -5859,7 +6179,7 @@
         <w:ind w:left="1800" w:hanging="360"/>
       </w:pPr>
       <w:rPr>
-        <w:rFonts w:hint="default" w:ascii="Wingdings" w:hAnsi="Wingdings"/>
+        <w:rFonts w:ascii="Wingdings" w:hAnsi="Wingdings" w:hint="default"/>
       </w:rPr>
     </w:lvl>
     <w:lvl w:ilvl="3" w:tplc="0C090001" w:tentative="1">
@@ -5871,7 +6191,7 @@
         <w:ind w:left="2520" w:hanging="360"/>
       </w:pPr>
       <w:rPr>
-        <w:rFonts w:hint="default" w:ascii="Symbol" w:hAnsi="Symbol"/>
+        <w:rFonts w:ascii="Symbol" w:hAnsi="Symbol" w:hint="default"/>
       </w:rPr>
     </w:lvl>
     <w:lvl w:ilvl="4" w:tplc="0C090003" w:tentative="1">
@@ -5883,7 +6203,7 @@
         <w:ind w:left="3240" w:hanging="360"/>
       </w:pPr>
       <w:rPr>
-        <w:rFonts w:hint="default" w:ascii="Courier New" w:hAnsi="Courier New" w:cs="Courier New"/>
+        <w:rFonts w:ascii="Courier New" w:hAnsi="Courier New" w:cs="Courier New" w:hint="default"/>
       </w:rPr>
     </w:lvl>
     <w:lvl w:ilvl="5" w:tplc="0C090005" w:tentative="1">
@@ -5895,7 +6215,7 @@
         <w:ind w:left="3960" w:hanging="360"/>
       </w:pPr>
       <w:rPr>
-        <w:rFonts w:hint="default" w:ascii="Wingdings" w:hAnsi="Wingdings"/>
+        <w:rFonts w:ascii="Wingdings" w:hAnsi="Wingdings" w:hint="default"/>
       </w:rPr>
     </w:lvl>
     <w:lvl w:ilvl="6" w:tplc="0C090001" w:tentative="1">
@@ -5907,7 +6227,7 @@
         <w:ind w:left="4680" w:hanging="360"/>
       </w:pPr>
       <w:rPr>
-        <w:rFonts w:hint="default" w:ascii="Symbol" w:hAnsi="Symbol"/>
+        <w:rFonts w:ascii="Symbol" w:hAnsi="Symbol" w:hint="default"/>
       </w:rPr>
     </w:lvl>
     <w:lvl w:ilvl="7" w:tplc="0C090003" w:tentative="1">
@@ -5919,7 +6239,7 @@
         <w:ind w:left="5400" w:hanging="360"/>
       </w:pPr>
       <w:rPr>
-        <w:rFonts w:hint="default" w:ascii="Courier New" w:hAnsi="Courier New" w:cs="Courier New"/>
+        <w:rFonts w:ascii="Courier New" w:hAnsi="Courier New" w:cs="Courier New" w:hint="default"/>
       </w:rPr>
     </w:lvl>
     <w:lvl w:ilvl="8" w:tplc="0C090005" w:tentative="1">
@@ -5931,7 +6251,7 @@
         <w:ind w:left="6120" w:hanging="360"/>
       </w:pPr>
       <w:rPr>
-        <w:rFonts w:hint="default" w:ascii="Wingdings" w:hAnsi="Wingdings"/>
+        <w:rFonts w:ascii="Wingdings" w:hAnsi="Wingdings" w:hint="default"/>
       </w:rPr>
     </w:lvl>
   </w:abstractNum>
@@ -5948,7 +6268,7 @@
         <w:ind w:left="720" w:hanging="360"/>
       </w:pPr>
       <w:rPr>
-        <w:rFonts w:hint="default" w:ascii="Symbol" w:hAnsi="Symbol"/>
+        <w:rFonts w:ascii="Symbol" w:hAnsi="Symbol" w:hint="default"/>
       </w:rPr>
     </w:lvl>
     <w:lvl w:ilvl="1" w:tplc="0C090003" w:tentative="1">
@@ -5960,7 +6280,7 @@
         <w:ind w:left="1440" w:hanging="360"/>
       </w:pPr>
       <w:rPr>
-        <w:rFonts w:hint="default" w:ascii="Courier New" w:hAnsi="Courier New" w:cs="Courier New"/>
+        <w:rFonts w:ascii="Courier New" w:hAnsi="Courier New" w:cs="Courier New" w:hint="default"/>
       </w:rPr>
     </w:lvl>
     <w:lvl w:ilvl="2" w:tplc="0C090005" w:tentative="1">
@@ -5972,7 +6292,7 @@
         <w:ind w:left="2160" w:hanging="360"/>
       </w:pPr>
       <w:rPr>
-        <w:rFonts w:hint="default" w:ascii="Wingdings" w:hAnsi="Wingdings"/>
+        <w:rFonts w:ascii="Wingdings" w:hAnsi="Wingdings" w:hint="default"/>
       </w:rPr>
     </w:lvl>
     <w:lvl w:ilvl="3" w:tplc="0C090001" w:tentative="1">
@@ -5984,7 +6304,7 @@
         <w:ind w:left="2880" w:hanging="360"/>
       </w:pPr>
       <w:rPr>
-        <w:rFonts w:hint="default" w:ascii="Symbol" w:hAnsi="Symbol"/>
+        <w:rFonts w:ascii="Symbol" w:hAnsi="Symbol" w:hint="default"/>
       </w:rPr>
     </w:lvl>
     <w:lvl w:ilvl="4" w:tplc="0C090003" w:tentative="1">
@@ -5996,7 +6316,7 @@
         <w:ind w:left="3600" w:hanging="360"/>
       </w:pPr>
       <w:rPr>
-        <w:rFonts w:hint="default" w:ascii="Courier New" w:hAnsi="Courier New" w:cs="Courier New"/>
+        <w:rFonts w:ascii="Courier New" w:hAnsi="Courier New" w:cs="Courier New" w:hint="default"/>
       </w:rPr>
     </w:lvl>
     <w:lvl w:ilvl="5" w:tplc="0C090005" w:tentative="1">
@@ -6008,7 +6328,7 @@
         <w:ind w:left="4320" w:hanging="360"/>
       </w:pPr>
       <w:rPr>
-        <w:rFonts w:hint="default" w:ascii="Wingdings" w:hAnsi="Wingdings"/>
+        <w:rFonts w:ascii="Wingdings" w:hAnsi="Wingdings" w:hint="default"/>
       </w:rPr>
     </w:lvl>
     <w:lvl w:ilvl="6" w:tplc="0C090001" w:tentative="1">
@@ -6020,7 +6340,7 @@
         <w:ind w:left="5040" w:hanging="360"/>
       </w:pPr>
       <w:rPr>
-        <w:rFonts w:hint="default" w:ascii="Symbol" w:hAnsi="Symbol"/>
+        <w:rFonts w:ascii="Symbol" w:hAnsi="Symbol" w:hint="default"/>
       </w:rPr>
     </w:lvl>
     <w:lvl w:ilvl="7" w:tplc="0C090003" w:tentative="1">
@@ -6032,7 +6352,7 @@
         <w:ind w:left="5760" w:hanging="360"/>
       </w:pPr>
       <w:rPr>
-        <w:rFonts w:hint="default" w:ascii="Courier New" w:hAnsi="Courier New" w:cs="Courier New"/>
+        <w:rFonts w:ascii="Courier New" w:hAnsi="Courier New" w:cs="Courier New" w:hint="default"/>
       </w:rPr>
     </w:lvl>
     <w:lvl w:ilvl="8" w:tplc="0C090005" w:tentative="1">
@@ -6044,7 +6364,7 @@
         <w:ind w:left="6480" w:hanging="360"/>
       </w:pPr>
       <w:rPr>
-        <w:rFonts w:hint="default" w:ascii="Wingdings" w:hAnsi="Wingdings"/>
+        <w:rFonts w:ascii="Wingdings" w:hAnsi="Wingdings" w:hint="default"/>
       </w:rPr>
     </w:lvl>
   </w:abstractNum>
@@ -6060,7 +6380,7 @@
         <w:ind w:left="440" w:hanging="360"/>
       </w:pPr>
       <w:rPr>
-        <w:rFonts w:hint="default" w:ascii="Arial" w:hAnsi="Arial" w:cs="Arial" w:eastAsiaTheme="minorHAnsi"/>
+        <w:rFonts w:ascii="Arial" w:eastAsiaTheme="minorHAnsi" w:hAnsi="Arial" w:cs="Arial" w:hint="default"/>
       </w:rPr>
     </w:lvl>
     <w:lvl w:ilvl="1" w:tplc="08090003" w:tentative="1">
@@ -6072,7 +6392,7 @@
         <w:ind w:left="1160" w:hanging="360"/>
       </w:pPr>
       <w:rPr>
-        <w:rFonts w:hint="default" w:ascii="Courier New" w:hAnsi="Courier New" w:cs="Courier New"/>
+        <w:rFonts w:ascii="Courier New" w:hAnsi="Courier New" w:cs="Courier New" w:hint="default"/>
       </w:rPr>
     </w:lvl>
     <w:lvl w:ilvl="2" w:tplc="08090005" w:tentative="1">
@@ -6084,7 +6404,7 @@
         <w:ind w:left="1880" w:hanging="360"/>
       </w:pPr>
       <w:rPr>
-        <w:rFonts w:hint="default" w:ascii="Wingdings" w:hAnsi="Wingdings"/>
+        <w:rFonts w:ascii="Wingdings" w:hAnsi="Wingdings" w:hint="default"/>
       </w:rPr>
     </w:lvl>
     <w:lvl w:ilvl="3" w:tplc="08090001" w:tentative="1">
@@ -6096,7 +6416,7 @@
         <w:ind w:left="2600" w:hanging="360"/>
       </w:pPr>
       <w:rPr>
-        <w:rFonts w:hint="default" w:ascii="Symbol" w:hAnsi="Symbol"/>
+        <w:rFonts w:ascii="Symbol" w:hAnsi="Symbol" w:hint="default"/>
       </w:rPr>
     </w:lvl>
     <w:lvl w:ilvl="4" w:tplc="08090003" w:tentative="1">
@@ -6108,7 +6428,7 @@
         <w:ind w:left="3320" w:hanging="360"/>
       </w:pPr>
       <w:rPr>
-        <w:rFonts w:hint="default" w:ascii="Courier New" w:hAnsi="Courier New" w:cs="Courier New"/>
+        <w:rFonts w:ascii="Courier New" w:hAnsi="Courier New" w:cs="Courier New" w:hint="default"/>
       </w:rPr>
     </w:lvl>
     <w:lvl w:ilvl="5" w:tplc="08090005" w:tentative="1">
@@ -6120,7 +6440,7 @@
         <w:ind w:left="4040" w:hanging="360"/>
       </w:pPr>
       <w:rPr>
-        <w:rFonts w:hint="default" w:ascii="Wingdings" w:hAnsi="Wingdings"/>
+        <w:rFonts w:ascii="Wingdings" w:hAnsi="Wingdings" w:hint="default"/>
       </w:rPr>
     </w:lvl>
     <w:lvl w:ilvl="6" w:tplc="08090001" w:tentative="1">
@@ -6132,7 +6452,7 @@
         <w:ind w:left="4760" w:hanging="360"/>
       </w:pPr>
       <w:rPr>
-        <w:rFonts w:hint="default" w:ascii="Symbol" w:hAnsi="Symbol"/>
+        <w:rFonts w:ascii="Symbol" w:hAnsi="Symbol" w:hint="default"/>
       </w:rPr>
     </w:lvl>
     <w:lvl w:ilvl="7" w:tplc="08090003" w:tentative="1">
@@ -6144,7 +6464,7 @@
         <w:ind w:left="5480" w:hanging="360"/>
       </w:pPr>
       <w:rPr>
-        <w:rFonts w:hint="default" w:ascii="Courier New" w:hAnsi="Courier New" w:cs="Courier New"/>
+        <w:rFonts w:ascii="Courier New" w:hAnsi="Courier New" w:cs="Courier New" w:hint="default"/>
       </w:rPr>
     </w:lvl>
     <w:lvl w:ilvl="8" w:tplc="08090005" w:tentative="1">
@@ -6156,7 +6476,7 @@
         <w:ind w:left="6200" w:hanging="360"/>
       </w:pPr>
       <w:rPr>
-        <w:rFonts w:hint="default" w:ascii="Wingdings" w:hAnsi="Wingdings"/>
+        <w:rFonts w:ascii="Wingdings" w:hAnsi="Wingdings" w:hint="default"/>
       </w:rPr>
     </w:lvl>
   </w:abstractNum>
@@ -6173,7 +6493,7 @@
         <w:ind w:left="720" w:hanging="360"/>
       </w:pPr>
       <w:rPr>
-        <w:rFonts w:hint="default" w:ascii="Symbol" w:hAnsi="Symbol"/>
+        <w:rFonts w:ascii="Symbol" w:hAnsi="Symbol" w:hint="default"/>
       </w:rPr>
     </w:lvl>
     <w:lvl w:ilvl="1" w:tplc="0C090003" w:tentative="1">
@@ -6185,7 +6505,7 @@
         <w:ind w:left="1440" w:hanging="360"/>
       </w:pPr>
       <w:rPr>
-        <w:rFonts w:hint="default" w:ascii="Courier New" w:hAnsi="Courier New" w:cs="Courier New"/>
+        <w:rFonts w:ascii="Courier New" w:hAnsi="Courier New" w:cs="Courier New" w:hint="default"/>
       </w:rPr>
     </w:lvl>
     <w:lvl w:ilvl="2" w:tplc="0C090005" w:tentative="1">
@@ -6197,7 +6517,7 @@
         <w:ind w:left="2160" w:hanging="360"/>
       </w:pPr>
       <w:rPr>
-        <w:rFonts w:hint="default" w:ascii="Wingdings" w:hAnsi="Wingdings"/>
+        <w:rFonts w:ascii="Wingdings" w:hAnsi="Wingdings" w:hint="default"/>
       </w:rPr>
     </w:lvl>
     <w:lvl w:ilvl="3" w:tplc="0C090001" w:tentative="1">
@@ -6209,7 +6529,7 @@
         <w:ind w:left="2880" w:hanging="360"/>
       </w:pPr>
       <w:rPr>
-        <w:rFonts w:hint="default" w:ascii="Symbol" w:hAnsi="Symbol"/>
+        <w:rFonts w:ascii="Symbol" w:hAnsi="Symbol" w:hint="default"/>
       </w:rPr>
     </w:lvl>
     <w:lvl w:ilvl="4" w:tplc="0C090003" w:tentative="1">
@@ -6221,7 +6541,7 @@
         <w:ind w:left="3600" w:hanging="360"/>
       </w:pPr>
       <w:rPr>
-        <w:rFonts w:hint="default" w:ascii="Courier New" w:hAnsi="Courier New" w:cs="Courier New"/>
+        <w:rFonts w:ascii="Courier New" w:hAnsi="Courier New" w:cs="Courier New" w:hint="default"/>
       </w:rPr>
     </w:lvl>
     <w:lvl w:ilvl="5" w:tplc="0C090005" w:tentative="1">
@@ -6233,7 +6553,7 @@
         <w:ind w:left="4320" w:hanging="360"/>
       </w:pPr>
       <w:rPr>
-        <w:rFonts w:hint="default" w:ascii="Wingdings" w:hAnsi="Wingdings"/>
+        <w:rFonts w:ascii="Wingdings" w:hAnsi="Wingdings" w:hint="default"/>
       </w:rPr>
     </w:lvl>
     <w:lvl w:ilvl="6" w:tplc="0C090001" w:tentative="1">
@@ -6245,7 +6565,7 @@
         <w:ind w:left="5040" w:hanging="360"/>
       </w:pPr>
       <w:rPr>
-        <w:rFonts w:hint="default" w:ascii="Symbol" w:hAnsi="Symbol"/>
+        <w:rFonts w:ascii="Symbol" w:hAnsi="Symbol" w:hint="default"/>
       </w:rPr>
     </w:lvl>
     <w:lvl w:ilvl="7" w:tplc="0C090003" w:tentative="1">
@@ -6257,7 +6577,7 @@
         <w:ind w:left="5760" w:hanging="360"/>
       </w:pPr>
       <w:rPr>
-        <w:rFonts w:hint="default" w:ascii="Courier New" w:hAnsi="Courier New" w:cs="Courier New"/>
+        <w:rFonts w:ascii="Courier New" w:hAnsi="Courier New" w:cs="Courier New" w:hint="default"/>
       </w:rPr>
     </w:lvl>
     <w:lvl w:ilvl="8" w:tplc="0C090005" w:tentative="1">
@@ -6269,7 +6589,7 @@
         <w:ind w:left="6480" w:hanging="360"/>
       </w:pPr>
       <w:rPr>
-        <w:rFonts w:hint="default" w:ascii="Wingdings" w:hAnsi="Wingdings"/>
+        <w:rFonts w:ascii="Wingdings" w:hAnsi="Wingdings" w:hint="default"/>
       </w:rPr>
     </w:lvl>
   </w:abstractNum>
@@ -6286,7 +6606,7 @@
         <w:ind w:left="720" w:hanging="360"/>
       </w:pPr>
       <w:rPr>
-        <w:rFonts w:hint="default" w:ascii="Symbol" w:hAnsi="Symbol"/>
+        <w:rFonts w:ascii="Symbol" w:hAnsi="Symbol" w:hint="default"/>
       </w:rPr>
     </w:lvl>
     <w:lvl w:ilvl="1" w:tplc="0C090003" w:tentative="1">
@@ -6298,7 +6618,7 @@
         <w:ind w:left="1440" w:hanging="360"/>
       </w:pPr>
       <w:rPr>
-        <w:rFonts w:hint="default" w:ascii="Courier New" w:hAnsi="Courier New" w:cs="Courier New"/>
+        <w:rFonts w:ascii="Courier New" w:hAnsi="Courier New" w:cs="Courier New" w:hint="default"/>
       </w:rPr>
     </w:lvl>
     <w:lvl w:ilvl="2" w:tplc="0C090005" w:tentative="1">
@@ -6310,7 +6630,7 @@
         <w:ind w:left="2160" w:hanging="360"/>
       </w:pPr>
       <w:rPr>
-        <w:rFonts w:hint="default" w:ascii="Wingdings" w:hAnsi="Wingdings"/>
+        <w:rFonts w:ascii="Wingdings" w:hAnsi="Wingdings" w:hint="default"/>
       </w:rPr>
     </w:lvl>
     <w:lvl w:ilvl="3" w:tplc="0C090001" w:tentative="1">
@@ -6322,7 +6642,7 @@
         <w:ind w:left="2880" w:hanging="360"/>
       </w:pPr>
       <w:rPr>
-        <w:rFonts w:hint="default" w:ascii="Symbol" w:hAnsi="Symbol"/>
+        <w:rFonts w:ascii="Symbol" w:hAnsi="Symbol" w:hint="default"/>
       </w:rPr>
     </w:lvl>
     <w:lvl w:ilvl="4" w:tplc="0C090003" w:tentative="1">
@@ -6334,7 +6654,7 @@
         <w:ind w:left="3600" w:hanging="360"/>
       </w:pPr>
       <w:rPr>
-        <w:rFonts w:hint="default" w:ascii="Courier New" w:hAnsi="Courier New" w:cs="Courier New"/>
+        <w:rFonts w:ascii="Courier New" w:hAnsi="Courier New" w:cs="Courier New" w:hint="default"/>
       </w:rPr>
     </w:lvl>
     <w:lvl w:ilvl="5" w:tplc="0C090005" w:tentative="1">
@@ -6346,7 +6666,7 @@
         <w:ind w:left="4320" w:hanging="360"/>
       </w:pPr>
       <w:rPr>
-        <w:rFonts w:hint="default" w:ascii="Wingdings" w:hAnsi="Wingdings"/>
+        <w:rFonts w:ascii="Wingdings" w:hAnsi="Wingdings" w:hint="default"/>
       </w:rPr>
     </w:lvl>
     <w:lvl w:ilvl="6" w:tplc="0C090001" w:tentative="1">
@@ -6358,7 +6678,7 @@
         <w:ind w:left="5040" w:hanging="360"/>
       </w:pPr>
       <w:rPr>
-        <w:rFonts w:hint="default" w:ascii="Symbol" w:hAnsi="Symbol"/>
+        <w:rFonts w:ascii="Symbol" w:hAnsi="Symbol" w:hint="default"/>
       </w:rPr>
     </w:lvl>
     <w:lvl w:ilvl="7" w:tplc="0C090003" w:tentative="1">
@@ -6370,7 +6690,7 @@
         <w:ind w:left="5760" w:hanging="360"/>
       </w:pPr>
       <w:rPr>
-        <w:rFonts w:hint="default" w:ascii="Courier New" w:hAnsi="Courier New" w:cs="Courier New"/>
+        <w:rFonts w:ascii="Courier New" w:hAnsi="Courier New" w:cs="Courier New" w:hint="default"/>
       </w:rPr>
     </w:lvl>
     <w:lvl w:ilvl="8" w:tplc="0C090005" w:tentative="1">
@@ -6382,7 +6702,7 @@
         <w:ind w:left="6480" w:hanging="360"/>
       </w:pPr>
       <w:rPr>
-        <w:rFonts w:hint="default" w:ascii="Wingdings" w:hAnsi="Wingdings"/>
+        <w:rFonts w:ascii="Wingdings" w:hAnsi="Wingdings" w:hint="default"/>
       </w:rPr>
     </w:lvl>
   </w:abstractNum>
@@ -6399,7 +6719,7 @@
         <w:ind w:left="720" w:hanging="360"/>
       </w:pPr>
       <w:rPr>
-        <w:rFonts w:hint="default" w:ascii="Symbol" w:hAnsi="Symbol"/>
+        <w:rFonts w:ascii="Symbol" w:hAnsi="Symbol" w:hint="default"/>
       </w:rPr>
     </w:lvl>
     <w:lvl w:ilvl="1" w:tplc="0C090003" w:tentative="1">
@@ -6411,7 +6731,7 @@
         <w:ind w:left="1440" w:hanging="360"/>
       </w:pPr>
       <w:rPr>
-        <w:rFonts w:hint="default" w:ascii="Courier New" w:hAnsi="Courier New" w:cs="Courier New"/>
+        <w:rFonts w:ascii="Courier New" w:hAnsi="Courier New" w:cs="Courier New" w:hint="default"/>
       </w:rPr>
     </w:lvl>
     <w:lvl w:ilvl="2" w:tplc="0C090005" w:tentative="1">
@@ -6423,7 +6743,7 @@
         <w:ind w:left="2160" w:hanging="360"/>
       </w:pPr>
       <w:rPr>
-        <w:rFonts w:hint="default" w:ascii="Wingdings" w:hAnsi="Wingdings"/>
+        <w:rFonts w:ascii="Wingdings" w:hAnsi="Wingdings" w:hint="default"/>
       </w:rPr>
     </w:lvl>
     <w:lvl w:ilvl="3" w:tplc="0C090001" w:tentative="1">
@@ -6435,7 +6755,7 @@
         <w:ind w:left="2880" w:hanging="360"/>
       </w:pPr>
       <w:rPr>
-        <w:rFonts w:hint="default" w:ascii="Symbol" w:hAnsi="Symbol"/>
+        <w:rFonts w:ascii="Symbol" w:hAnsi="Symbol" w:hint="default"/>
       </w:rPr>
     </w:lvl>
     <w:lvl w:ilvl="4" w:tplc="0C090003" w:tentative="1">
@@ -6447,7 +6767,7 @@
         <w:ind w:left="3600" w:hanging="360"/>
       </w:pPr>
       <w:rPr>
-        <w:rFonts w:hint="default" w:ascii="Courier New" w:hAnsi="Courier New" w:cs="Courier New"/>
+        <w:rFonts w:ascii="Courier New" w:hAnsi="Courier New" w:cs="Courier New" w:hint="default"/>
       </w:rPr>
     </w:lvl>
     <w:lvl w:ilvl="5" w:tplc="0C090005" w:tentative="1">
@@ -6459,7 +6779,7 @@
         <w:ind w:left="4320" w:hanging="360"/>
       </w:pPr>
       <w:rPr>
-        <w:rFonts w:hint="default" w:ascii="Wingdings" w:hAnsi="Wingdings"/>
+        <w:rFonts w:ascii="Wingdings" w:hAnsi="Wingdings" w:hint="default"/>
       </w:rPr>
     </w:lvl>
     <w:lvl w:ilvl="6" w:tplc="0C090001" w:tentative="1">
@@ -6471,7 +6791,7 @@
         <w:ind w:left="5040" w:hanging="360"/>
       </w:pPr>
       <w:rPr>
-        <w:rFonts w:hint="default" w:ascii="Symbol" w:hAnsi="Symbol"/>
+        <w:rFonts w:ascii="Symbol" w:hAnsi="Symbol" w:hint="default"/>
       </w:rPr>
     </w:lvl>
     <w:lvl w:ilvl="7" w:tplc="0C090003" w:tentative="1">
@@ -6483,7 +6803,7 @@
         <w:ind w:left="5760" w:hanging="360"/>
       </w:pPr>
       <w:rPr>
-        <w:rFonts w:hint="default" w:ascii="Courier New" w:hAnsi="Courier New" w:cs="Courier New"/>
+        <w:rFonts w:ascii="Courier New" w:hAnsi="Courier New" w:cs="Courier New" w:hint="default"/>
       </w:rPr>
     </w:lvl>
     <w:lvl w:ilvl="8" w:tplc="0C090005" w:tentative="1">
@@ -6495,7 +6815,7 @@
         <w:ind w:left="6480" w:hanging="360"/>
       </w:pPr>
       <w:rPr>
-        <w:rFonts w:hint="default" w:ascii="Wingdings" w:hAnsi="Wingdings"/>
+        <w:rFonts w:ascii="Wingdings" w:hAnsi="Wingdings" w:hint="default"/>
       </w:rPr>
     </w:lvl>
   </w:abstractNum>
@@ -6511,7 +6831,7 @@
         <w:ind w:left="440" w:hanging="360"/>
       </w:pPr>
       <w:rPr>
-        <w:rFonts w:hint="default" w:ascii="Arial" w:hAnsi="Arial" w:cs="Arial" w:eastAsiaTheme="minorHAnsi"/>
+        <w:rFonts w:ascii="Arial" w:eastAsiaTheme="minorHAnsi" w:hAnsi="Arial" w:cs="Arial" w:hint="default"/>
         <w:sz w:val="16"/>
       </w:rPr>
     </w:lvl>
@@ -6524,7 +6844,7 @@
         <w:ind w:left="1160" w:hanging="360"/>
       </w:pPr>
       <w:rPr>
-        <w:rFonts w:hint="default" w:ascii="Courier New" w:hAnsi="Courier New" w:cs="Courier New"/>
+        <w:rFonts w:ascii="Courier New" w:hAnsi="Courier New" w:cs="Courier New" w:hint="default"/>
       </w:rPr>
     </w:lvl>
     <w:lvl w:ilvl="2" w:tplc="08090005" w:tentative="1">
@@ -6536,7 +6856,7 @@
         <w:ind w:left="1880" w:hanging="360"/>
       </w:pPr>
       <w:rPr>
-        <w:rFonts w:hint="default" w:ascii="Wingdings" w:hAnsi="Wingdings"/>
+        <w:rFonts w:ascii="Wingdings" w:hAnsi="Wingdings" w:hint="default"/>
       </w:rPr>
     </w:lvl>
     <w:lvl w:ilvl="3" w:tplc="08090001" w:tentative="1">
@@ -6548,7 +6868,7 @@
         <w:ind w:left="2600" w:hanging="360"/>
       </w:pPr>
       <w:rPr>
-        <w:rFonts w:hint="default" w:ascii="Symbol" w:hAnsi="Symbol"/>
+        <w:rFonts w:ascii="Symbol" w:hAnsi="Symbol" w:hint="default"/>
       </w:rPr>
     </w:lvl>
     <w:lvl w:ilvl="4" w:tplc="08090003" w:tentative="1">
@@ -6560,7 +6880,7 @@
         <w:ind w:left="3320" w:hanging="360"/>
       </w:pPr>
       <w:rPr>
-        <w:rFonts w:hint="default" w:ascii="Courier New" w:hAnsi="Courier New" w:cs="Courier New"/>
+        <w:rFonts w:ascii="Courier New" w:hAnsi="Courier New" w:cs="Courier New" w:hint="default"/>
       </w:rPr>
     </w:lvl>
     <w:lvl w:ilvl="5" w:tplc="08090005" w:tentative="1">
@@ -6572,7 +6892,7 @@
         <w:ind w:left="4040" w:hanging="360"/>
       </w:pPr>
       <w:rPr>
-        <w:rFonts w:hint="default" w:ascii="Wingdings" w:hAnsi="Wingdings"/>
+        <w:rFonts w:ascii="Wingdings" w:hAnsi="Wingdings" w:hint="default"/>
       </w:rPr>
     </w:lvl>
     <w:lvl w:ilvl="6" w:tplc="08090001" w:tentative="1">
@@ -6584,7 +6904,7 @@
         <w:ind w:left="4760" w:hanging="360"/>
       </w:pPr>
       <w:rPr>
-        <w:rFonts w:hint="default" w:ascii="Symbol" w:hAnsi="Symbol"/>
+        <w:rFonts w:ascii="Symbol" w:hAnsi="Symbol" w:hint="default"/>
       </w:rPr>
     </w:lvl>
     <w:lvl w:ilvl="7" w:tplc="08090003" w:tentative="1">
@@ -6596,7 +6916,7 @@
         <w:ind w:left="5480" w:hanging="360"/>
       </w:pPr>
       <w:rPr>
-        <w:rFonts w:hint="default" w:ascii="Courier New" w:hAnsi="Courier New" w:cs="Courier New"/>
+        <w:rFonts w:ascii="Courier New" w:hAnsi="Courier New" w:cs="Courier New" w:hint="default"/>
       </w:rPr>
     </w:lvl>
     <w:lvl w:ilvl="8" w:tplc="08090005" w:tentative="1">
@@ -6608,7 +6928,7 @@
         <w:ind w:left="6200" w:hanging="360"/>
       </w:pPr>
       <w:rPr>
-        <w:rFonts w:hint="default" w:ascii="Wingdings" w:hAnsi="Wingdings"/>
+        <w:rFonts w:ascii="Wingdings" w:hAnsi="Wingdings" w:hint="default"/>
       </w:rPr>
     </w:lvl>
   </w:abstractNum>
@@ -6647,11 +6967,11 @@
 </file>
 
 <file path=word/styles.xml><?xml version="1.0" encoding="utf-8"?>
-<w:styles xmlns:wp14="http://schemas.microsoft.com/office/word/2010/wordprocessingDrawing" xmlns:mc="http://schemas.openxmlformats.org/markup-compatibility/2006" xmlns:r="http://schemas.openxmlformats.org/officeDocument/2006/relationships" xmlns:w="http://schemas.openxmlformats.org/wordprocessingml/2006/main" xmlns:w14="http://schemas.microsoft.com/office/word/2010/wordml" xmlns:w15="http://schemas.microsoft.com/office/word/2012/wordml" xmlns:w16cex="http://schemas.microsoft.com/office/word/2018/wordml/cex" xmlns:w16cid="http://schemas.microsoft.com/office/word/2016/wordml/cid" xmlns:w16="http://schemas.microsoft.com/office/word/2018/wordml" xmlns:w16sdtdh="http://schemas.microsoft.com/office/word/2020/wordml/sdtdatahash" xmlns:w16sdtfl="http://schemas.microsoft.com/office/word/2024/wordml/sdtformatlock" xmlns:w16se="http://schemas.microsoft.com/office/word/2015/wordml/symex" xmlns:w16du="http://schemas.microsoft.com/office/word/2023/wordml/word16du" mc:Ignorable="w14 w15 w16se w16cid w16 w16cex w16sdtdh w16sdtfl w16du wp14">
+<w:styles xmlns:mc="http://schemas.openxmlformats.org/markup-compatibility/2006" xmlns:r="http://schemas.openxmlformats.org/officeDocument/2006/relationships" xmlns:w="http://schemas.openxmlformats.org/wordprocessingml/2006/main" xmlns:w14="http://schemas.microsoft.com/office/word/2010/wordml" xmlns:w15="http://schemas.microsoft.com/office/word/2012/wordml" xmlns:w16cex="http://schemas.microsoft.com/office/word/2018/wordml/cex" xmlns:w16cid="http://schemas.microsoft.com/office/word/2016/wordml/cid" xmlns:w16="http://schemas.microsoft.com/office/word/2018/wordml" xmlns:w16du="http://schemas.microsoft.com/office/word/2023/wordml/word16du" xmlns:w16sdtdh="http://schemas.microsoft.com/office/word/2020/wordml/sdtdatahash" xmlns:w16sdtfl="http://schemas.microsoft.com/office/word/2024/wordml/sdtformatlock" xmlns:w16se="http://schemas.microsoft.com/office/word/2015/wordml/symex" mc:Ignorable="w14 w15 w16se w16cid w16 w16cex w16sdtdh w16sdtfl w16du">
   <w:docDefaults>
     <w:rPrDefault>
       <w:rPr>
-        <w:rFonts w:asciiTheme="minorHAnsi" w:hAnsiTheme="minorHAnsi" w:eastAsiaTheme="minorHAnsi" w:cstheme="minorBidi"/>
+        <w:rFonts w:asciiTheme="minorHAnsi" w:eastAsiaTheme="minorHAnsi" w:hAnsiTheme="minorHAnsi" w:cstheme="minorBidi"/>
         <w:sz w:val="22"/>
         <w:szCs w:val="22"/>
         <w:lang w:val="en-AU" w:eastAsia="en-US" w:bidi="ar-SA"/>
@@ -6666,14 +6986,14 @@
   <w:latentStyles w:defLockedState="0" w:defUIPriority="99" w:defSemiHidden="0" w:defUnhideWhenUsed="0" w:defQFormat="0" w:count="376">
     <w:lsdException w:name="Normal" w:uiPriority="0" w:qFormat="1"/>
     <w:lsdException w:name="heading 1" w:uiPriority="9" w:qFormat="1"/>
-    <w:lsdException w:name="heading 2" w:uiPriority="9" w:semiHidden="1" w:unhideWhenUsed="1" w:qFormat="1"/>
-    <w:lsdException w:name="heading 3" w:uiPriority="9" w:semiHidden="1" w:unhideWhenUsed="1" w:qFormat="1"/>
-    <w:lsdException w:name="heading 4" w:uiPriority="9" w:semiHidden="1" w:unhideWhenUsed="1"/>
-    <w:lsdException w:name="heading 5" w:uiPriority="9" w:semiHidden="1" w:unhideWhenUsed="1"/>
-    <w:lsdException w:name="heading 6" w:uiPriority="9" w:semiHidden="1" w:unhideWhenUsed="1" w:qFormat="1"/>
-    <w:lsdException w:name="heading 7" w:uiPriority="9" w:semiHidden="1" w:unhideWhenUsed="1" w:qFormat="1"/>
-    <w:lsdException w:name="heading 8" w:uiPriority="9" w:semiHidden="1" w:unhideWhenUsed="1" w:qFormat="1"/>
-    <w:lsdException w:name="heading 9" w:uiPriority="9" w:semiHidden="1" w:unhideWhenUsed="1" w:qFormat="1"/>
+    <w:lsdException w:name="heading 2" w:semiHidden="1" w:uiPriority="9" w:unhideWhenUsed="1" w:qFormat="1"/>
+    <w:lsdException w:name="heading 3" w:semiHidden="1" w:uiPriority="9" w:unhideWhenUsed="1" w:qFormat="1"/>
+    <w:lsdException w:name="heading 4" w:semiHidden="1" w:uiPriority="9" w:unhideWhenUsed="1"/>
+    <w:lsdException w:name="heading 5" w:semiHidden="1" w:uiPriority="9" w:unhideWhenUsed="1"/>
+    <w:lsdException w:name="heading 6" w:semiHidden="1" w:uiPriority="9" w:unhideWhenUsed="1" w:qFormat="1"/>
+    <w:lsdException w:name="heading 7" w:semiHidden="1" w:uiPriority="9" w:unhideWhenUsed="1" w:qFormat="1"/>
+    <w:lsdException w:name="heading 8" w:semiHidden="1" w:uiPriority="9" w:unhideWhenUsed="1" w:qFormat="1"/>
+    <w:lsdException w:name="heading 9" w:semiHidden="1" w:uiPriority="9" w:unhideWhenUsed="1" w:qFormat="1"/>
     <w:lsdException w:name="index 1" w:semiHidden="1" w:unhideWhenUsed="1"/>
     <w:lsdException w:name="index 2" w:semiHidden="1" w:unhideWhenUsed="1"/>
     <w:lsdException w:name="index 3" w:semiHidden="1" w:unhideWhenUsed="1"/>
@@ -6683,22 +7003,22 @@
     <w:lsdException w:name="index 7" w:semiHidden="1" w:unhideWhenUsed="1"/>
     <w:lsdException w:name="index 8" w:semiHidden="1" w:unhideWhenUsed="1"/>
     <w:lsdException w:name="index 9" w:semiHidden="1" w:unhideWhenUsed="1"/>
-    <w:lsdException w:name="toc 1" w:uiPriority="39" w:semiHidden="1" w:unhideWhenUsed="1"/>
-    <w:lsdException w:name="toc 2" w:uiPriority="39" w:semiHidden="1" w:unhideWhenUsed="1"/>
-    <w:lsdException w:name="toc 3" w:uiPriority="39" w:semiHidden="1" w:unhideWhenUsed="1"/>
-    <w:lsdException w:name="toc 4" w:uiPriority="39" w:semiHidden="1" w:unhideWhenUsed="1"/>
-    <w:lsdException w:name="toc 5" w:uiPriority="39" w:semiHidden="1" w:unhideWhenUsed="1"/>
-    <w:lsdException w:name="toc 6" w:uiPriority="39" w:semiHidden="1" w:unhideWhenUsed="1"/>
-    <w:lsdException w:name="toc 7" w:uiPriority="39" w:semiHidden="1" w:unhideWhenUsed="1"/>
-    <w:lsdException w:name="toc 8" w:uiPriority="39" w:semiHidden="1" w:unhideWhenUsed="1"/>
-    <w:lsdException w:name="toc 9" w:uiPriority="39" w:semiHidden="1" w:unhideWhenUsed="1"/>
+    <w:lsdException w:name="toc 1" w:semiHidden="1" w:uiPriority="39" w:unhideWhenUsed="1"/>
+    <w:lsdException w:name="toc 2" w:semiHidden="1" w:uiPriority="39" w:unhideWhenUsed="1"/>
+    <w:lsdException w:name="toc 3" w:semiHidden="1" w:uiPriority="39" w:unhideWhenUsed="1"/>
+    <w:lsdException w:name="toc 4" w:semiHidden="1" w:uiPriority="39" w:unhideWhenUsed="1"/>
+    <w:lsdException w:name="toc 5" w:semiHidden="1" w:uiPriority="39" w:unhideWhenUsed="1"/>
+    <w:lsdException w:name="toc 6" w:semiHidden="1" w:uiPriority="39" w:unhideWhenUsed="1"/>
+    <w:lsdException w:name="toc 7" w:semiHidden="1" w:uiPriority="39" w:unhideWhenUsed="1"/>
+    <w:lsdException w:name="toc 8" w:semiHidden="1" w:uiPriority="39" w:unhideWhenUsed="1"/>
+    <w:lsdException w:name="toc 9" w:semiHidden="1" w:uiPriority="39" w:unhideWhenUsed="1"/>
     <w:lsdException w:name="Normal Indent" w:semiHidden="1" w:unhideWhenUsed="1"/>
     <w:lsdException w:name="footnote text" w:semiHidden="1" w:unhideWhenUsed="1"/>
     <w:lsdException w:name="annotation text" w:semiHidden="1" w:unhideWhenUsed="1"/>
     <w:lsdException w:name="header" w:semiHidden="1" w:unhideWhenUsed="1"/>
     <w:lsdException w:name="footer" w:semiHidden="1" w:unhideWhenUsed="1" w:qFormat="1"/>
     <w:lsdException w:name="index heading" w:semiHidden="1" w:unhideWhenUsed="1"/>
-    <w:lsdException w:name="caption" w:uiPriority="35" w:semiHidden="1" w:unhideWhenUsed="1" w:qFormat="1"/>
+    <w:lsdException w:name="caption" w:semiHidden="1" w:uiPriority="35" w:unhideWhenUsed="1" w:qFormat="1"/>
     <w:lsdException w:name="table of figures" w:semiHidden="1" w:unhideWhenUsed="1"/>
     <w:lsdException w:name="envelope address" w:semiHidden="1" w:unhideWhenUsed="1"/>
     <w:lsdException w:name="envelope return" w:semiHidden="1" w:unhideWhenUsed="1"/>
@@ -6729,7 +7049,7 @@
     <w:lsdException w:name="Title" w:uiPriority="10"/>
     <w:lsdException w:name="Closing" w:semiHidden="1" w:unhideWhenUsed="1"/>
     <w:lsdException w:name="Signature" w:semiHidden="1" w:unhideWhenUsed="1"/>
-    <w:lsdException w:name="Default Paragraph Font" w:uiPriority="1" w:semiHidden="1" w:unhideWhenUsed="1"/>
+    <w:lsdException w:name="Default Paragraph Font" w:semiHidden="1" w:uiPriority="1" w:unhideWhenUsed="1"/>
     <w:lsdException w:name="Body Text" w:semiHidden="1" w:unhideWhenUsed="1"/>
     <w:lsdException w:name="Body Text Indent" w:semiHidden="1" w:unhideWhenUsed="1"/>
     <w:lsdException w:name="List Continue" w:semiHidden="1" w:unhideWhenUsed="1"/>
@@ -6929,8 +7249,8 @@
     <w:lsdException w:name="Subtle Reference" w:uiPriority="31"/>
     <w:lsdException w:name="Intense Reference" w:uiPriority="32"/>
     <w:lsdException w:name="Book Title" w:uiPriority="33"/>
-    <w:lsdException w:name="Bibliography" w:uiPriority="37" w:semiHidden="1" w:unhideWhenUsed="1"/>
-    <w:lsdException w:name="TOC Heading" w:uiPriority="39" w:semiHidden="1" w:unhideWhenUsed="1" w:qFormat="1"/>
+    <w:lsdException w:name="Bibliography" w:semiHidden="1" w:uiPriority="37" w:unhideWhenUsed="1"/>
+    <w:lsdException w:name="TOC Heading" w:semiHidden="1" w:uiPriority="39" w:unhideWhenUsed="1" w:qFormat="1"/>
     <w:lsdException w:name="Plain Table 1" w:uiPriority="41"/>
     <w:lsdException w:name="Plain Table 2" w:uiPriority="42"/>
     <w:lsdException w:name="Plain Table 3" w:uiPriority="43"/>
@@ -7041,7 +7361,7 @@
     <w:lsdException w:name="Unresolved Mention" w:semiHidden="1" w:unhideWhenUsed="1"/>
     <w:lsdException w:name="Smart Link" w:semiHidden="1" w:unhideWhenUsed="1"/>
   </w:latentStyles>
-  <w:style w:type="paragraph" w:styleId="Normal" w:default="1">
+  <w:style w:type="paragraph" w:default="1" w:styleId="Normal">
     <w:name w:val="Normal"/>
     <w:qFormat/>
     <w:rsid w:val="00BD6938"/>
@@ -7112,13 +7432,12 @@
       <w:b/>
     </w:rPr>
   </w:style>
-  <w:style w:type="character" w:styleId="DefaultParagraphFont" w:default="1">
+  <w:style w:type="character" w:default="1" w:styleId="DefaultParagraphFont">
     <w:name w:val="Default Paragraph Font"/>
     <w:uiPriority w:val="1"/>
-    <w:semiHidden/>
     <w:unhideWhenUsed/>
   </w:style>
-  <w:style w:type="table" w:styleId="TableNormal" w:default="1">
+  <w:style w:type="table" w:default="1" w:styleId="TableNormal">
     <w:name w:val="Normal Table"/>
     <w:uiPriority w:val="99"/>
     <w:semiHidden/>
@@ -7133,13 +7452,13 @@
       </w:tblCellMar>
     </w:tblPr>
   </w:style>
-  <w:style w:type="numbering" w:styleId="NoList" w:default="1">
+  <w:style w:type="numbering" w:default="1" w:styleId="NoList">
     <w:name w:val="No List"/>
     <w:uiPriority w:val="99"/>
     <w:semiHidden/>
     <w:unhideWhenUsed/>
   </w:style>
-  <w:style w:type="character" w:styleId="Heading1Char" w:customStyle="1">
+  <w:style w:type="character" w:customStyle="1" w:styleId="Heading1Char">
     <w:name w:val="Heading 1 Char"/>
     <w:basedOn w:val="DefaultParagraphFont"/>
     <w:link w:val="Heading1"/>
@@ -7214,7 +7533,7 @@
       <w:szCs w:val="16"/>
     </w:rPr>
   </w:style>
-  <w:style w:type="character" w:styleId="BalloonTextChar" w:customStyle="1">
+  <w:style w:type="character" w:customStyle="1" w:styleId="BalloonTextChar">
     <w:name w:val="Balloon Text Char"/>
     <w:basedOn w:val="DefaultParagraphFont"/>
     <w:link w:val="BalloonText"/>
@@ -7227,7 +7546,7 @@
       <w:szCs w:val="16"/>
     </w:rPr>
   </w:style>
-  <w:style w:type="character" w:styleId="Heading2Char" w:customStyle="1">
+  <w:style w:type="character" w:customStyle="1" w:styleId="Heading2Char">
     <w:name w:val="Heading 2 Char"/>
     <w:basedOn w:val="DefaultParagraphFont"/>
     <w:link w:val="Heading2"/>
@@ -7255,7 +7574,7 @@
       <w:ind w:left="221"/>
     </w:pPr>
   </w:style>
-  <w:style w:type="character" w:styleId="Heading3Char" w:customStyle="1">
+  <w:style w:type="character" w:customStyle="1" w:styleId="Heading3Char">
     <w:name w:val="Heading 3 Char"/>
     <w:basedOn w:val="DefaultParagraphFont"/>
     <w:link w:val="Heading3"/>
@@ -7265,7 +7584,7 @@
       <w:b/>
     </w:rPr>
   </w:style>
-  <w:style w:type="character" w:styleId="Heading4Char" w:customStyle="1">
+  <w:style w:type="character" w:customStyle="1" w:styleId="Heading4Char">
     <w:name w:val="Heading 4 Char"/>
     <w:basedOn w:val="DefaultParagraphFont"/>
     <w:link w:val="Heading4"/>
@@ -7295,12 +7614,12 @@
     </w:pPr>
     <w:tblPr>
       <w:tblBorders>
-        <w:top w:val="single" w:color="auto" w:sz="4" w:space="0"/>
-        <w:left w:val="single" w:color="auto" w:sz="4" w:space="0"/>
-        <w:bottom w:val="single" w:color="auto" w:sz="4" w:space="0"/>
-        <w:right w:val="single" w:color="auto" w:sz="4" w:space="0"/>
-        <w:insideH w:val="single" w:color="auto" w:sz="4" w:space="0"/>
-        <w:insideV w:val="single" w:color="auto" w:sz="4" w:space="0"/>
+        <w:top w:val="single" w:sz="4" w:space="0" w:color="auto"/>
+        <w:left w:val="single" w:sz="4" w:space="0" w:color="auto"/>
+        <w:bottom w:val="single" w:sz="4" w:space="0" w:color="auto"/>
+        <w:right w:val="single" w:sz="4" w:space="0" w:color="auto"/>
+        <w:insideH w:val="single" w:sz="4" w:space="0" w:color="auto"/>
+        <w:insideV w:val="single" w:sz="4" w:space="0" w:color="auto"/>
       </w:tblBorders>
     </w:tblPr>
   </w:style>
@@ -7331,7 +7650,7 @@
       </w:tabs>
     </w:pPr>
   </w:style>
-  <w:style w:type="character" w:styleId="HeaderChar" w:customStyle="1">
+  <w:style w:type="character" w:customStyle="1" w:styleId="HeaderChar">
     <w:name w:val="Header Char"/>
     <w:basedOn w:val="DefaultParagraphFont"/>
     <w:link w:val="Header"/>
@@ -7351,7 +7670,7 @@
       <w:szCs w:val="16"/>
     </w:rPr>
   </w:style>
-  <w:style w:type="character" w:styleId="FooterChar" w:customStyle="1">
+  <w:style w:type="character" w:customStyle="1" w:styleId="FooterChar">
     <w:name w:val="Footer Char"/>
     <w:basedOn w:val="DefaultParagraphFont"/>
     <w:link w:val="Footer"/>
@@ -7363,7 +7682,7 @@
     </w:rPr>
   </w:style>
   <w:style w:type="character" w:styleId="CommentReference">
-    <w:name w:val="Comment Reference"/>
+    <w:name w:val="annotation reference"/>
     <w:basedOn w:val="DefaultParagraphFont"/>
     <w:uiPriority w:val="99"/>
     <w:semiHidden/>
@@ -7375,7 +7694,7 @@
     </w:rPr>
   </w:style>
   <w:style w:type="paragraph" w:styleId="CommentText">
-    <w:name w:val="Comment Text"/>
+    <w:name w:val="annotation text"/>
     <w:basedOn w:val="Normal"/>
     <w:link w:val="CommentTextChar"/>
     <w:uiPriority w:val="99"/>
@@ -7385,7 +7704,7 @@
       <w:szCs w:val="20"/>
     </w:rPr>
   </w:style>
-  <w:style w:type="character" w:styleId="CommentTextChar" w:customStyle="1">
+  <w:style w:type="character" w:customStyle="1" w:styleId="CommentTextChar">
     <w:name w:val="Comment Text Char"/>
     <w:basedOn w:val="DefaultParagraphFont"/>
     <w:link w:val="CommentText"/>
@@ -7397,7 +7716,7 @@
     </w:rPr>
   </w:style>
   <w:style w:type="paragraph" w:styleId="CommentSubject">
-    <w:name w:val="Comment Subject"/>
+    <w:name w:val="annotation subject"/>
     <w:basedOn w:val="CommentText"/>
     <w:next w:val="CommentText"/>
     <w:link w:val="CommentSubjectChar"/>
@@ -7410,7 +7729,7 @@
       <w:bCs/>
     </w:rPr>
   </w:style>
-  <w:style w:type="character" w:styleId="CommentSubjectChar" w:customStyle="1">
+  <w:style w:type="character" w:customStyle="1" w:styleId="CommentSubjectChar">
     <w:name w:val="Comment Subject Char"/>
     <w:basedOn w:val="CommentTextChar"/>
     <w:link w:val="CommentSubject"/>
@@ -7424,7 +7743,7 @@
       <w:szCs w:val="20"/>
     </w:rPr>
   </w:style>
-  <w:style w:type="table" w:styleId="TableGrid1" w:customStyle="1">
+  <w:style w:type="table" w:customStyle="1" w:styleId="TableGrid1">
     <w:name w:val="Table Grid1"/>
     <w:basedOn w:val="TableNormal"/>
     <w:next w:val="TableGrid"/>
@@ -7435,12 +7754,12 @@
     </w:pPr>
     <w:tblPr>
       <w:tblBorders>
-        <w:top w:val="single" w:color="auto" w:sz="4" w:space="0"/>
-        <w:left w:val="single" w:color="auto" w:sz="4" w:space="0"/>
-        <w:bottom w:val="single" w:color="auto" w:sz="4" w:space="0"/>
-        <w:right w:val="single" w:color="auto" w:sz="4" w:space="0"/>
-        <w:insideH w:val="single" w:color="auto" w:sz="4" w:space="0"/>
-        <w:insideV w:val="single" w:color="auto" w:sz="4" w:space="0"/>
+        <w:top w:val="single" w:sz="4" w:space="0" w:color="auto"/>
+        <w:left w:val="single" w:sz="4" w:space="0" w:color="auto"/>
+        <w:bottom w:val="single" w:sz="4" w:space="0" w:color="auto"/>
+        <w:right w:val="single" w:sz="4" w:space="0" w:color="auto"/>
+        <w:insideH w:val="single" w:sz="4" w:space="0" w:color="auto"/>
+        <w:insideV w:val="single" w:sz="4" w:space="0" w:color="auto"/>
       </w:tblBorders>
     </w:tblPr>
   </w:style>
@@ -7453,13 +7772,13 @@
     <w:rsid w:val="00C64447"/>
     <w:pPr>
       <w:pBdr>
-        <w:bottom w:val="single" w:color="4F81BD" w:themeColor="accent1" w:sz="8" w:space="4"/>
+        <w:bottom w:val="single" w:sz="8" w:space="4" w:color="4F81BD" w:themeColor="accent1"/>
       </w:pBdr>
       <w:spacing w:after="300"/>
       <w:contextualSpacing/>
     </w:pPr>
     <w:rPr>
-      <w:rFonts w:asciiTheme="majorHAnsi" w:hAnsiTheme="majorHAnsi" w:eastAsiaTheme="majorEastAsia" w:cstheme="majorBidi"/>
+      <w:rFonts w:asciiTheme="majorHAnsi" w:eastAsiaTheme="majorEastAsia" w:hAnsiTheme="majorHAnsi" w:cstheme="majorBidi"/>
       <w:color w:val="17365D" w:themeColor="text2" w:themeShade="BF"/>
       <w:spacing w:val="5"/>
       <w:kern w:val="28"/>
@@ -7467,14 +7786,14 @@
       <w:szCs w:val="52"/>
     </w:rPr>
   </w:style>
-  <w:style w:type="character" w:styleId="TitleChar" w:customStyle="1">
+  <w:style w:type="character" w:customStyle="1" w:styleId="TitleChar">
     <w:name w:val="Title Char"/>
     <w:basedOn w:val="DefaultParagraphFont"/>
     <w:link w:val="Title"/>
     <w:uiPriority w:val="10"/>
     <w:rsid w:val="00C64447"/>
     <w:rPr>
-      <w:rFonts w:asciiTheme="majorHAnsi" w:hAnsiTheme="majorHAnsi" w:eastAsiaTheme="majorEastAsia" w:cstheme="majorBidi"/>
+      <w:rFonts w:asciiTheme="majorHAnsi" w:eastAsiaTheme="majorEastAsia" w:hAnsiTheme="majorHAnsi" w:cstheme="majorBidi"/>
       <w:color w:val="17365D" w:themeColor="text2" w:themeShade="BF"/>
       <w:spacing w:val="5"/>
       <w:kern w:val="28"/>
@@ -7482,7 +7801,7 @@
       <w:szCs w:val="52"/>
     </w:rPr>
   </w:style>
-  <w:style w:type="table" w:styleId="TableGrid2" w:customStyle="1">
+  <w:style w:type="table" w:customStyle="1" w:styleId="TableGrid2">
     <w:name w:val="Table Grid2"/>
     <w:basedOn w:val="TableNormal"/>
     <w:next w:val="TableGrid"/>
@@ -7493,12 +7812,12 @@
     </w:pPr>
     <w:tblPr>
       <w:tblBorders>
-        <w:top w:val="single" w:color="auto" w:sz="4" w:space="0"/>
-        <w:left w:val="single" w:color="auto" w:sz="4" w:space="0"/>
-        <w:bottom w:val="single" w:color="auto" w:sz="4" w:space="0"/>
-        <w:right w:val="single" w:color="auto" w:sz="4" w:space="0"/>
-        <w:insideH w:val="single" w:color="auto" w:sz="4" w:space="0"/>
-        <w:insideV w:val="single" w:color="auto" w:sz="4" w:space="0"/>
+        <w:top w:val="single" w:sz="4" w:space="0" w:color="auto"/>
+        <w:left w:val="single" w:sz="4" w:space="0" w:color="auto"/>
+        <w:bottom w:val="single" w:sz="4" w:space="0" w:color="auto"/>
+        <w:right w:val="single" w:sz="4" w:space="0" w:color="auto"/>
+        <w:insideH w:val="single" w:sz="4" w:space="0" w:color="auto"/>
+        <w:insideV w:val="single" w:sz="4" w:space="0" w:color="auto"/>
       </w:tblBorders>
     </w:tblPr>
   </w:style>
@@ -7614,7 +7933,7 @@
       <w:spacing w:after="0" w:line="240" w:lineRule="auto"/>
     </w:pPr>
   </w:style>
-  <w:style w:type="table" w:styleId="TableGrid3" w:customStyle="1">
+  <w:style w:type="table" w:customStyle="1" w:styleId="TableGrid3">
     <w:name w:val="Table Grid3"/>
     <w:basedOn w:val="TableNormal"/>
     <w:next w:val="TableGrid"/>
@@ -7625,16 +7944,16 @@
     </w:pPr>
     <w:tblPr>
       <w:tblBorders>
-        <w:top w:val="single" w:color="auto" w:sz="4" w:space="0"/>
-        <w:left w:val="single" w:color="auto" w:sz="4" w:space="0"/>
-        <w:bottom w:val="single" w:color="auto" w:sz="4" w:space="0"/>
-        <w:right w:val="single" w:color="auto" w:sz="4" w:space="0"/>
-        <w:insideH w:val="single" w:color="auto" w:sz="4" w:space="0"/>
-        <w:insideV w:val="single" w:color="auto" w:sz="4" w:space="0"/>
+        <w:top w:val="single" w:sz="4" w:space="0" w:color="auto"/>
+        <w:left w:val="single" w:sz="4" w:space="0" w:color="auto"/>
+        <w:bottom w:val="single" w:sz="4" w:space="0" w:color="auto"/>
+        <w:right w:val="single" w:sz="4" w:space="0" w:color="auto"/>
+        <w:insideH w:val="single" w:sz="4" w:space="0" w:color="auto"/>
+        <w:insideV w:val="single" w:sz="4" w:space="0" w:color="auto"/>
       </w:tblBorders>
     </w:tblPr>
   </w:style>
-  <w:style w:type="table" w:styleId="TableGrid31" w:customStyle="1">
+  <w:style w:type="table" w:customStyle="1" w:styleId="TableGrid31">
     <w:name w:val="Table Grid31"/>
     <w:basedOn w:val="TableNormal"/>
     <w:next w:val="TableGrid"/>
@@ -7645,16 +7964,16 @@
     </w:pPr>
     <w:tblPr>
       <w:tblBorders>
-        <w:top w:val="single" w:color="auto" w:sz="4" w:space="0"/>
-        <w:left w:val="single" w:color="auto" w:sz="4" w:space="0"/>
-        <w:bottom w:val="single" w:color="auto" w:sz="4" w:space="0"/>
-        <w:right w:val="single" w:color="auto" w:sz="4" w:space="0"/>
-        <w:insideH w:val="single" w:color="auto" w:sz="4" w:space="0"/>
-        <w:insideV w:val="single" w:color="auto" w:sz="4" w:space="0"/>
+        <w:top w:val="single" w:sz="4" w:space="0" w:color="auto"/>
+        <w:left w:val="single" w:sz="4" w:space="0" w:color="auto"/>
+        <w:bottom w:val="single" w:sz="4" w:space="0" w:color="auto"/>
+        <w:right w:val="single" w:sz="4" w:space="0" w:color="auto"/>
+        <w:insideH w:val="single" w:sz="4" w:space="0" w:color="auto"/>
+        <w:insideV w:val="single" w:sz="4" w:space="0" w:color="auto"/>
       </w:tblBorders>
     </w:tblPr>
   </w:style>
-  <w:style w:type="paragraph" w:styleId="Assessortext" w:customStyle="1">
+  <w:style w:type="paragraph" w:customStyle="1" w:styleId="Assessortext">
     <w:name w:val="Assessor text"/>
     <w:basedOn w:val="NoSpacing"/>
     <w:link w:val="AssessortextChar"/>
@@ -7664,14 +7983,14 @@
       <w:color w:val="1F497D" w:themeColor="text2"/>
     </w:rPr>
   </w:style>
-  <w:style w:type="character" w:styleId="NoSpacingChar" w:customStyle="1">
+  <w:style w:type="character" w:customStyle="1" w:styleId="NoSpacingChar">
     <w:name w:val="No Spacing Char"/>
     <w:basedOn w:val="DefaultParagraphFont"/>
     <w:link w:val="NoSpacing"/>
     <w:uiPriority w:val="1"/>
     <w:rsid w:val="00BD6938"/>
   </w:style>
-  <w:style w:type="character" w:styleId="AssessortextChar" w:customStyle="1">
+  <w:style w:type="character" w:customStyle="1" w:styleId="AssessortextChar">
     <w:name w:val="Assessor text Char"/>
     <w:basedOn w:val="NoSpacingChar"/>
     <w:link w:val="Assessortext"/>
@@ -7969,15 +8288,16 @@
 </file>
 
 <file path=customXml/item1.xml><?xml version="1.0" encoding="utf-8"?>
-<?mso-contentType ?>
-<FormTemplates xmlns="http://schemas.microsoft.com/sharepoint/v3/contenttype/forms">
-  <Display>DocumentLibraryForm</Display>
-  <Edit>DocumentLibraryForm</Edit>
-  <New>DocumentLibraryForm</New>
-</FormTemplates>
+<p:properties xmlns:p="http://schemas.microsoft.com/office/2006/metadata/properties" xmlns:xsi="http://www.w3.org/2001/XMLSchema-instance" xmlns:pc="http://schemas.microsoft.com/office/infopath/2007/PartnerControls">
+  <documentManagement/>
+</p:properties>
 </file>
 
 <file path=customXml/item2.xml><?xml version="1.0" encoding="utf-8"?>
+<b:Sources xmlns:b="http://schemas.openxmlformats.org/officeDocument/2006/bibliography" xmlns="http://schemas.openxmlformats.org/officeDocument/2006/bibliography" SelectedStyle="\APA.XSL" StyleName="APA"/>
+</file>
+
+<file path=customXml/item3.xml><?xml version="1.0" encoding="utf-8"?>
 <ct:contentTypeSchema xmlns:ct="http://schemas.microsoft.com/office/2006/metadata/contentType" xmlns:ma="http://schemas.microsoft.com/office/2006/metadata/properties/metaAttributes" ct:_="" ma:_="" ma:contentTypeName="Document" ma:contentTypeID="0x01010037D992EAE1D27044B1B95BF0174DB178" ma:contentTypeVersion="3" ma:contentTypeDescription="Create a new document." ma:contentTypeScope="" ma:versionID="b5cccd3da43dab7fd7b9d1b2e400f6f5">
   <xsd:schema xmlns:xsd="http://www.w3.org/2001/XMLSchema" xmlns:xs="http://www.w3.org/2001/XMLSchema" xmlns:p="http://schemas.microsoft.com/office/2006/metadata/properties" xmlns:ns2="827e12e3-b3ec-4295-b11c-9eb2aa5786c1" targetNamespace="http://schemas.microsoft.com/office/2006/metadata/properties" ma:root="true" ma:fieldsID="f7894a11bd8fc7fd27d4580fb42ba67d" ns2:_="">
     <xsd:import namespace="827e12e3-b3ec-4295-b11c-9eb2aa5786c1"/>
@@ -8115,17 +8435,51 @@
 </ct:contentTypeSchema>
 </file>
 
-<file path=customXml/item3.xml><?xml version="1.0" encoding="utf-8"?>
-<b:Sources xmlns:b="http://schemas.openxmlformats.org/officeDocument/2006/bibliography" xmlns="http://schemas.openxmlformats.org/officeDocument/2006/bibliography" SelectedStyle="\APA.XSL" StyleName="APA"/>
-</file>
-
 <file path=customXml/item4.xml><?xml version="1.0" encoding="utf-8"?>
-<p:properties xmlns:p="http://schemas.microsoft.com/office/2006/metadata/properties" xmlns:xsi="http://www.w3.org/2001/XMLSchema-instance" xmlns:pc="http://schemas.microsoft.com/office/infopath/2007/PartnerControls">
-  <documentManagement/>
-</p:properties>
+<?mso-contentType ?>
+<FormTemplates xmlns="http://schemas.microsoft.com/sharepoint/v3/contenttype/forms">
+  <Display>DocumentLibraryForm</Display>
+  <Edit>DocumentLibraryForm</Edit>
+  <New>DocumentLibraryForm</New>
+</FormTemplates>
 </file>
 
 <file path=customXml/itemProps1.xml><?xml version="1.0" encoding="utf-8"?>
+<ds:datastoreItem xmlns:ds="http://schemas.openxmlformats.org/officeDocument/2006/customXml" ds:itemID="{34F20E9B-6C4A-429B-884C-CDA30D85416A}">
+  <ds:schemaRefs>
+    <ds:schemaRef ds:uri="http://schemas.microsoft.com/office/2006/metadata/properties"/>
+    <ds:schemaRef ds:uri="http://schemas.microsoft.com/office/infopath/2007/PartnerControls"/>
+  </ds:schemaRefs>
+</ds:datastoreItem>
+</file>
+
+<file path=customXml/itemProps2.xml><?xml version="1.0" encoding="utf-8"?>
+<ds:datastoreItem xmlns:ds="http://schemas.openxmlformats.org/officeDocument/2006/customXml" ds:itemID="{8485B32B-4CA3-4802-BF5E-3FEE34FA1622}">
+  <ds:schemaRefs>
+    <ds:schemaRef ds:uri="http://schemas.openxmlformats.org/officeDocument/2006/bibliography"/>
+  </ds:schemaRefs>
+</ds:datastoreItem>
+</file>
+
+<file path=customXml/itemProps3.xml><?xml version="1.0" encoding="utf-8"?>
+<ds:datastoreItem xmlns:ds="http://schemas.openxmlformats.org/officeDocument/2006/customXml" ds:itemID="{AE172EDF-F6B7-47A9-A07F-A3DA1727F95B}">
+  <ds:schemaRefs>
+    <ds:schemaRef ds:uri="http://schemas.microsoft.com/office/2006/metadata/contentType"/>
+    <ds:schemaRef ds:uri="http://schemas.microsoft.com/office/2006/metadata/properties/metaAttributes"/>
+    <ds:schemaRef ds:uri="http://www.w3.org/2001/XMLSchema"/>
+    <ds:schemaRef ds:uri="http://schemas.microsoft.com/office/2006/metadata/properties"/>
+    <ds:schemaRef ds:uri="827e12e3-b3ec-4295-b11c-9eb2aa5786c1"/>
+    <ds:schemaRef ds:uri="http://schemas.microsoft.com/office/2006/documentManagement/types"/>
+    <ds:schemaRef ds:uri="http://schemas.microsoft.com/office/infopath/2007/PartnerControls"/>
+    <ds:schemaRef ds:uri="http://schemas.openxmlformats.org/package/2006/metadata/core-properties"/>
+    <ds:schemaRef ds:uri="http://purl.org/dc/elements/1.1/"/>
+    <ds:schemaRef ds:uri="http://purl.org/dc/terms/"/>
+    <ds:schemaRef ds:uri="http://schemas.microsoft.com/internal/obd"/>
+  </ds:schemaRefs>
+</ds:datastoreItem>
+</file>
+
+<file path=customXml/itemProps4.xml><?xml version="1.0" encoding="utf-8"?>
 <ds:datastoreItem xmlns:ds="http://schemas.openxmlformats.org/officeDocument/2006/customXml" ds:itemID="{E7664E07-C6B1-42A3-8DE0-F8F77D4AE106}">
   <ds:schemaRefs>
     <ds:schemaRef ds:uri="http://schemas.microsoft.com/sharepoint/v3/contenttype/forms"/>
@@ -8133,24 +8487,8 @@
 </ds:datastoreItem>
 </file>
 
-<file path=customXml/itemProps2.xml><?xml version="1.0" encoding="utf-8"?>
-<ds:datastoreItem xmlns:ds="http://schemas.openxmlformats.org/officeDocument/2006/customXml" ds:itemID="{AE172EDF-F6B7-47A9-A07F-A3DA1727F95B}"/>
-</file>
-
-<file path=customXml/itemProps3.xml><?xml version="1.0" encoding="utf-8"?>
-<ds:datastoreItem xmlns:ds="http://schemas.openxmlformats.org/officeDocument/2006/customXml" ds:itemID="{8485B32B-4CA3-4802-BF5E-3FEE34FA1622}">
-  <ds:schemaRefs>
-    <ds:schemaRef ds:uri="http://schemas.openxmlformats.org/officeDocument/2006/bibliography"/>
-  </ds:schemaRefs>
-</ds:datastoreItem>
-</file>
-
-<file path=customXml/itemProps4.xml><?xml version="1.0" encoding="utf-8"?>
-<ds:datastoreItem xmlns:ds="http://schemas.openxmlformats.org/officeDocument/2006/customXml" ds:itemID="{34F20E9B-6C4A-429B-884C-CDA30D85416A}">
-  <ds:schemaRefs>
-    <ds:schemaRef ds:uri="http://schemas.microsoft.com/office/2006/metadata/properties"/>
-    <ds:schemaRef ds:uri="http://schemas.microsoft.com/office/infopath/2007/PartnerControls"/>
-    <ds:schemaRef ds:uri="8873f4cf-c581-461d-abb7-619da6e925fe"/>
-  </ds:schemaRefs>
-</ds:datastoreItem>
+<file path=docMetadata/LabelInfo.xml><?xml version="1.0" encoding="utf-8"?>
+<clbl:labelList xmlns:clbl="http://schemas.microsoft.com/office/2020/mipLabelMetadata">
+  <clbl:label id="{63980337-0a06-4dac-921f-4fd7b2311903}" enabled="1" method="Standard" siteId="{32f6029a-b4af-440e-8020-d4b47ab314a2}" contentBits="0" removed="0"/>
+</clbl:labelList>
 </file>
</xml_diff>